<commit_message>
Add a readable markdown log alongside the Word one
</commit_message>
<xml_diff>
--- a/data/how_the_agent_thinks.docx
+++ b/data/how_the_agent_thinks.docx
@@ -11692,6 +11692,3550 @@
           <w:sz w:val="18"/>
         </w:rPr>
         <w:t>TICK-00982 goes to a person next</w:t>
+      </w:r>
+    </w:p>
+    <w:p>
+      <w:pPr>
+        <w:spacing w:after="40"/>
+        <w:ind w:left="432"/>
+      </w:pPr>
+      <w:r>
+        <w:rPr>
+          <w:i w:val="0"/>
+          <w:color w:val="555555"/>
+          <w:sz w:val="18"/>
+        </w:rPr>
+        <w:t>TICK-00266 goes to a person queued</w:t>
+      </w:r>
+    </w:p>
+    <w:p>
+      <w:pPr>
+        <w:spacing w:after="40"/>
+        <w:ind w:left="432"/>
+      </w:pPr>
+      <w:r>
+        <w:rPr>
+          <w:i w:val="0"/>
+          <w:color w:val="555555"/>
+          <w:sz w:val="18"/>
+        </w:rPr>
+        <w:t>TICK-00707 goes to a person queued   (the numbers were not settled about this one)</w:t>
+      </w:r>
+    </w:p>
+    <w:p>
+      <w:pPr>
+        <w:spacing w:after="40"/>
+        <w:ind w:left="432"/>
+      </w:pPr>
+      <w:r>
+        <w:rPr>
+          <w:i w:val="0"/>
+          <w:color w:val="555555"/>
+          <w:sz w:val="18"/>
+        </w:rPr>
+        <w:t>TICK-00135 goes to a person queued</w:t>
+      </w:r>
+    </w:p>
+    <w:p/>
+    <w:p>
+      <w:pPr>
+        <w:spacing w:after="200"/>
+      </w:pPr>
+      <w:r>
+        <w:rPr>
+          <w:color w:val="CCCCCC"/>
+        </w:rPr>
+        <w:t>______________________________________________________________________________</w:t>
+      </w:r>
+    </w:p>
+    <w:p>
+      <w:r>
+        <w:rPr>
+          <w:b/>
+          <w:color w:val="4C1D95"/>
+          <w:sz w:val="30"/>
+        </w:rPr>
+        <w:t>Run on 16 August 2026 at 19:22:33</w:t>
+      </w:r>
+    </w:p>
+    <w:p>
+      <w:pPr>
+        <w:spacing w:after="40"/>
+        <w:ind w:left="0"/>
+      </w:pPr>
+      <w:r>
+        <w:rPr>
+          <w:i/>
+          <w:color w:val="555555"/>
+          <w:sz w:val="18"/>
+        </w:rPr>
+        <w:t>Recorded as DEC-20260816-192233</w:t>
+      </w:r>
+    </w:p>
+    <w:p>
+      <w:pPr>
+        <w:spacing w:before="240" w:after="60"/>
+      </w:pPr>
+      <w:r>
+        <w:rPr>
+          <w:b/>
+          <w:color w:val="6D28D9"/>
+          <w:sz w:val="23"/>
+        </w:rPr>
+        <w:t>Step 1   Pick up the waiting complaints</w:t>
+      </w:r>
+    </w:p>
+    <w:p>
+      <w:pPr>
+        <w:spacing w:after="40"/>
+        <w:ind w:left="0"/>
+      </w:pPr>
+      <w:r>
+        <w:rPr>
+          <w:i w:val="0"/>
+          <w:color w:val="111111"/>
+          <w:sz w:val="20"/>
+        </w:rPr>
+        <w:t>6 complaints were waiting.</w:t>
+      </w:r>
+    </w:p>
+    <w:p>
+      <w:pPr>
+        <w:spacing w:after="40"/>
+        <w:ind w:left="432"/>
+      </w:pPr>
+      <w:r>
+        <w:rPr>
+          <w:i w:val="0"/>
+          <w:color w:val="555555"/>
+          <w:sz w:val="18"/>
+        </w:rPr>
+        <w:t>TICK-00707   The platform is very slow</w:t>
+      </w:r>
+    </w:p>
+    <w:p>
+      <w:pPr>
+        <w:spacing w:after="40"/>
+        <w:ind w:left="432"/>
+      </w:pPr>
+      <w:r>
+        <w:rPr>
+          <w:i w:val="0"/>
+          <w:color w:val="555555"/>
+          <w:sz w:val="18"/>
+        </w:rPr>
+        <w:t>TICK-00171   Deleted records we did not delete</w:t>
+      </w:r>
+    </w:p>
+    <w:p>
+      <w:pPr>
+        <w:spacing w:after="40"/>
+        <w:ind w:left="432"/>
+      </w:pPr>
+      <w:r>
+        <w:rPr>
+          <w:i w:val="0"/>
+          <w:color w:val="555555"/>
+          <w:sz w:val="18"/>
+        </w:rPr>
+        <w:t>TICK-00771   Possible breach</w:t>
+      </w:r>
+    </w:p>
+    <w:p>
+      <w:pPr>
+        <w:spacing w:after="40"/>
+        <w:ind w:left="432"/>
+      </w:pPr>
+      <w:r>
+        <w:rPr>
+          <w:i w:val="0"/>
+          <w:color w:val="555555"/>
+          <w:sz w:val="18"/>
+        </w:rPr>
+        <w:t>TICK-00266   Request for bulk actions</w:t>
+      </w:r>
+    </w:p>
+    <w:p>
+      <w:pPr>
+        <w:spacing w:after="40"/>
+        <w:ind w:left="432"/>
+      </w:pPr>
+      <w:r>
+        <w:rPr>
+          <w:i w:val="0"/>
+          <w:color w:val="555555"/>
+          <w:sz w:val="18"/>
+        </w:rPr>
+        <w:t>TICK-00982   Cannot download report</w:t>
+      </w:r>
+    </w:p>
+    <w:p>
+      <w:pPr>
+        <w:spacing w:after="40"/>
+        <w:ind w:left="432"/>
+      </w:pPr>
+      <w:r>
+        <w:rPr>
+          <w:i w:val="0"/>
+          <w:color w:val="555555"/>
+          <w:sz w:val="18"/>
+        </w:rPr>
+        <w:t>TICK-00135   Password reset needed</w:t>
+      </w:r>
+    </w:p>
+    <w:p>
+      <w:pPr>
+        <w:spacing w:before="240" w:after="60"/>
+      </w:pPr>
+      <w:r>
+        <w:rPr>
+          <w:b/>
+          <w:color w:val="6D28D9"/>
+          <w:sz w:val="23"/>
+        </w:rPr>
+        <w:t>Step 2   Look up the three separate systems</w:t>
+      </w:r>
+    </w:p>
+    <w:p>
+      <w:pPr>
+        <w:spacing w:after="40"/>
+        <w:ind w:left="0"/>
+      </w:pPr>
+      <w:r>
+        <w:rPr>
+          <w:i w:val="0"/>
+          <w:color w:val="111111"/>
+          <w:sz w:val="20"/>
+        </w:rPr>
+        <w:t>Each system knows a different part of the story, and none of them can see what the others see.</w:t>
+      </w:r>
+    </w:p>
+    <w:p>
+      <w:pPr>
+        <w:spacing w:after="40"/>
+        <w:ind w:left="432"/>
+      </w:pPr>
+      <w:r>
+        <w:rPr>
+          <w:i w:val="0"/>
+          <w:color w:val="555555"/>
+          <w:sz w:val="18"/>
+        </w:rPr>
+        <w:t>TICK-00707</w:t>
+      </w:r>
+    </w:p>
+    <w:p>
+      <w:pPr>
+        <w:spacing w:after="40"/>
+        <w:ind w:left="864"/>
+      </w:pPr>
+      <w:r>
+        <w:rPr>
+          <w:i w:val="0"/>
+          <w:color w:val="555555"/>
+          <w:sz w:val="18"/>
+        </w:rPr>
+        <w:t>Customer records say: Enterprise plan, pays £39,127 a month, has asked 2 times</w:t>
+      </w:r>
+    </w:p>
+    <w:p>
+      <w:pPr>
+        <w:spacing w:after="40"/>
+        <w:ind w:left="864"/>
+      </w:pPr>
+      <w:r>
+        <w:rPr>
+          <w:i w:val="0"/>
+          <w:color w:val="555555"/>
+          <w:sz w:val="18"/>
+        </w:rPr>
+        <w:t>Monitoring says: Low, 3 people affected, work blocked: no</w:t>
+      </w:r>
+    </w:p>
+    <w:p>
+      <w:pPr>
+        <w:spacing w:after="40"/>
+        <w:ind w:left="864"/>
+      </w:pPr>
+      <w:r>
+        <w:rPr>
+          <w:i w:val="0"/>
+          <w:color w:val="555555"/>
+          <w:sz w:val="18"/>
+        </w:rPr>
+        <w:t>The promise clock says: 2.0 hours promised, 1.1 left</w:t>
+      </w:r>
+    </w:p>
+    <w:p>
+      <w:pPr>
+        <w:spacing w:after="40"/>
+        <w:ind w:left="864"/>
+      </w:pPr>
+      <w:r>
+        <w:rPr>
+          <w:i w:val="0"/>
+          <w:color w:val="555555"/>
+          <w:sz w:val="18"/>
+        </w:rPr>
+        <w:t>The customer themselves said: Low</w:t>
+      </w:r>
+    </w:p>
+    <w:p>
+      <w:pPr>
+        <w:spacing w:after="40"/>
+        <w:ind w:left="432"/>
+      </w:pPr>
+      <w:r>
+        <w:rPr>
+          <w:i w:val="0"/>
+          <w:color w:val="555555"/>
+          <w:sz w:val="18"/>
+        </w:rPr>
+        <w:t>TICK-00171</w:t>
+      </w:r>
+    </w:p>
+    <w:p>
+      <w:pPr>
+        <w:spacing w:after="40"/>
+        <w:ind w:left="864"/>
+      </w:pPr>
+      <w:r>
+        <w:rPr>
+          <w:i w:val="0"/>
+          <w:color w:val="555555"/>
+          <w:sz w:val="18"/>
+        </w:rPr>
+        <w:t>Customer records say: Free plan, pays £0 a month, has asked 1 time</w:t>
+      </w:r>
+    </w:p>
+    <w:p>
+      <w:pPr>
+        <w:spacing w:after="40"/>
+        <w:ind w:left="864"/>
+      </w:pPr>
+      <w:r>
+        <w:rPr>
+          <w:i w:val="0"/>
+          <w:color w:val="555555"/>
+          <w:sz w:val="18"/>
+        </w:rPr>
+        <w:t>Monitoring says: Critical, 4940 people affected, work blocked: yes</w:t>
+      </w:r>
+    </w:p>
+    <w:p>
+      <w:pPr>
+        <w:spacing w:after="40"/>
+        <w:ind w:left="864"/>
+      </w:pPr>
+      <w:r>
+        <w:rPr>
+          <w:i w:val="0"/>
+          <w:color w:val="555555"/>
+          <w:sz w:val="18"/>
+        </w:rPr>
+        <w:t>The promise clock says: 72.0 hours promised, 29.6 left</w:t>
+      </w:r>
+    </w:p>
+    <w:p>
+      <w:pPr>
+        <w:spacing w:after="40"/>
+        <w:ind w:left="864"/>
+      </w:pPr>
+      <w:r>
+        <w:rPr>
+          <w:i w:val="0"/>
+          <w:color w:val="555555"/>
+          <w:sz w:val="18"/>
+        </w:rPr>
+        <w:t>The customer themselves said: Critical</w:t>
+      </w:r>
+    </w:p>
+    <w:p>
+      <w:pPr>
+        <w:spacing w:after="40"/>
+        <w:ind w:left="432"/>
+      </w:pPr>
+      <w:r>
+        <w:rPr>
+          <w:i w:val="0"/>
+          <w:color w:val="555555"/>
+          <w:sz w:val="18"/>
+        </w:rPr>
+        <w:t>TICK-00771</w:t>
+      </w:r>
+    </w:p>
+    <w:p>
+      <w:pPr>
+        <w:spacing w:after="40"/>
+        <w:ind w:left="864"/>
+      </w:pPr>
+      <w:r>
+        <w:rPr>
+          <w:i w:val="0"/>
+          <w:color w:val="555555"/>
+          <w:sz w:val="18"/>
+        </w:rPr>
+        <w:t>Customer records say: Basic plan, pays £55 a month, has asked 7 times</w:t>
+      </w:r>
+    </w:p>
+    <w:p>
+      <w:pPr>
+        <w:spacing w:after="40"/>
+        <w:ind w:left="864"/>
+      </w:pPr>
+      <w:r>
+        <w:rPr>
+          <w:i w:val="0"/>
+          <w:color w:val="555555"/>
+          <w:sz w:val="18"/>
+        </w:rPr>
+        <w:t>Monitoring says: Low, 1 person affected, work blocked: no</w:t>
+      </w:r>
+    </w:p>
+    <w:p>
+      <w:pPr>
+        <w:spacing w:after="40"/>
+        <w:ind w:left="864"/>
+      </w:pPr>
+      <w:r>
+        <w:rPr>
+          <w:i w:val="0"/>
+          <w:color w:val="555555"/>
+          <w:sz w:val="18"/>
+        </w:rPr>
+        <w:t>The promise clock says: 24.0 hours promised, 15.4 left</w:t>
+      </w:r>
+    </w:p>
+    <w:p>
+      <w:pPr>
+        <w:spacing w:after="40"/>
+        <w:ind w:left="864"/>
+      </w:pPr>
+      <w:r>
+        <w:rPr>
+          <w:i w:val="0"/>
+          <w:color w:val="555555"/>
+          <w:sz w:val="18"/>
+        </w:rPr>
+        <w:t>The customer themselves said: High</w:t>
+      </w:r>
+    </w:p>
+    <w:p>
+      <w:pPr>
+        <w:spacing w:after="40"/>
+        <w:ind w:left="432"/>
+      </w:pPr>
+      <w:r>
+        <w:rPr>
+          <w:i w:val="0"/>
+          <w:color w:val="555555"/>
+          <w:sz w:val="18"/>
+        </w:rPr>
+        <w:t>TICK-00266</w:t>
+      </w:r>
+    </w:p>
+    <w:p>
+      <w:pPr>
+        <w:spacing w:after="40"/>
+        <w:ind w:left="864"/>
+      </w:pPr>
+      <w:r>
+        <w:rPr>
+          <w:i w:val="0"/>
+          <w:color w:val="555555"/>
+          <w:sz w:val="18"/>
+        </w:rPr>
+        <w:t>Customer records say: Enterprise plan, pays £29,044 a month, has asked 4 times</w:t>
+      </w:r>
+    </w:p>
+    <w:p>
+      <w:pPr>
+        <w:spacing w:after="40"/>
+        <w:ind w:left="864"/>
+      </w:pPr>
+      <w:r>
+        <w:rPr>
+          <w:i w:val="0"/>
+          <w:color w:val="555555"/>
+          <w:sz w:val="18"/>
+        </w:rPr>
+        <w:t>Monitoring says: Low, 1 person affected, work blocked: no</w:t>
+      </w:r>
+    </w:p>
+    <w:p>
+      <w:pPr>
+        <w:spacing w:after="40"/>
+        <w:ind w:left="864"/>
+      </w:pPr>
+      <w:r>
+        <w:rPr>
+          <w:i w:val="0"/>
+          <w:color w:val="555555"/>
+          <w:sz w:val="18"/>
+        </w:rPr>
+        <w:t>The promise clock says: 2.0 hours promised, 0.3 left</w:t>
+      </w:r>
+    </w:p>
+    <w:p>
+      <w:pPr>
+        <w:spacing w:after="40"/>
+        <w:ind w:left="864"/>
+      </w:pPr>
+      <w:r>
+        <w:rPr>
+          <w:i w:val="0"/>
+          <w:color w:val="555555"/>
+          <w:sz w:val="18"/>
+        </w:rPr>
+        <w:t>The customer themselves said: High</w:t>
+      </w:r>
+    </w:p>
+    <w:p>
+      <w:pPr>
+        <w:spacing w:after="40"/>
+        <w:ind w:left="432"/>
+      </w:pPr>
+      <w:r>
+        <w:rPr>
+          <w:i w:val="0"/>
+          <w:color w:val="555555"/>
+          <w:sz w:val="18"/>
+        </w:rPr>
+        <w:t>TICK-00982</w:t>
+      </w:r>
+    </w:p>
+    <w:p>
+      <w:pPr>
+        <w:spacing w:after="40"/>
+        <w:ind w:left="864"/>
+      </w:pPr>
+      <w:r>
+        <w:rPr>
+          <w:i w:val="0"/>
+          <w:color w:val="555555"/>
+          <w:sz w:val="18"/>
+        </w:rPr>
+        <w:t>Customer records say: Basic plan, pays £106 a month, has asked 11 times</w:t>
+      </w:r>
+    </w:p>
+    <w:p>
+      <w:pPr>
+        <w:spacing w:after="40"/>
+        <w:ind w:left="864"/>
+      </w:pPr>
+      <w:r>
+        <w:rPr>
+          <w:i w:val="0"/>
+          <w:color w:val="555555"/>
+          <w:sz w:val="18"/>
+        </w:rPr>
+        <w:t>Monitoring says: Medium, 35 people affected, work blocked: no</w:t>
+      </w:r>
+    </w:p>
+    <w:p>
+      <w:pPr>
+        <w:spacing w:after="40"/>
+        <w:ind w:left="864"/>
+      </w:pPr>
+      <w:r>
+        <w:rPr>
+          <w:i w:val="0"/>
+          <w:color w:val="555555"/>
+          <w:sz w:val="18"/>
+        </w:rPr>
+        <w:t>The promise clock says: 24.0 hours promised, -49.8 left, already late</w:t>
+      </w:r>
+    </w:p>
+    <w:p>
+      <w:pPr>
+        <w:spacing w:after="40"/>
+        <w:ind w:left="864"/>
+      </w:pPr>
+      <w:r>
+        <w:rPr>
+          <w:i w:val="0"/>
+          <w:color w:val="555555"/>
+          <w:sz w:val="18"/>
+        </w:rPr>
+        <w:t>The customer themselves said: Medium</w:t>
+      </w:r>
+    </w:p>
+    <w:p>
+      <w:pPr>
+        <w:spacing w:after="40"/>
+        <w:ind w:left="432"/>
+      </w:pPr>
+      <w:r>
+        <w:rPr>
+          <w:i w:val="0"/>
+          <w:color w:val="555555"/>
+          <w:sz w:val="18"/>
+        </w:rPr>
+        <w:t>TICK-00135</w:t>
+      </w:r>
+    </w:p>
+    <w:p>
+      <w:pPr>
+        <w:spacing w:after="40"/>
+        <w:ind w:left="864"/>
+      </w:pPr>
+      <w:r>
+        <w:rPr>
+          <w:i w:val="0"/>
+          <w:color w:val="555555"/>
+          <w:sz w:val="18"/>
+        </w:rPr>
+        <w:t>Customer records say: Basic plan, pays £41 a month, has asked 1 time</w:t>
+      </w:r>
+    </w:p>
+    <w:p>
+      <w:pPr>
+        <w:spacing w:after="40"/>
+        <w:ind w:left="864"/>
+      </w:pPr>
+      <w:r>
+        <w:rPr>
+          <w:i w:val="0"/>
+          <w:color w:val="555555"/>
+          <w:sz w:val="18"/>
+        </w:rPr>
+        <w:t>Monitoring says: Low, 1 person affected, work blocked: no</w:t>
+      </w:r>
+    </w:p>
+    <w:p>
+      <w:pPr>
+        <w:spacing w:after="40"/>
+        <w:ind w:left="864"/>
+      </w:pPr>
+      <w:r>
+        <w:rPr>
+          <w:i w:val="0"/>
+          <w:color w:val="555555"/>
+          <w:sz w:val="18"/>
+        </w:rPr>
+        <w:t>The promise clock says: 24.0 hours promised, 19.3 left</w:t>
+      </w:r>
+    </w:p>
+    <w:p>
+      <w:pPr>
+        <w:spacing w:after="40"/>
+        <w:ind w:left="864"/>
+      </w:pPr>
+      <w:r>
+        <w:rPr>
+          <w:i w:val="0"/>
+          <w:color w:val="555555"/>
+          <w:sz w:val="18"/>
+        </w:rPr>
+        <w:t>The customer themselves said: Critical</w:t>
+      </w:r>
+    </w:p>
+    <w:p>
+      <w:pPr>
+        <w:spacing w:before="240" w:after="60"/>
+      </w:pPr>
+      <w:r>
+        <w:rPr>
+          <w:b/>
+          <w:color w:val="6D28D9"/>
+          <w:sz w:val="23"/>
+        </w:rPr>
+        <w:t>Step 3   Rank them four different ways</w:t>
+      </w:r>
+    </w:p>
+    <w:p>
+      <w:pPr>
+        <w:spacing w:after="40"/>
+        <w:ind w:left="0"/>
+      </w:pPr>
+      <w:r>
+        <w:rPr>
+          <w:i w:val="0"/>
+          <w:color w:val="111111"/>
+          <w:sz w:val="20"/>
+        </w:rPr>
+        <w:t>Each way is reasonable on its own, and each one is wrong on its own. They are evidence for the agent to weigh, not instructions to follow.</w:t>
+      </w:r>
+    </w:p>
+    <w:p>
+      <w:pPr>
+        <w:spacing w:after="40"/>
+        <w:ind w:left="432"/>
+      </w:pPr>
+      <w:r>
+        <w:rPr>
+          <w:i w:val="0"/>
+          <w:color w:val="555555"/>
+          <w:sz w:val="18"/>
+        </w:rPr>
+        <w:t>By money:  1. TICK-00707  2. TICK-00266  3. TICK-00982  4. TICK-00771  5. TICK-00135  6. TICK-00171</w:t>
+      </w:r>
+    </w:p>
+    <w:p>
+      <w:pPr>
+        <w:spacing w:after="40"/>
+        <w:ind w:left="432"/>
+      </w:pPr>
+      <w:r>
+        <w:rPr>
+          <w:i w:val="0"/>
+          <w:color w:val="555555"/>
+          <w:sz w:val="18"/>
+        </w:rPr>
+        <w:t>By damage:  1. TICK-00171  2. TICK-00982  3. TICK-00707  4. TICK-00771  5. TICK-00266  6. TICK-00135</w:t>
+      </w:r>
+    </w:p>
+    <w:p>
+      <w:pPr>
+        <w:spacing w:after="40"/>
+        <w:ind w:left="432"/>
+      </w:pPr>
+      <w:r>
+        <w:rPr>
+          <w:i w:val="0"/>
+          <w:color w:val="555555"/>
+          <w:sz w:val="18"/>
+        </w:rPr>
+        <w:t>By deadline:  1. TICK-00982  2. TICK-00266  3. TICK-00171  4. TICK-00707  5. TICK-00771  6. TICK-00135</w:t>
+      </w:r>
+    </w:p>
+    <w:p>
+      <w:pPr>
+        <w:spacing w:after="40"/>
+        <w:ind w:left="432"/>
+      </w:pPr>
+      <w:r>
+        <w:rPr>
+          <w:i w:val="0"/>
+          <w:color w:val="555555"/>
+          <w:sz w:val="18"/>
+        </w:rPr>
+        <w:t>By fairness:  1. TICK-00982  2. TICK-00771  3. TICK-00266  4. TICK-00171  5. TICK-00135  6. TICK-00707</w:t>
+      </w:r>
+    </w:p>
+    <w:p>
+      <w:pPr>
+        <w:spacing w:after="40"/>
+        <w:ind w:left="0"/>
+      </w:pPr>
+      <w:r>
+        <w:rPr>
+          <w:i w:val="0"/>
+          <w:color w:val="111111"/>
+          <w:sz w:val="20"/>
+        </w:rPr>
+      </w:r>
+    </w:p>
+    <w:p>
+      <w:pPr>
+        <w:spacing w:after="40"/>
+        <w:ind w:left="432"/>
+      </w:pPr>
+      <w:r>
+        <w:rPr>
+          <w:i w:val="0"/>
+          <w:color w:val="111111"/>
+          <w:sz w:val="20"/>
+        </w:rPr>
+        <w:t>Where the four disagreed most:</w:t>
+      </w:r>
+    </w:p>
+    <w:p>
+      <w:pPr>
+        <w:spacing w:after="40"/>
+        <w:ind w:left="864"/>
+      </w:pPr>
+      <w:r>
+        <w:rPr>
+          <w:i w:val="0"/>
+          <w:color w:val="555555"/>
+          <w:sz w:val="18"/>
+        </w:rPr>
+        <w:t>TICK-00707 was placed as high as 1 and as low as 6. This is where judgement was needed.</w:t>
+      </w:r>
+    </w:p>
+    <w:p>
+      <w:pPr>
+        <w:spacing w:after="40"/>
+        <w:ind w:left="864"/>
+      </w:pPr>
+      <w:r>
+        <w:rPr>
+          <w:i w:val="0"/>
+          <w:color w:val="555555"/>
+          <w:sz w:val="18"/>
+        </w:rPr>
+        <w:t>TICK-00171 was placed as high as 1 and as low as 6. This is where judgement was needed.</w:t>
+      </w:r>
+    </w:p>
+    <w:p>
+      <w:pPr>
+        <w:spacing w:after="40"/>
+        <w:ind w:left="864"/>
+      </w:pPr>
+      <w:r>
+        <w:rPr>
+          <w:i w:val="0"/>
+          <w:color w:val="555555"/>
+          <w:sz w:val="18"/>
+        </w:rPr>
+        <w:t>TICK-00771 was placed as high as 2 and as low as 5. This is where judgement was needed.</w:t>
+      </w:r>
+    </w:p>
+    <w:p>
+      <w:pPr>
+        <w:spacing w:after="40"/>
+        <w:ind w:left="864"/>
+      </w:pPr>
+      <w:r>
+        <w:rPr>
+          <w:i w:val="0"/>
+          <w:color w:val="555555"/>
+          <w:sz w:val="18"/>
+        </w:rPr>
+        <w:t>TICK-00266 was placed as high as 2 and as low as 5. This is where judgement was needed.</w:t>
+      </w:r>
+    </w:p>
+    <w:p>
+      <w:pPr>
+        <w:spacing w:before="240" w:after="60"/>
+      </w:pPr>
+      <w:r>
+        <w:rPr>
+          <w:b/>
+          <w:color w:val="6D28D9"/>
+          <w:sz w:val="23"/>
+        </w:rPr>
+        <w:t>Step 4   Read what the customer actually wrote</w:t>
+      </w:r>
+    </w:p>
+    <w:p>
+      <w:pPr>
+        <w:spacing w:after="40"/>
+        <w:ind w:left="0"/>
+      </w:pPr>
+      <w:r>
+        <w:rPr>
+          <w:i w:val="0"/>
+          <w:color w:val="111111"/>
+          <w:sz w:val="20"/>
+        </w:rPr>
+        <w:t>The four ways above only look at numbers, so they cannot tell a password reset apart from a break-in. Both look like one person with nothing failing. The words are the difference.</w:t>
+      </w:r>
+    </w:p>
+    <w:p>
+      <w:pPr>
+        <w:spacing w:after="40"/>
+        <w:ind w:left="432"/>
+      </w:pPr>
+      <w:r>
+        <w:rPr>
+          <w:i w:val="0"/>
+          <w:color w:val="555555"/>
+          <w:sz w:val="18"/>
+        </w:rPr>
+        <w:t>TICK-00707: “Hello, Pages take around thirty seconds to load. No rush, whenever you get a chance.”</w:t>
+      </w:r>
+    </w:p>
+    <w:p>
+      <w:pPr>
+        <w:spacing w:after="40"/>
+        <w:ind w:left="432"/>
+      </w:pPr>
+      <w:r>
+        <w:rPr>
+          <w:i w:val="0"/>
+          <w:color w:val="555555"/>
+          <w:sz w:val="18"/>
+        </w:rPr>
+        <w:t>TICK-00171: “Hi there, A folder of client files is gone and nobody on our side removed it. Many thanks.”</w:t>
+      </w:r>
+    </w:p>
+    <w:p>
+      <w:pPr>
+        <w:spacing w:after="40"/>
+        <w:ind w:left="432"/>
+      </w:pPr>
+      <w:r>
+        <w:rPr>
+          <w:i w:val="0"/>
+          <w:color w:val="555555"/>
+          <w:sz w:val="18"/>
+        </w:rPr>
+        <w:t>TICK-00771: “Hi, Someone has changed our admin email address and it was not us. Please could someone look at this.”</w:t>
+      </w:r>
+    </w:p>
+    <w:p>
+      <w:pPr>
+        <w:spacing w:after="40"/>
+        <w:ind w:left="432"/>
+      </w:pPr>
+      <w:r>
+        <w:rPr>
+          <w:i w:val="0"/>
+          <w:color w:val="555555"/>
+          <w:sz w:val="18"/>
+        </w:rPr>
+        <w:t>TICK-00266: “This is now the third time I am writing. Being able to select several rows at once would save us a lot of time. We expect a reply today.”</w:t>
+      </w:r>
+    </w:p>
+    <w:p>
+      <w:pPr>
+        <w:spacing w:after="40"/>
+        <w:ind w:left="432"/>
+      </w:pPr>
+      <w:r>
+        <w:rPr>
+          <w:i w:val="0"/>
+          <w:color w:val="555555"/>
+          <w:sz w:val="18"/>
+        </w:rPr>
+        <w:t>TICK-00982: “Hi, The export button spins for a while and then nothing happens. This is holding us up.”</w:t>
+      </w:r>
+    </w:p>
+    <w:p>
+      <w:pPr>
+        <w:spacing w:after="40"/>
+        <w:ind w:left="432"/>
+      </w:pPr>
+      <w:r>
+        <w:rPr>
+          <w:i w:val="0"/>
+          <w:color w:val="555555"/>
+          <w:sz w:val="18"/>
+        </w:rPr>
+        <w:t>TICK-00135: “This is now the third time I am writing. The reset link never arrives in my inbox. Please escalate this immediately.”</w:t>
+      </w:r>
+    </w:p>
+    <w:p>
+      <w:pPr>
+        <w:spacing w:before="240" w:after="60"/>
+      </w:pPr>
+      <w:r>
+        <w:rPr>
+          <w:b/>
+          <w:color w:val="6D28D9"/>
+          <w:sz w:val="23"/>
+        </w:rPr>
+        <w:t>Step 5   The AI decides, and says why</w:t>
+      </w:r>
+    </w:p>
+    <w:p>
+      <w:pPr>
+        <w:spacing w:after="40"/>
+        <w:ind w:left="432"/>
+      </w:pPr>
+      <w:r>
+        <w:rPr>
+          <w:i w:val="0"/>
+          <w:color w:val="111111"/>
+          <w:sz w:val="20"/>
+        </w:rPr>
+        <w:t>1. TICK-00171   Deleted records we did not delete</w:t>
+      </w:r>
+    </w:p>
+    <w:p>
+      <w:pPr>
+        <w:spacing w:after="40"/>
+        <w:ind w:left="864"/>
+      </w:pPr>
+      <w:r>
+        <w:rPr>
+          <w:i/>
+          <w:color w:val="555555"/>
+          <w:sz w:val="20"/>
+        </w:rPr>
+        <w:t>Massive data loss affecting thousands and blocking work forces immediate attention.</w:t>
+      </w:r>
+    </w:p>
+    <w:p>
+      <w:pPr>
+        <w:spacing w:after="40"/>
+        <w:ind w:left="432"/>
+      </w:pPr>
+      <w:r>
+        <w:rPr>
+          <w:i w:val="0"/>
+          <w:color w:val="111111"/>
+          <w:sz w:val="20"/>
+        </w:rPr>
+        <w:t>2. TICK-00982   Cannot download report</w:t>
+      </w:r>
+    </w:p>
+    <w:p>
+      <w:pPr>
+        <w:spacing w:after="40"/>
+        <w:ind w:left="864"/>
+      </w:pPr>
+      <w:r>
+        <w:rPr>
+          <w:i/>
+          <w:color w:val="555555"/>
+          <w:sz w:val="20"/>
+        </w:rPr>
+        <w:t>Export failure is overdue and halts a critical workflow for many users.</w:t>
+      </w:r>
+    </w:p>
+    <w:p>
+      <w:pPr>
+        <w:spacing w:after="40"/>
+        <w:ind w:left="432"/>
+      </w:pPr>
+      <w:r>
+        <w:rPr>
+          <w:i w:val="0"/>
+          <w:color w:val="111111"/>
+          <w:sz w:val="20"/>
+        </w:rPr>
+        <w:t>3. TICK-00771   Possible breach</w:t>
+      </w:r>
+    </w:p>
+    <w:p>
+      <w:pPr>
+        <w:spacing w:after="40"/>
+        <w:ind w:left="864"/>
+      </w:pPr>
+      <w:r>
+        <w:rPr>
+          <w:i/>
+          <w:color w:val="555555"/>
+          <w:sz w:val="20"/>
+        </w:rPr>
+        <w:t>Possible account takeover is a security breach that monitoring under‑reports, so it must be handled early.</w:t>
+      </w:r>
+    </w:p>
+    <w:p>
+      <w:pPr>
+        <w:spacing w:after="40"/>
+        <w:ind w:left="432"/>
+      </w:pPr>
+      <w:r>
+        <w:rPr>
+          <w:i w:val="0"/>
+          <w:color w:val="111111"/>
+          <w:sz w:val="20"/>
+        </w:rPr>
+        <w:t>4. TICK-00266   Request for bulk actions</w:t>
+      </w:r>
+    </w:p>
+    <w:p>
+      <w:pPr>
+        <w:spacing w:after="40"/>
+        <w:ind w:left="864"/>
+      </w:pPr>
+      <w:r>
+        <w:rPr>
+          <w:i/>
+          <w:color w:val="555555"/>
+          <w:sz w:val="20"/>
+        </w:rPr>
+        <w:t>Feature request has a near deadline but low impact, so it follows higher‑severity tickets.</w:t>
+      </w:r>
+    </w:p>
+    <w:p>
+      <w:pPr>
+        <w:spacing w:after="40"/>
+        <w:ind w:left="432"/>
+      </w:pPr>
+      <w:r>
+        <w:rPr>
+          <w:i w:val="0"/>
+          <w:color w:val="111111"/>
+          <w:sz w:val="20"/>
+        </w:rPr>
+        <w:t>5. TICK-00707   The platform is very slow</w:t>
+      </w:r>
+    </w:p>
+    <w:p>
+      <w:pPr>
+        <w:spacing w:after="40"/>
+        <w:ind w:left="864"/>
+      </w:pPr>
+      <w:r>
+        <w:rPr>
+          <w:i/>
+          <w:color w:val="555555"/>
+          <w:sz w:val="20"/>
+        </w:rPr>
+        <w:t>Slow performance affects only a few users and is not blocking, so it can wait.</w:t>
+      </w:r>
+    </w:p>
+    <w:p>
+      <w:pPr>
+        <w:spacing w:after="40"/>
+        <w:ind w:left="432"/>
+      </w:pPr>
+      <w:r>
+        <w:rPr>
+          <w:i w:val="0"/>
+          <w:color w:val="111111"/>
+          <w:sz w:val="20"/>
+        </w:rPr>
+        <w:t>6. TICK-00135   Password reset needed</w:t>
+      </w:r>
+    </w:p>
+    <w:p>
+      <w:pPr>
+        <w:spacing w:after="40"/>
+        <w:ind w:left="864"/>
+      </w:pPr>
+      <w:r>
+        <w:rPr>
+          <w:i/>
+          <w:color w:val="555555"/>
+          <w:sz w:val="20"/>
+        </w:rPr>
+        <w:t>Password reset is a single‑user issue with low monitoring severity, so it is lowest priority.</w:t>
+      </w:r>
+    </w:p>
+    <w:p>
+      <w:pPr>
+        <w:spacing w:after="40"/>
+        <w:ind w:left="0"/>
+      </w:pPr>
+      <w:r>
+        <w:rPr>
+          <w:i w:val="0"/>
+          <w:color w:val="111111"/>
+          <w:sz w:val="20"/>
+        </w:rPr>
+      </w:r>
+    </w:p>
+    <w:p>
+      <w:pPr>
+        <w:spacing w:after="40"/>
+        <w:ind w:left="432"/>
+      </w:pPr>
+      <w:r>
+        <w:rPr>
+          <w:i w:val="0"/>
+          <w:color w:val="111111"/>
+          <w:sz w:val="20"/>
+        </w:rPr>
+        <w:t>The trade-off it made:</w:t>
+      </w:r>
+    </w:p>
+    <w:p>
+      <w:pPr>
+        <w:spacing w:after="40"/>
+        <w:ind w:left="864"/>
+      </w:pPr>
+      <w:r>
+        <w:rPr>
+          <w:i/>
+          <w:color w:val="555555"/>
+          <w:sz w:val="20"/>
+        </w:rPr>
+        <w:t>We favoured impact (damage) and deadline urgency over revenue and fairness, sacrificing faster response for high‑paying customers. This may delay some enterprise‑plan requests, costing a small amount of goodwill with those accounts.</w:t>
+      </w:r>
+    </w:p>
+    <w:p>
+      <w:pPr>
+        <w:spacing w:after="40"/>
+        <w:ind w:left="0"/>
+      </w:pPr>
+      <w:r>
+        <w:rPr>
+          <w:i w:val="0"/>
+          <w:color w:val="111111"/>
+          <w:sz w:val="20"/>
+        </w:rPr>
+      </w:r>
+    </w:p>
+    <w:p>
+      <w:pPr>
+        <w:spacing w:after="40"/>
+        <w:ind w:left="432"/>
+      </w:pPr>
+      <w:r>
+        <w:rPr>
+          <w:i w:val="0"/>
+          <w:color w:val="111111"/>
+          <w:sz w:val="20"/>
+        </w:rPr>
+        <w:t>The closest call:</w:t>
+      </w:r>
+    </w:p>
+    <w:p>
+      <w:pPr>
+        <w:spacing w:after="40"/>
+        <w:ind w:left="864"/>
+      </w:pPr>
+      <w:r>
+        <w:rPr>
+          <w:i/>
+          <w:color w:val="555555"/>
+          <w:sz w:val="20"/>
+        </w:rPr>
+        <w:t>Placing the security incident (TICK-00771) third behind the overdue export failure was tight; one could argue the breach deserves a top‑two spot because of potential future damage, but the export issue was already overdue and blocking work, making it slightly more urgent.</w:t>
+      </w:r>
+    </w:p>
+    <w:p>
+      <w:pPr>
+        <w:spacing w:after="40"/>
+        <w:ind w:left="0"/>
+      </w:pPr>
+      <w:r>
+        <w:rPr>
+          <w:i w:val="0"/>
+          <w:color w:val="111111"/>
+          <w:sz w:val="20"/>
+        </w:rPr>
+      </w:r>
+    </w:p>
+    <w:p>
+      <w:pPr>
+        <w:spacing w:after="40"/>
+        <w:ind w:left="432"/>
+      </w:pPr>
+      <w:r>
+        <w:rPr>
+          <w:i w:val="0"/>
+          <w:color w:val="111111"/>
+          <w:sz w:val="20"/>
+        </w:rPr>
+        <w:t>How it ranked the four ways of deciding:</w:t>
+      </w:r>
+    </w:p>
+    <w:p>
+      <w:pPr>
+        <w:spacing w:after="40"/>
+        <w:ind w:left="864"/>
+      </w:pPr>
+      <w:r>
+        <w:rPr>
+          <w:i w:val="0"/>
+          <w:color w:val="111111"/>
+          <w:sz w:val="20"/>
+        </w:rPr>
+        <w:t>1. damage</w:t>
+      </w:r>
+    </w:p>
+    <w:p>
+      <w:pPr>
+        <w:spacing w:after="40"/>
+        <w:ind w:left="1296"/>
+      </w:pPr>
+      <w:r>
+        <w:rPr>
+          <w:i/>
+          <w:color w:val="555555"/>
+          <w:sz w:val="20"/>
+        </w:rPr>
+        <w:t>why here: Impact on users and business continuity directly reflects the harm we must prevent.</w:t>
+      </w:r>
+    </w:p>
+    <w:p>
+      <w:pPr>
+        <w:spacing w:after="40"/>
+        <w:ind w:left="1296"/>
+      </w:pPr>
+      <w:r>
+        <w:rPr>
+          <w:i/>
+          <w:color w:val="555555"/>
+          <w:sz w:val="20"/>
+        </w:rPr>
+        <w:t>gets wrong: It can over‑prioritise low‑paying customers with big incidents at the expense of high‑value contracts.</w:t>
+      </w:r>
+    </w:p>
+    <w:p>
+      <w:pPr>
+        <w:spacing w:after="40"/>
+        <w:ind w:left="864"/>
+      </w:pPr>
+      <w:r>
+        <w:rPr>
+          <w:i w:val="0"/>
+          <w:color w:val="111111"/>
+          <w:sz w:val="20"/>
+        </w:rPr>
+        <w:t>2. deadline</w:t>
+      </w:r>
+    </w:p>
+    <w:p>
+      <w:pPr>
+        <w:spacing w:after="40"/>
+        <w:ind w:left="1296"/>
+      </w:pPr>
+      <w:r>
+        <w:rPr>
+          <w:i/>
+          <w:color w:val="555555"/>
+          <w:sz w:val="20"/>
+        </w:rPr>
+        <w:t>why here: Missing promised response times incurs SLA breaches and legal risk.</w:t>
+      </w:r>
+    </w:p>
+    <w:p>
+      <w:pPr>
+        <w:spacing w:after="40"/>
+        <w:ind w:left="1296"/>
+      </w:pPr>
+      <w:r>
+        <w:rPr>
+          <w:i/>
+          <w:color w:val="555555"/>
+          <w:sz w:val="20"/>
+        </w:rPr>
+        <w:t>gets wrong: Deadlines may be generous for low‑impact tickets, pushing them ahead of more critical but not yet overdue issues.</w:t>
+      </w:r>
+    </w:p>
+    <w:p>
+      <w:pPr>
+        <w:spacing w:after="40"/>
+        <w:ind w:left="864"/>
+      </w:pPr>
+      <w:r>
+        <w:rPr>
+          <w:i w:val="0"/>
+          <w:color w:val="111111"/>
+          <w:sz w:val="20"/>
+        </w:rPr>
+        <w:t>3. fairness</w:t>
+      </w:r>
+    </w:p>
+    <w:p>
+      <w:pPr>
+        <w:spacing w:after="40"/>
+        <w:ind w:left="1296"/>
+      </w:pPr>
+      <w:r>
+        <w:rPr>
+          <w:i/>
+          <w:color w:val="555555"/>
+          <w:sz w:val="20"/>
+        </w:rPr>
+        <w:t>why here: Considers customer history and repeated requests, helping retain at‑risk accounts.</w:t>
+      </w:r>
+    </w:p>
+    <w:p>
+      <w:pPr>
+        <w:spacing w:after="40"/>
+        <w:ind w:left="1296"/>
+      </w:pPr>
+      <w:r>
+        <w:rPr>
+          <w:i/>
+          <w:color w:val="555555"/>
+          <w:sz w:val="20"/>
+        </w:rPr>
+        <w:t>gets wrong: Fairness can elevate noisy repeat askers over genuinely severe problems.</w:t>
+      </w:r>
+    </w:p>
+    <w:p>
+      <w:pPr>
+        <w:spacing w:after="40"/>
+        <w:ind w:left="864"/>
+      </w:pPr>
+      <w:r>
+        <w:rPr>
+          <w:i w:val="0"/>
+          <w:color w:val="111111"/>
+          <w:sz w:val="20"/>
+        </w:rPr>
+        <w:t>4. money</w:t>
+      </w:r>
+    </w:p>
+    <w:p>
+      <w:pPr>
+        <w:spacing w:after="40"/>
+        <w:ind w:left="1296"/>
+      </w:pPr>
+      <w:r>
+        <w:rPr>
+          <w:i/>
+          <w:color w:val="555555"/>
+          <w:sz w:val="20"/>
+        </w:rPr>
+        <w:t>why here: Revenue is important but secondary to safety and contractual obligations.</w:t>
+      </w:r>
+    </w:p>
+    <w:p>
+      <w:pPr>
+        <w:spacing w:after="40"/>
+        <w:ind w:left="1296"/>
+      </w:pPr>
+      <w:r>
+        <w:rPr>
+          <w:i/>
+          <w:color w:val="555555"/>
+          <w:sz w:val="20"/>
+        </w:rPr>
+        <w:t>gets wrong: Pure revenue weighting would ignore critical incidents from non‑paying customers.</w:t>
+      </w:r>
+    </w:p>
+    <w:p>
+      <w:pPr>
+        <w:spacing w:after="40"/>
+        <w:ind w:left="0"/>
+      </w:pPr>
+      <w:r>
+        <w:rPr>
+          <w:i w:val="0"/>
+          <w:color w:val="111111"/>
+          <w:sz w:val="20"/>
+        </w:rPr>
+      </w:r>
+    </w:p>
+    <w:p>
+      <w:pPr>
+        <w:spacing w:after="40"/>
+        <w:ind w:left="432"/>
+      </w:pPr>
+      <w:r>
+        <w:rPr>
+          <w:i w:val="0"/>
+          <w:color w:val="111111"/>
+          <w:sz w:val="20"/>
+        </w:rPr>
+        <w:t>Closest call between the four:</w:t>
+      </w:r>
+    </w:p>
+    <w:p>
+      <w:pPr>
+        <w:spacing w:after="40"/>
+        <w:ind w:left="864"/>
+      </w:pPr>
+      <w:r>
+        <w:rPr>
+          <w:i/>
+          <w:color w:val="555555"/>
+          <w:sz w:val="20"/>
+        </w:rPr>
+        <w:t>Damage outranked deadline because the data‑loss incident threatened thousands of records, a harm far greater than any single missed SLA.</w:t>
+      </w:r>
+    </w:p>
+    <w:p>
+      <w:pPr>
+        <w:spacing w:before="240" w:after="60"/>
+      </w:pPr>
+      <w:r>
+        <w:rPr>
+          <w:b/>
+          <w:color w:val="6D28D9"/>
+          <w:sz w:val="23"/>
+        </w:rPr>
+        <w:t>Step 6   Check the answer before anything happens</w:t>
+      </w:r>
+    </w:p>
+    <w:p>
+      <w:pPr>
+        <w:spacing w:after="40"/>
+        <w:ind w:left="432"/>
+      </w:pPr>
+      <w:r>
+        <w:rPr>
+          <w:i w:val="0"/>
+          <w:color w:val="111111"/>
+          <w:sz w:val="20"/>
+        </w:rPr>
+        <w:t>Did every complaint come back, and were the written rules followed?</w:t>
+      </w:r>
+    </w:p>
+    <w:p>
+      <w:pPr>
+        <w:spacing w:after="40"/>
+        <w:ind w:left="864"/>
+      </w:pPr>
+      <w:r>
+        <w:rPr>
+          <w:i/>
+          <w:color w:val="555555"/>
+          <w:sz w:val="20"/>
+        </w:rPr>
+        <w:t>Yes. Nothing was dropped and no rule was broken.</w:t>
+      </w:r>
+    </w:p>
+    <w:p>
+      <w:pPr>
+        <w:spacing w:after="40"/>
+        <w:ind w:left="0"/>
+      </w:pPr>
+      <w:r>
+        <w:rPr>
+          <w:i w:val="0"/>
+          <w:color w:val="111111"/>
+          <w:sz w:val="20"/>
+        </w:rPr>
+      </w:r>
+    </w:p>
+    <w:p>
+      <w:pPr>
+        <w:spacing w:after="40"/>
+        <w:ind w:left="432"/>
+      </w:pPr>
+      <w:r>
+        <w:rPr>
+          <w:i w:val="0"/>
+          <w:color w:val="111111"/>
+          <w:sz w:val="20"/>
+        </w:rPr>
+        <w:t>Were the reasons it gave actually true?</w:t>
+      </w:r>
+    </w:p>
+    <w:p>
+      <w:pPr>
+        <w:spacing w:after="40"/>
+        <w:ind w:left="864"/>
+      </w:pPr>
+      <w:r>
+        <w:rPr>
+          <w:i/>
+          <w:color w:val="555555"/>
+          <w:sz w:val="20"/>
+        </w:rPr>
+        <w:t>Yes. Every reason matched the numbers we hold.</w:t>
+      </w:r>
+    </w:p>
+    <w:p>
+      <w:pPr>
+        <w:spacing w:after="40"/>
+        <w:ind w:left="0"/>
+      </w:pPr>
+      <w:r>
+        <w:rPr>
+          <w:i w:val="0"/>
+          <w:color w:val="111111"/>
+          <w:sz w:val="20"/>
+        </w:rPr>
+      </w:r>
+    </w:p>
+    <w:p>
+      <w:pPr>
+        <w:spacing w:after="40"/>
+        <w:ind w:left="432"/>
+      </w:pPr>
+      <w:r>
+        <w:rPr>
+          <w:i w:val="0"/>
+          <w:color w:val="111111"/>
+          <w:sz w:val="20"/>
+        </w:rPr>
+        <w:t>How solid was the answer? One number was changed at a time and everything ranked again, to see which places were close calls.</w:t>
+      </w:r>
+    </w:p>
+    <w:p>
+      <w:pPr>
+        <w:spacing w:after="40"/>
+        <w:ind w:left="864"/>
+      </w:pPr>
+      <w:r>
+        <w:rPr>
+          <w:i w:val="0"/>
+          <w:color w:val="555555"/>
+          <w:sz w:val="18"/>
+        </w:rPr>
+        <w:t>TICK-00707  shaky  (3 of 7 small changes move it)</w:t>
+      </w:r>
+    </w:p>
+    <w:p>
+      <w:pPr>
+        <w:spacing w:after="40"/>
+        <w:ind w:left="1296"/>
+      </w:pPr>
+      <w:r>
+        <w:rPr>
+          <w:i/>
+          <w:color w:val="555555"/>
+          <w:sz w:val="18"/>
+        </w:rPr>
+        <w:t>if work was blocked after all, it moves from 4 to 3</w:t>
+      </w:r>
+    </w:p>
+    <w:p>
+      <w:pPr>
+        <w:spacing w:after="40"/>
+        <w:ind w:left="1296"/>
+      </w:pPr>
+      <w:r>
+        <w:rPr>
+          <w:i/>
+          <w:color w:val="555555"/>
+          <w:sz w:val="18"/>
+        </w:rPr>
+        <w:t>if we had a quarter less time left than we thought, it moves from 4 to 2</w:t>
+      </w:r>
+    </w:p>
+    <w:p>
+      <w:pPr>
+        <w:spacing w:after="40"/>
+        <w:ind w:left="864"/>
+      </w:pPr>
+      <w:r>
+        <w:rPr>
+          <w:i w:val="0"/>
+          <w:color w:val="555555"/>
+          <w:sz w:val="18"/>
+        </w:rPr>
+        <w:t>TICK-00171  fairly solid  (1 of 6 small changes move it)</w:t>
+      </w:r>
+    </w:p>
+    <w:p>
+      <w:pPr>
+        <w:spacing w:after="40"/>
+        <w:ind w:left="1296"/>
+      </w:pPr>
+      <w:r>
+        <w:rPr>
+          <w:i/>
+          <w:color w:val="555555"/>
+          <w:sz w:val="18"/>
+        </w:rPr>
+        <w:t>if we had a quarter more time left than we thought, it moves from 2 to 4</w:t>
+      </w:r>
+    </w:p>
+    <w:p>
+      <w:pPr>
+        <w:spacing w:after="40"/>
+        <w:ind w:left="864"/>
+      </w:pPr>
+      <w:r>
+        <w:rPr>
+          <w:i w:val="0"/>
+          <w:color w:val="555555"/>
+          <w:sz w:val="18"/>
+        </w:rPr>
+        <w:t>TICK-00771  shaky  (3 of 6 small changes move it)</w:t>
+      </w:r>
+    </w:p>
+    <w:p>
+      <w:pPr>
+        <w:spacing w:after="40"/>
+        <w:ind w:left="1296"/>
+      </w:pPr>
+      <w:r>
+        <w:rPr>
+          <w:i/>
+          <w:color w:val="555555"/>
+          <w:sz w:val="18"/>
+        </w:rPr>
+        <w:t>if 7 people were affected, not 1, it moves from 5 to 4</w:t>
+      </w:r>
+    </w:p>
+    <w:p>
+      <w:pPr>
+        <w:spacing w:after="40"/>
+        <w:ind w:left="1296"/>
+      </w:pPr>
+      <w:r>
+        <w:rPr>
+          <w:i/>
+          <w:color w:val="555555"/>
+          <w:sz w:val="18"/>
+        </w:rPr>
+        <w:t>if work was blocked after all, it moves from 5 to 3</w:t>
+      </w:r>
+    </w:p>
+    <w:p>
+      <w:pPr>
+        <w:spacing w:after="40"/>
+        <w:ind w:left="864"/>
+      </w:pPr>
+      <w:r>
+        <w:rPr>
+          <w:i w:val="0"/>
+          <w:color w:val="555555"/>
+          <w:sz w:val="18"/>
+        </w:rPr>
+        <w:t>TICK-00266  fairly solid  (2 of 6 small changes move it)</w:t>
+      </w:r>
+    </w:p>
+    <w:p>
+      <w:pPr>
+        <w:spacing w:after="40"/>
+        <w:ind w:left="1296"/>
+      </w:pPr>
+      <w:r>
+        <w:rPr>
+          <w:i/>
+          <w:color w:val="555555"/>
+          <w:sz w:val="18"/>
+        </w:rPr>
+        <w:t>if 7 people were affected, not 1, it moves from 3 to 2</w:t>
+      </w:r>
+    </w:p>
+    <w:p>
+      <w:pPr>
+        <w:spacing w:after="40"/>
+        <w:ind w:left="1296"/>
+      </w:pPr>
+      <w:r>
+        <w:rPr>
+          <w:i/>
+          <w:color w:val="555555"/>
+          <w:sz w:val="18"/>
+        </w:rPr>
+        <w:t>if work was blocked after all, it moves from 3 to 2</w:t>
+      </w:r>
+    </w:p>
+    <w:p>
+      <w:pPr>
+        <w:spacing w:after="40"/>
+        <w:ind w:left="864"/>
+      </w:pPr>
+      <w:r>
+        <w:rPr>
+          <w:i w:val="0"/>
+          <w:color w:val="555555"/>
+          <w:sz w:val="18"/>
+        </w:rPr>
+        <w:t>TICK-00982  solid  (0 of 7 small changes move it)</w:t>
+      </w:r>
+    </w:p>
+    <w:p>
+      <w:pPr>
+        <w:spacing w:after="40"/>
+        <w:ind w:left="864"/>
+      </w:pPr>
+      <w:r>
+        <w:rPr>
+          <w:i w:val="0"/>
+          <w:color w:val="555555"/>
+          <w:sz w:val="18"/>
+        </w:rPr>
+        <w:t>TICK-00135  fairly solid  (1 of 6 small changes move it)</w:t>
+      </w:r>
+    </w:p>
+    <w:p>
+      <w:pPr>
+        <w:spacing w:after="40"/>
+        <w:ind w:left="1296"/>
+      </w:pPr>
+      <w:r>
+        <w:rPr>
+          <w:i/>
+          <w:color w:val="555555"/>
+          <w:sz w:val="18"/>
+        </w:rPr>
+        <w:t>if work was blocked after all, it moves from 6 to 5</w:t>
+      </w:r>
+    </w:p>
+    <w:p>
+      <w:pPr>
+        <w:spacing w:before="240" w:after="60"/>
+      </w:pPr>
+      <w:r>
+        <w:rPr>
+          <w:b/>
+          <w:color w:val="6D28D9"/>
+          <w:sz w:val="23"/>
+        </w:rPr>
+        <w:t>Step 7   Hand them to a person</w:t>
+      </w:r>
+    </w:p>
+    <w:p>
+      <w:pPr>
+        <w:spacing w:after="40"/>
+        <w:ind w:left="432"/>
+      </w:pPr>
+      <w:r>
+        <w:rPr>
+          <w:i w:val="0"/>
+          <w:color w:val="555555"/>
+          <w:sz w:val="18"/>
+        </w:rPr>
+        <w:t>TICK-00171 goes to a person now</w:t>
+      </w:r>
+    </w:p>
+    <w:p>
+      <w:pPr>
+        <w:spacing w:after="40"/>
+        <w:ind w:left="432"/>
+      </w:pPr>
+      <w:r>
+        <w:rPr>
+          <w:i w:val="0"/>
+          <w:color w:val="555555"/>
+          <w:sz w:val="18"/>
+        </w:rPr>
+        <w:t>TICK-00982 goes to a person next</w:t>
+      </w:r>
+    </w:p>
+    <w:p>
+      <w:pPr>
+        <w:spacing w:after="40"/>
+        <w:ind w:left="432"/>
+      </w:pPr>
+      <w:r>
+        <w:rPr>
+          <w:i w:val="0"/>
+          <w:color w:val="555555"/>
+          <w:sz w:val="18"/>
+        </w:rPr>
+        <w:t>TICK-00771 goes to a person next   (the numbers were not settled about this one)</w:t>
+      </w:r>
+    </w:p>
+    <w:p>
+      <w:pPr>
+        <w:spacing w:after="40"/>
+        <w:ind w:left="432"/>
+      </w:pPr>
+      <w:r>
+        <w:rPr>
+          <w:i w:val="0"/>
+          <w:color w:val="555555"/>
+          <w:sz w:val="18"/>
+        </w:rPr>
+        <w:t>TICK-00266 goes to a person queued</w:t>
+      </w:r>
+    </w:p>
+    <w:p>
+      <w:pPr>
+        <w:spacing w:after="40"/>
+        <w:ind w:left="432"/>
+      </w:pPr>
+      <w:r>
+        <w:rPr>
+          <w:i w:val="0"/>
+          <w:color w:val="555555"/>
+          <w:sz w:val="18"/>
+        </w:rPr>
+        <w:t>TICK-00707 goes to a person queued   (the numbers were not settled about this one)</w:t>
+      </w:r>
+    </w:p>
+    <w:p>
+      <w:pPr>
+        <w:spacing w:after="40"/>
+        <w:ind w:left="432"/>
+      </w:pPr>
+      <w:r>
+        <w:rPr>
+          <w:i w:val="0"/>
+          <w:color w:val="555555"/>
+          <w:sz w:val="18"/>
+        </w:rPr>
+        <w:t>TICK-00135 goes to a person queued</w:t>
+      </w:r>
+    </w:p>
+    <w:p/>
+    <w:p>
+      <w:pPr>
+        <w:spacing w:after="200"/>
+      </w:pPr>
+      <w:r>
+        <w:rPr>
+          <w:color w:val="CCCCCC"/>
+        </w:rPr>
+        <w:t>______________________________________________________________________________</w:t>
+      </w:r>
+    </w:p>
+    <w:p>
+      <w:r>
+        <w:rPr>
+          <w:b/>
+          <w:color w:val="4C1D95"/>
+          <w:sz w:val="30"/>
+        </w:rPr>
+        <w:t>Run on 16 August 2026 at 21:49:58</w:t>
+      </w:r>
+    </w:p>
+    <w:p>
+      <w:pPr>
+        <w:spacing w:after="40"/>
+        <w:ind w:left="0"/>
+      </w:pPr>
+      <w:r>
+        <w:rPr>
+          <w:i/>
+          <w:color w:val="555555"/>
+          <w:sz w:val="18"/>
+        </w:rPr>
+        <w:t>Recorded as DEC-20260816-214958</w:t>
+      </w:r>
+    </w:p>
+    <w:p>
+      <w:pPr>
+        <w:spacing w:before="240" w:after="60"/>
+      </w:pPr>
+      <w:r>
+        <w:rPr>
+          <w:b/>
+          <w:color w:val="6D28D9"/>
+          <w:sz w:val="23"/>
+        </w:rPr>
+        <w:t>Step 1   Pick up the waiting complaints</w:t>
+      </w:r>
+    </w:p>
+    <w:p>
+      <w:pPr>
+        <w:spacing w:after="40"/>
+        <w:ind w:left="0"/>
+      </w:pPr>
+      <w:r>
+        <w:rPr>
+          <w:i w:val="0"/>
+          <w:color w:val="111111"/>
+          <w:sz w:val="20"/>
+        </w:rPr>
+        <w:t>6 complaints were waiting.</w:t>
+      </w:r>
+    </w:p>
+    <w:p>
+      <w:pPr>
+        <w:spacing w:after="40"/>
+        <w:ind w:left="432"/>
+      </w:pPr>
+      <w:r>
+        <w:rPr>
+          <w:i w:val="0"/>
+          <w:color w:val="555555"/>
+          <w:sz w:val="18"/>
+        </w:rPr>
+        <w:t>TICK-00707   The platform is very slow</w:t>
+      </w:r>
+    </w:p>
+    <w:p>
+      <w:pPr>
+        <w:spacing w:after="40"/>
+        <w:ind w:left="432"/>
+      </w:pPr>
+      <w:r>
+        <w:rPr>
+          <w:i w:val="0"/>
+          <w:color w:val="555555"/>
+          <w:sz w:val="18"/>
+        </w:rPr>
+        <w:t>TICK-00171   Deleted records we did not delete</w:t>
+      </w:r>
+    </w:p>
+    <w:p>
+      <w:pPr>
+        <w:spacing w:after="40"/>
+        <w:ind w:left="432"/>
+      </w:pPr>
+      <w:r>
+        <w:rPr>
+          <w:i w:val="0"/>
+          <w:color w:val="555555"/>
+          <w:sz w:val="18"/>
+        </w:rPr>
+        <w:t>TICK-00771   Possible breach</w:t>
+      </w:r>
+    </w:p>
+    <w:p>
+      <w:pPr>
+        <w:spacing w:after="40"/>
+        <w:ind w:left="432"/>
+      </w:pPr>
+      <w:r>
+        <w:rPr>
+          <w:i w:val="0"/>
+          <w:color w:val="555555"/>
+          <w:sz w:val="18"/>
+        </w:rPr>
+        <w:t>TICK-00266   Request for bulk actions</w:t>
+      </w:r>
+    </w:p>
+    <w:p>
+      <w:pPr>
+        <w:spacing w:after="40"/>
+        <w:ind w:left="432"/>
+      </w:pPr>
+      <w:r>
+        <w:rPr>
+          <w:i w:val="0"/>
+          <w:color w:val="555555"/>
+          <w:sz w:val="18"/>
+        </w:rPr>
+        <w:t>TICK-00982   Cannot download report</w:t>
+      </w:r>
+    </w:p>
+    <w:p>
+      <w:pPr>
+        <w:spacing w:after="40"/>
+        <w:ind w:left="432"/>
+      </w:pPr>
+      <w:r>
+        <w:rPr>
+          <w:i w:val="0"/>
+          <w:color w:val="555555"/>
+          <w:sz w:val="18"/>
+        </w:rPr>
+        <w:t>TICK-00135   Password reset needed</w:t>
+      </w:r>
+    </w:p>
+    <w:p>
+      <w:pPr>
+        <w:spacing w:before="240" w:after="60"/>
+      </w:pPr>
+      <w:r>
+        <w:rPr>
+          <w:b/>
+          <w:color w:val="6D28D9"/>
+          <w:sz w:val="23"/>
+        </w:rPr>
+        <w:t>Step 2   Look up the three separate systems</w:t>
+      </w:r>
+    </w:p>
+    <w:p>
+      <w:pPr>
+        <w:spacing w:after="40"/>
+        <w:ind w:left="0"/>
+      </w:pPr>
+      <w:r>
+        <w:rPr>
+          <w:i w:val="0"/>
+          <w:color w:val="111111"/>
+          <w:sz w:val="20"/>
+        </w:rPr>
+        <w:t>Each system knows a different part of the story, and none of them can see what the others see.</w:t>
+      </w:r>
+    </w:p>
+    <w:p>
+      <w:pPr>
+        <w:spacing w:after="40"/>
+        <w:ind w:left="432"/>
+      </w:pPr>
+      <w:r>
+        <w:rPr>
+          <w:i w:val="0"/>
+          <w:color w:val="555555"/>
+          <w:sz w:val="18"/>
+        </w:rPr>
+        <w:t>TICK-00707</w:t>
+      </w:r>
+    </w:p>
+    <w:p>
+      <w:pPr>
+        <w:spacing w:after="40"/>
+        <w:ind w:left="864"/>
+      </w:pPr>
+      <w:r>
+        <w:rPr>
+          <w:i w:val="0"/>
+          <w:color w:val="555555"/>
+          <w:sz w:val="18"/>
+        </w:rPr>
+        <w:t>Customer records say: Enterprise plan, pays £39,127 a month, has asked 2 times</w:t>
+      </w:r>
+    </w:p>
+    <w:p>
+      <w:pPr>
+        <w:spacing w:after="40"/>
+        <w:ind w:left="864"/>
+      </w:pPr>
+      <w:r>
+        <w:rPr>
+          <w:i w:val="0"/>
+          <w:color w:val="555555"/>
+          <w:sz w:val="18"/>
+        </w:rPr>
+        <w:t>Monitoring says: Low, 3 people affected, work blocked: no</w:t>
+      </w:r>
+    </w:p>
+    <w:p>
+      <w:pPr>
+        <w:spacing w:after="40"/>
+        <w:ind w:left="864"/>
+      </w:pPr>
+      <w:r>
+        <w:rPr>
+          <w:i w:val="0"/>
+          <w:color w:val="555555"/>
+          <w:sz w:val="18"/>
+        </w:rPr>
+        <w:t>The promise clock says: 2.0 hours promised, 1.1 left</w:t>
+      </w:r>
+    </w:p>
+    <w:p>
+      <w:pPr>
+        <w:spacing w:after="40"/>
+        <w:ind w:left="864"/>
+      </w:pPr>
+      <w:r>
+        <w:rPr>
+          <w:i w:val="0"/>
+          <w:color w:val="555555"/>
+          <w:sz w:val="18"/>
+        </w:rPr>
+        <w:t>The customer themselves said: Low</w:t>
+      </w:r>
+    </w:p>
+    <w:p>
+      <w:pPr>
+        <w:spacing w:after="40"/>
+        <w:ind w:left="432"/>
+      </w:pPr>
+      <w:r>
+        <w:rPr>
+          <w:i w:val="0"/>
+          <w:color w:val="555555"/>
+          <w:sz w:val="18"/>
+        </w:rPr>
+        <w:t>TICK-00171</w:t>
+      </w:r>
+    </w:p>
+    <w:p>
+      <w:pPr>
+        <w:spacing w:after="40"/>
+        <w:ind w:left="864"/>
+      </w:pPr>
+      <w:r>
+        <w:rPr>
+          <w:i w:val="0"/>
+          <w:color w:val="555555"/>
+          <w:sz w:val="18"/>
+        </w:rPr>
+        <w:t>Customer records say: Free plan, pays £0 a month, has asked 1 time</w:t>
+      </w:r>
+    </w:p>
+    <w:p>
+      <w:pPr>
+        <w:spacing w:after="40"/>
+        <w:ind w:left="864"/>
+      </w:pPr>
+      <w:r>
+        <w:rPr>
+          <w:i w:val="0"/>
+          <w:color w:val="555555"/>
+          <w:sz w:val="18"/>
+        </w:rPr>
+        <w:t>Monitoring says: Critical, 4940 people affected, work blocked: yes</w:t>
+      </w:r>
+    </w:p>
+    <w:p>
+      <w:pPr>
+        <w:spacing w:after="40"/>
+        <w:ind w:left="864"/>
+      </w:pPr>
+      <w:r>
+        <w:rPr>
+          <w:i w:val="0"/>
+          <w:color w:val="555555"/>
+          <w:sz w:val="18"/>
+        </w:rPr>
+        <w:t>The promise clock says: 72.0 hours promised, 29.6 left</w:t>
+      </w:r>
+    </w:p>
+    <w:p>
+      <w:pPr>
+        <w:spacing w:after="40"/>
+        <w:ind w:left="864"/>
+      </w:pPr>
+      <w:r>
+        <w:rPr>
+          <w:i w:val="0"/>
+          <w:color w:val="555555"/>
+          <w:sz w:val="18"/>
+        </w:rPr>
+        <w:t>The customer themselves said: Critical</w:t>
+      </w:r>
+    </w:p>
+    <w:p>
+      <w:pPr>
+        <w:spacing w:after="40"/>
+        <w:ind w:left="432"/>
+      </w:pPr>
+      <w:r>
+        <w:rPr>
+          <w:i w:val="0"/>
+          <w:color w:val="555555"/>
+          <w:sz w:val="18"/>
+        </w:rPr>
+        <w:t>TICK-00771</w:t>
+      </w:r>
+    </w:p>
+    <w:p>
+      <w:pPr>
+        <w:spacing w:after="40"/>
+        <w:ind w:left="864"/>
+      </w:pPr>
+      <w:r>
+        <w:rPr>
+          <w:i w:val="0"/>
+          <w:color w:val="555555"/>
+          <w:sz w:val="18"/>
+        </w:rPr>
+        <w:t>Customer records say: Basic plan, pays £55 a month, has asked 7 times</w:t>
+      </w:r>
+    </w:p>
+    <w:p>
+      <w:pPr>
+        <w:spacing w:after="40"/>
+        <w:ind w:left="864"/>
+      </w:pPr>
+      <w:r>
+        <w:rPr>
+          <w:i w:val="0"/>
+          <w:color w:val="555555"/>
+          <w:sz w:val="18"/>
+        </w:rPr>
+        <w:t>Monitoring says: Low, 1 person affected, work blocked: no</w:t>
+      </w:r>
+    </w:p>
+    <w:p>
+      <w:pPr>
+        <w:spacing w:after="40"/>
+        <w:ind w:left="864"/>
+      </w:pPr>
+      <w:r>
+        <w:rPr>
+          <w:i w:val="0"/>
+          <w:color w:val="555555"/>
+          <w:sz w:val="18"/>
+        </w:rPr>
+        <w:t>The promise clock says: 24.0 hours promised, 15.4 left</w:t>
+      </w:r>
+    </w:p>
+    <w:p>
+      <w:pPr>
+        <w:spacing w:after="40"/>
+        <w:ind w:left="864"/>
+      </w:pPr>
+      <w:r>
+        <w:rPr>
+          <w:i w:val="0"/>
+          <w:color w:val="555555"/>
+          <w:sz w:val="18"/>
+        </w:rPr>
+        <w:t>The customer themselves said: High</w:t>
+      </w:r>
+    </w:p>
+    <w:p>
+      <w:pPr>
+        <w:spacing w:after="40"/>
+        <w:ind w:left="432"/>
+      </w:pPr>
+      <w:r>
+        <w:rPr>
+          <w:i w:val="0"/>
+          <w:color w:val="555555"/>
+          <w:sz w:val="18"/>
+        </w:rPr>
+        <w:t>TICK-00266</w:t>
+      </w:r>
+    </w:p>
+    <w:p>
+      <w:pPr>
+        <w:spacing w:after="40"/>
+        <w:ind w:left="864"/>
+      </w:pPr>
+      <w:r>
+        <w:rPr>
+          <w:i w:val="0"/>
+          <w:color w:val="555555"/>
+          <w:sz w:val="18"/>
+        </w:rPr>
+        <w:t>Customer records say: Enterprise plan, pays £29,044 a month, has asked 4 times</w:t>
+      </w:r>
+    </w:p>
+    <w:p>
+      <w:pPr>
+        <w:spacing w:after="40"/>
+        <w:ind w:left="864"/>
+      </w:pPr>
+      <w:r>
+        <w:rPr>
+          <w:i w:val="0"/>
+          <w:color w:val="555555"/>
+          <w:sz w:val="18"/>
+        </w:rPr>
+        <w:t>Monitoring says: Low, 1 person affected, work blocked: no</w:t>
+      </w:r>
+    </w:p>
+    <w:p>
+      <w:pPr>
+        <w:spacing w:after="40"/>
+        <w:ind w:left="864"/>
+      </w:pPr>
+      <w:r>
+        <w:rPr>
+          <w:i w:val="0"/>
+          <w:color w:val="555555"/>
+          <w:sz w:val="18"/>
+        </w:rPr>
+        <w:t>The promise clock says: 2.0 hours promised, 0.3 left</w:t>
+      </w:r>
+    </w:p>
+    <w:p>
+      <w:pPr>
+        <w:spacing w:after="40"/>
+        <w:ind w:left="864"/>
+      </w:pPr>
+      <w:r>
+        <w:rPr>
+          <w:i w:val="0"/>
+          <w:color w:val="555555"/>
+          <w:sz w:val="18"/>
+        </w:rPr>
+        <w:t>The customer themselves said: High</w:t>
+      </w:r>
+    </w:p>
+    <w:p>
+      <w:pPr>
+        <w:spacing w:after="40"/>
+        <w:ind w:left="432"/>
+      </w:pPr>
+      <w:r>
+        <w:rPr>
+          <w:i w:val="0"/>
+          <w:color w:val="555555"/>
+          <w:sz w:val="18"/>
+        </w:rPr>
+        <w:t>TICK-00982</w:t>
+      </w:r>
+    </w:p>
+    <w:p>
+      <w:pPr>
+        <w:spacing w:after="40"/>
+        <w:ind w:left="864"/>
+      </w:pPr>
+      <w:r>
+        <w:rPr>
+          <w:i w:val="0"/>
+          <w:color w:val="555555"/>
+          <w:sz w:val="18"/>
+        </w:rPr>
+        <w:t>Customer records say: Basic plan, pays £106 a month, has asked 11 times</w:t>
+      </w:r>
+    </w:p>
+    <w:p>
+      <w:pPr>
+        <w:spacing w:after="40"/>
+        <w:ind w:left="864"/>
+      </w:pPr>
+      <w:r>
+        <w:rPr>
+          <w:i w:val="0"/>
+          <w:color w:val="555555"/>
+          <w:sz w:val="18"/>
+        </w:rPr>
+        <w:t>Monitoring says: Medium, 35 people affected, work blocked: no</w:t>
+      </w:r>
+    </w:p>
+    <w:p>
+      <w:pPr>
+        <w:spacing w:after="40"/>
+        <w:ind w:left="864"/>
+      </w:pPr>
+      <w:r>
+        <w:rPr>
+          <w:i w:val="0"/>
+          <w:color w:val="555555"/>
+          <w:sz w:val="18"/>
+        </w:rPr>
+        <w:t>The promise clock says: 24.0 hours promised, -49.8 left, already late</w:t>
+      </w:r>
+    </w:p>
+    <w:p>
+      <w:pPr>
+        <w:spacing w:after="40"/>
+        <w:ind w:left="864"/>
+      </w:pPr>
+      <w:r>
+        <w:rPr>
+          <w:i w:val="0"/>
+          <w:color w:val="555555"/>
+          <w:sz w:val="18"/>
+        </w:rPr>
+        <w:t>The customer themselves said: Medium</w:t>
+      </w:r>
+    </w:p>
+    <w:p>
+      <w:pPr>
+        <w:spacing w:after="40"/>
+        <w:ind w:left="432"/>
+      </w:pPr>
+      <w:r>
+        <w:rPr>
+          <w:i w:val="0"/>
+          <w:color w:val="555555"/>
+          <w:sz w:val="18"/>
+        </w:rPr>
+        <w:t>TICK-00135</w:t>
+      </w:r>
+    </w:p>
+    <w:p>
+      <w:pPr>
+        <w:spacing w:after="40"/>
+        <w:ind w:left="864"/>
+      </w:pPr>
+      <w:r>
+        <w:rPr>
+          <w:i w:val="0"/>
+          <w:color w:val="555555"/>
+          <w:sz w:val="18"/>
+        </w:rPr>
+        <w:t>Customer records say: Basic plan, pays £41 a month, has asked 1 time</w:t>
+      </w:r>
+    </w:p>
+    <w:p>
+      <w:pPr>
+        <w:spacing w:after="40"/>
+        <w:ind w:left="864"/>
+      </w:pPr>
+      <w:r>
+        <w:rPr>
+          <w:i w:val="0"/>
+          <w:color w:val="555555"/>
+          <w:sz w:val="18"/>
+        </w:rPr>
+        <w:t>Monitoring says: Low, 1 person affected, work blocked: no</w:t>
+      </w:r>
+    </w:p>
+    <w:p>
+      <w:pPr>
+        <w:spacing w:after="40"/>
+        <w:ind w:left="864"/>
+      </w:pPr>
+      <w:r>
+        <w:rPr>
+          <w:i w:val="0"/>
+          <w:color w:val="555555"/>
+          <w:sz w:val="18"/>
+        </w:rPr>
+        <w:t>The promise clock says: 24.0 hours promised, 19.3 left</w:t>
+      </w:r>
+    </w:p>
+    <w:p>
+      <w:pPr>
+        <w:spacing w:after="40"/>
+        <w:ind w:left="864"/>
+      </w:pPr>
+      <w:r>
+        <w:rPr>
+          <w:i w:val="0"/>
+          <w:color w:val="555555"/>
+          <w:sz w:val="18"/>
+        </w:rPr>
+        <w:t>The customer themselves said: Critical</w:t>
+      </w:r>
+    </w:p>
+    <w:p>
+      <w:pPr>
+        <w:spacing w:before="240" w:after="60"/>
+      </w:pPr>
+      <w:r>
+        <w:rPr>
+          <w:b/>
+          <w:color w:val="6D28D9"/>
+          <w:sz w:val="23"/>
+        </w:rPr>
+        <w:t>Step 3   Rank them four different ways</w:t>
+      </w:r>
+    </w:p>
+    <w:p>
+      <w:pPr>
+        <w:spacing w:after="40"/>
+        <w:ind w:left="0"/>
+      </w:pPr>
+      <w:r>
+        <w:rPr>
+          <w:i w:val="0"/>
+          <w:color w:val="111111"/>
+          <w:sz w:val="20"/>
+        </w:rPr>
+        <w:t>Each way is reasonable on its own, and each one is wrong on its own. They are evidence for the agent to weigh, not instructions to follow.</w:t>
+      </w:r>
+    </w:p>
+    <w:p>
+      <w:pPr>
+        <w:spacing w:after="40"/>
+        <w:ind w:left="432"/>
+      </w:pPr>
+      <w:r>
+        <w:rPr>
+          <w:i w:val="0"/>
+          <w:color w:val="555555"/>
+          <w:sz w:val="18"/>
+        </w:rPr>
+        <w:t>By money:  1. TICK-00707  2. TICK-00266  3. TICK-00982  4. TICK-00771  5. TICK-00135  6. TICK-00171</w:t>
+      </w:r>
+    </w:p>
+    <w:p>
+      <w:pPr>
+        <w:spacing w:after="40"/>
+        <w:ind w:left="432"/>
+      </w:pPr>
+      <w:r>
+        <w:rPr>
+          <w:i w:val="0"/>
+          <w:color w:val="555555"/>
+          <w:sz w:val="18"/>
+        </w:rPr>
+        <w:t>By damage:  1. TICK-00171  2. TICK-00982  3. TICK-00707  4. TICK-00771  5. TICK-00266  6. TICK-00135</w:t>
+      </w:r>
+    </w:p>
+    <w:p>
+      <w:pPr>
+        <w:spacing w:after="40"/>
+        <w:ind w:left="432"/>
+      </w:pPr>
+      <w:r>
+        <w:rPr>
+          <w:i w:val="0"/>
+          <w:color w:val="555555"/>
+          <w:sz w:val="18"/>
+        </w:rPr>
+        <w:t>By deadline:  1. TICK-00982  2. TICK-00266  3. TICK-00171  4. TICK-00707  5. TICK-00771  6. TICK-00135</w:t>
+      </w:r>
+    </w:p>
+    <w:p>
+      <w:pPr>
+        <w:spacing w:after="40"/>
+        <w:ind w:left="432"/>
+      </w:pPr>
+      <w:r>
+        <w:rPr>
+          <w:i w:val="0"/>
+          <w:color w:val="555555"/>
+          <w:sz w:val="18"/>
+        </w:rPr>
+        <w:t>By fairness:  1. TICK-00982  2. TICK-00771  3. TICK-00266  4. TICK-00171  5. TICK-00135  6. TICK-00707</w:t>
+      </w:r>
+    </w:p>
+    <w:p>
+      <w:pPr>
+        <w:spacing w:after="40"/>
+        <w:ind w:left="0"/>
+      </w:pPr>
+      <w:r>
+        <w:rPr>
+          <w:i w:val="0"/>
+          <w:color w:val="111111"/>
+          <w:sz w:val="20"/>
+        </w:rPr>
+      </w:r>
+    </w:p>
+    <w:p>
+      <w:pPr>
+        <w:spacing w:after="40"/>
+        <w:ind w:left="432"/>
+      </w:pPr>
+      <w:r>
+        <w:rPr>
+          <w:i w:val="0"/>
+          <w:color w:val="111111"/>
+          <w:sz w:val="20"/>
+        </w:rPr>
+        <w:t>Where the four disagreed most:</w:t>
+      </w:r>
+    </w:p>
+    <w:p>
+      <w:pPr>
+        <w:spacing w:after="40"/>
+        <w:ind w:left="864"/>
+      </w:pPr>
+      <w:r>
+        <w:rPr>
+          <w:i w:val="0"/>
+          <w:color w:val="555555"/>
+          <w:sz w:val="18"/>
+        </w:rPr>
+        <w:t>TICK-00707 was placed as high as 1 and as low as 6. This is where judgement was needed.</w:t>
+      </w:r>
+    </w:p>
+    <w:p>
+      <w:pPr>
+        <w:spacing w:after="40"/>
+        <w:ind w:left="864"/>
+      </w:pPr>
+      <w:r>
+        <w:rPr>
+          <w:i w:val="0"/>
+          <w:color w:val="555555"/>
+          <w:sz w:val="18"/>
+        </w:rPr>
+        <w:t>TICK-00171 was placed as high as 1 and as low as 6. This is where judgement was needed.</w:t>
+      </w:r>
+    </w:p>
+    <w:p>
+      <w:pPr>
+        <w:spacing w:after="40"/>
+        <w:ind w:left="864"/>
+      </w:pPr>
+      <w:r>
+        <w:rPr>
+          <w:i w:val="0"/>
+          <w:color w:val="555555"/>
+          <w:sz w:val="18"/>
+        </w:rPr>
+        <w:t>TICK-00771 was placed as high as 2 and as low as 5. This is where judgement was needed.</w:t>
+      </w:r>
+    </w:p>
+    <w:p>
+      <w:pPr>
+        <w:spacing w:after="40"/>
+        <w:ind w:left="864"/>
+      </w:pPr>
+      <w:r>
+        <w:rPr>
+          <w:i w:val="0"/>
+          <w:color w:val="555555"/>
+          <w:sz w:val="18"/>
+        </w:rPr>
+        <w:t>TICK-00266 was placed as high as 2 and as low as 5. This is where judgement was needed.</w:t>
+      </w:r>
+    </w:p>
+    <w:p>
+      <w:pPr>
+        <w:spacing w:before="240" w:after="60"/>
+      </w:pPr>
+      <w:r>
+        <w:rPr>
+          <w:b/>
+          <w:color w:val="6D28D9"/>
+          <w:sz w:val="23"/>
+        </w:rPr>
+        <w:t>Step 4   Read what the customer actually wrote</w:t>
+      </w:r>
+    </w:p>
+    <w:p>
+      <w:pPr>
+        <w:spacing w:after="40"/>
+        <w:ind w:left="0"/>
+      </w:pPr>
+      <w:r>
+        <w:rPr>
+          <w:i w:val="0"/>
+          <w:color w:val="111111"/>
+          <w:sz w:val="20"/>
+        </w:rPr>
+        <w:t>The four ways above only look at numbers, so they cannot tell a password reset apart from a break-in. Both look like one person with nothing failing. The words are the difference.</w:t>
+      </w:r>
+    </w:p>
+    <w:p>
+      <w:pPr>
+        <w:spacing w:after="40"/>
+        <w:ind w:left="432"/>
+      </w:pPr>
+      <w:r>
+        <w:rPr>
+          <w:i w:val="0"/>
+          <w:color w:val="555555"/>
+          <w:sz w:val="18"/>
+        </w:rPr>
+        <w:t>TICK-00707: “Hello, Pages take around thirty seconds to load. No rush, whenever you get a chance.”</w:t>
+      </w:r>
+    </w:p>
+    <w:p>
+      <w:pPr>
+        <w:spacing w:after="40"/>
+        <w:ind w:left="432"/>
+      </w:pPr>
+      <w:r>
+        <w:rPr>
+          <w:i w:val="0"/>
+          <w:color w:val="555555"/>
+          <w:sz w:val="18"/>
+        </w:rPr>
+        <w:t>TICK-00171: “Hi there, A folder of client files is gone and nobody on our side removed it. Many thanks.”</w:t>
+      </w:r>
+    </w:p>
+    <w:p>
+      <w:pPr>
+        <w:spacing w:after="40"/>
+        <w:ind w:left="432"/>
+      </w:pPr>
+      <w:r>
+        <w:rPr>
+          <w:i w:val="0"/>
+          <w:color w:val="555555"/>
+          <w:sz w:val="18"/>
+        </w:rPr>
+        <w:t>TICK-00771: “Hi, Someone has changed our admin email address and it was not us. Please could someone look at this.”</w:t>
+      </w:r>
+    </w:p>
+    <w:p>
+      <w:pPr>
+        <w:spacing w:after="40"/>
+        <w:ind w:left="432"/>
+      </w:pPr>
+      <w:r>
+        <w:rPr>
+          <w:i w:val="0"/>
+          <w:color w:val="555555"/>
+          <w:sz w:val="18"/>
+        </w:rPr>
+        <w:t>TICK-00266: “This is now the third time I am writing. Being able to select several rows at once would save us a lot of time. We expect a reply today.”</w:t>
+      </w:r>
+    </w:p>
+    <w:p>
+      <w:pPr>
+        <w:spacing w:after="40"/>
+        <w:ind w:left="432"/>
+      </w:pPr>
+      <w:r>
+        <w:rPr>
+          <w:i w:val="0"/>
+          <w:color w:val="555555"/>
+          <w:sz w:val="18"/>
+        </w:rPr>
+        <w:t>TICK-00982: “Hi, The export button spins for a while and then nothing happens. This is holding us up.”</w:t>
+      </w:r>
+    </w:p>
+    <w:p>
+      <w:pPr>
+        <w:spacing w:after="40"/>
+        <w:ind w:left="432"/>
+      </w:pPr>
+      <w:r>
+        <w:rPr>
+          <w:i w:val="0"/>
+          <w:color w:val="555555"/>
+          <w:sz w:val="18"/>
+        </w:rPr>
+        <w:t>TICK-00135: “This is now the third time I am writing. The reset link never arrives in my inbox. Please escalate this immediately.”</w:t>
+      </w:r>
+    </w:p>
+    <w:p>
+      <w:pPr>
+        <w:spacing w:before="240" w:after="60"/>
+      </w:pPr>
+      <w:r>
+        <w:rPr>
+          <w:b/>
+          <w:color w:val="6D28D9"/>
+          <w:sz w:val="23"/>
+        </w:rPr>
+        <w:t>Step 5   The AI decides, and says why</w:t>
+      </w:r>
+    </w:p>
+    <w:p>
+      <w:pPr>
+        <w:spacing w:after="40"/>
+        <w:ind w:left="432"/>
+      </w:pPr>
+      <w:r>
+        <w:rPr>
+          <w:i w:val="0"/>
+          <w:color w:val="111111"/>
+          <w:sz w:val="20"/>
+        </w:rPr>
+        <w:t>1. TICK-00171   Deleted records we did not delete</w:t>
+      </w:r>
+    </w:p>
+    <w:p>
+      <w:pPr>
+        <w:spacing w:after="40"/>
+        <w:ind w:left="864"/>
+      </w:pPr>
+      <w:r>
+        <w:rPr>
+          <w:i/>
+          <w:color w:val="555555"/>
+          <w:sz w:val="20"/>
+        </w:rPr>
+        <w:t>Massive data loss affecting thousands and blocking work makes it the top priority.</w:t>
+      </w:r>
+    </w:p>
+    <w:p>
+      <w:pPr>
+        <w:spacing w:after="40"/>
+        <w:ind w:left="432"/>
+      </w:pPr>
+      <w:r>
+        <w:rPr>
+          <w:i w:val="0"/>
+          <w:color w:val="111111"/>
+          <w:sz w:val="20"/>
+        </w:rPr>
+        <w:t>2. TICK-00982   Cannot download report</w:t>
+      </w:r>
+    </w:p>
+    <w:p>
+      <w:pPr>
+        <w:spacing w:after="40"/>
+        <w:ind w:left="864"/>
+      </w:pPr>
+      <w:r>
+        <w:rPr>
+          <w:i/>
+          <w:color w:val="555555"/>
+          <w:sz w:val="20"/>
+        </w:rPr>
+        <w:t>The export failure is already overdue, so it must be addressed next.</w:t>
+      </w:r>
+    </w:p>
+    <w:p>
+      <w:pPr>
+        <w:spacing w:after="40"/>
+        <w:ind w:left="432"/>
+      </w:pPr>
+      <w:r>
+        <w:rPr>
+          <w:i w:val="0"/>
+          <w:color w:val="111111"/>
+          <w:sz w:val="20"/>
+        </w:rPr>
+        <w:t>3. TICK-00771   Possible breach</w:t>
+      </w:r>
+    </w:p>
+    <w:p>
+      <w:pPr>
+        <w:spacing w:after="40"/>
+        <w:ind w:left="864"/>
+      </w:pPr>
+      <w:r>
+        <w:rPr>
+          <w:i/>
+          <w:color w:val="555555"/>
+          <w:sz w:val="20"/>
+        </w:rPr>
+        <w:t>A possible account takeover is a security risk that policy forces into the top three.</w:t>
+      </w:r>
+    </w:p>
+    <w:p>
+      <w:pPr>
+        <w:spacing w:after="40"/>
+        <w:ind w:left="432"/>
+      </w:pPr>
+      <w:r>
+        <w:rPr>
+          <w:i w:val="0"/>
+          <w:color w:val="111111"/>
+          <w:sz w:val="20"/>
+        </w:rPr>
+        <w:t>4. TICK-00266   Request for bulk actions</w:t>
+      </w:r>
+    </w:p>
+    <w:p>
+      <w:pPr>
+        <w:spacing w:after="40"/>
+        <w:ind w:left="864"/>
+      </w:pPr>
+      <w:r>
+        <w:rPr>
+          <w:i/>
+          <w:color w:val="555555"/>
+          <w:sz w:val="20"/>
+        </w:rPr>
+        <w:t>The feature request is close to its promised response time.</w:t>
+      </w:r>
+    </w:p>
+    <w:p>
+      <w:pPr>
+        <w:spacing w:after="40"/>
+        <w:ind w:left="432"/>
+      </w:pPr>
+      <w:r>
+        <w:rPr>
+          <w:i w:val="0"/>
+          <w:color w:val="111111"/>
+          <w:sz w:val="20"/>
+        </w:rPr>
+        <w:t>5. TICK-00707   The platform is very slow</w:t>
+      </w:r>
+    </w:p>
+    <w:p>
+      <w:pPr>
+        <w:spacing w:after="40"/>
+        <w:ind w:left="864"/>
+      </w:pPr>
+      <w:r>
+        <w:rPr>
+          <w:i/>
+          <w:color w:val="555555"/>
+          <w:sz w:val="20"/>
+        </w:rPr>
+        <w:t>Enterprise customer sees slow pages and system load is high, but impact is limited.</w:t>
+      </w:r>
+    </w:p>
+    <w:p>
+      <w:pPr>
+        <w:spacing w:after="40"/>
+        <w:ind w:left="432"/>
+      </w:pPr>
+      <w:r>
+        <w:rPr>
+          <w:i w:val="0"/>
+          <w:color w:val="111111"/>
+          <w:sz w:val="20"/>
+        </w:rPr>
+        <w:t>6. TICK-00135   Password reset needed</w:t>
+      </w:r>
+    </w:p>
+    <w:p>
+      <w:pPr>
+        <w:spacing w:after="40"/>
+        <w:ind w:left="864"/>
+      </w:pPr>
+      <w:r>
+        <w:rPr>
+          <w:i/>
+          <w:color w:val="555555"/>
+          <w:sz w:val="20"/>
+        </w:rPr>
+        <w:t>A single password reset is low impact compared to other tickets.</w:t>
+      </w:r>
+    </w:p>
+    <w:p>
+      <w:pPr>
+        <w:spacing w:after="40"/>
+        <w:ind w:left="0"/>
+      </w:pPr>
+      <w:r>
+        <w:rPr>
+          <w:i w:val="0"/>
+          <w:color w:val="111111"/>
+          <w:sz w:val="20"/>
+        </w:rPr>
+      </w:r>
+    </w:p>
+    <w:p>
+      <w:pPr>
+        <w:spacing w:after="40"/>
+        <w:ind w:left="432"/>
+      </w:pPr>
+      <w:r>
+        <w:rPr>
+          <w:i w:val="0"/>
+          <w:color w:val="111111"/>
+          <w:sz w:val="20"/>
+        </w:rPr>
+        <w:t>The trade-off it made:</w:t>
+      </w:r>
+    </w:p>
+    <w:p>
+      <w:pPr>
+        <w:spacing w:after="40"/>
+        <w:ind w:left="864"/>
+      </w:pPr>
+      <w:r>
+        <w:rPr>
+          <w:i/>
+          <w:color w:val="555555"/>
+          <w:sz w:val="20"/>
+        </w:rPr>
+        <w:t>We favoured user impact and SLA breaches over pure revenue considerations, sacrificing some short‑term money optimisation. This may cost us a slight dip in immediate earnings but protects reputation and avoids larger fallout.</w:t>
+      </w:r>
+    </w:p>
+    <w:p>
+      <w:pPr>
+        <w:spacing w:after="40"/>
+        <w:ind w:left="0"/>
+      </w:pPr>
+      <w:r>
+        <w:rPr>
+          <w:i w:val="0"/>
+          <w:color w:val="111111"/>
+          <w:sz w:val="20"/>
+        </w:rPr>
+      </w:r>
+    </w:p>
+    <w:p>
+      <w:pPr>
+        <w:spacing w:after="40"/>
+        <w:ind w:left="432"/>
+      </w:pPr>
+      <w:r>
+        <w:rPr>
+          <w:i w:val="0"/>
+          <w:color w:val="111111"/>
+          <w:sz w:val="20"/>
+        </w:rPr>
+        <w:t>The closest call:</w:t>
+      </w:r>
+    </w:p>
+    <w:p>
+      <w:pPr>
+        <w:spacing w:after="40"/>
+        <w:ind w:left="864"/>
+      </w:pPr>
+      <w:r>
+        <w:rPr>
+          <w:i/>
+          <w:color w:val="555555"/>
+          <w:sz w:val="20"/>
+        </w:rPr>
+        <w:t>Placing TICK-00982 second instead of first was hardest because its deadline is overdue, yet TICK-00171 harms far more users; either ordering could be justified.</w:t>
+      </w:r>
+    </w:p>
+    <w:p>
+      <w:pPr>
+        <w:spacing w:after="40"/>
+        <w:ind w:left="0"/>
+      </w:pPr>
+      <w:r>
+        <w:rPr>
+          <w:i w:val="0"/>
+          <w:color w:val="111111"/>
+          <w:sz w:val="20"/>
+        </w:rPr>
+      </w:r>
+    </w:p>
+    <w:p>
+      <w:pPr>
+        <w:spacing w:after="40"/>
+        <w:ind w:left="432"/>
+      </w:pPr>
+      <w:r>
+        <w:rPr>
+          <w:i w:val="0"/>
+          <w:color w:val="111111"/>
+          <w:sz w:val="20"/>
+        </w:rPr>
+        <w:t>How it ranked the four ways of deciding:</w:t>
+      </w:r>
+    </w:p>
+    <w:p>
+      <w:pPr>
+        <w:spacing w:after="40"/>
+        <w:ind w:left="864"/>
+      </w:pPr>
+      <w:r>
+        <w:rPr>
+          <w:i w:val="0"/>
+          <w:color w:val="111111"/>
+          <w:sz w:val="20"/>
+        </w:rPr>
+        <w:t>1. damage</w:t>
+      </w:r>
+    </w:p>
+    <w:p>
+      <w:pPr>
+        <w:spacing w:after="40"/>
+        <w:ind w:left="1296"/>
+      </w:pPr>
+      <w:r>
+        <w:rPr>
+          <w:i/>
+          <w:color w:val="555555"/>
+          <w:sz w:val="20"/>
+        </w:rPr>
+        <w:t>why here: User impact and work blockage directly reflect service failure severity, which we prioritized for this batch.</w:t>
+      </w:r>
+    </w:p>
+    <w:p>
+      <w:pPr>
+        <w:spacing w:after="40"/>
+        <w:ind w:left="1296"/>
+      </w:pPr>
+      <w:r>
+        <w:rPr>
+          <w:i/>
+          <w:color w:val="555555"/>
+          <w:sz w:val="20"/>
+        </w:rPr>
+        <w:t>gets wrong: It can push high‑paying customers with less visible impact down the list.</w:t>
+      </w:r>
+    </w:p>
+    <w:p>
+      <w:pPr>
+        <w:spacing w:after="40"/>
+        <w:ind w:left="864"/>
+      </w:pPr>
+      <w:r>
+        <w:rPr>
+          <w:i w:val="0"/>
+          <w:color w:val="111111"/>
+          <w:sz w:val="20"/>
+        </w:rPr>
+        <w:t>2. deadline</w:t>
+      </w:r>
+    </w:p>
+    <w:p>
+      <w:pPr>
+        <w:spacing w:after="40"/>
+        <w:ind w:left="1296"/>
+      </w:pPr>
+      <w:r>
+        <w:rPr>
+          <w:i/>
+          <w:color w:val="555555"/>
+          <w:sz w:val="20"/>
+        </w:rPr>
+        <w:t>why here: Missing promised response times erodes trust and may incur penalties, so SLA adherence was weighted next.</w:t>
+      </w:r>
+    </w:p>
+    <w:p>
+      <w:pPr>
+        <w:spacing w:after="40"/>
+        <w:ind w:left="1296"/>
+      </w:pPr>
+      <w:r>
+        <w:rPr>
+          <w:i/>
+          <w:color w:val="555555"/>
+          <w:sz w:val="20"/>
+        </w:rPr>
+        <w:t>gets wrong: It may elevate tickets with low actual harm over more critical but not overdue issues.</w:t>
+      </w:r>
+    </w:p>
+    <w:p>
+      <w:pPr>
+        <w:spacing w:after="40"/>
+        <w:ind w:left="864"/>
+      </w:pPr>
+      <w:r>
+        <w:rPr>
+          <w:i w:val="0"/>
+          <w:color w:val="111111"/>
+          <w:sz w:val="20"/>
+        </w:rPr>
+        <w:t>3. fairness</w:t>
+      </w:r>
+    </w:p>
+    <w:p>
+      <w:pPr>
+        <w:spacing w:after="40"/>
+        <w:ind w:left="1296"/>
+      </w:pPr>
+      <w:r>
+        <w:rPr>
+          <w:i/>
+          <w:color w:val="555555"/>
+          <w:sz w:val="20"/>
+        </w:rPr>
+        <w:t>why here: Ensures equitable treatment, especially for security incidents that monitoring misses.</w:t>
+      </w:r>
+    </w:p>
+    <w:p>
+      <w:pPr>
+        <w:spacing w:after="40"/>
+        <w:ind w:left="1296"/>
+      </w:pPr>
+      <w:r>
+        <w:rPr>
+          <w:i/>
+          <w:color w:val="555555"/>
+          <w:sz w:val="20"/>
+        </w:rPr>
+        <w:t>gets wrong: Fairness scores can conflict with revenue or impact metrics, leading to sub‑optimal resource use.</w:t>
+      </w:r>
+    </w:p>
+    <w:p>
+      <w:pPr>
+        <w:spacing w:after="40"/>
+        <w:ind w:left="864"/>
+      </w:pPr>
+      <w:r>
+        <w:rPr>
+          <w:i w:val="0"/>
+          <w:color w:val="111111"/>
+          <w:sz w:val="20"/>
+        </w:rPr>
+        <w:t>4. money</w:t>
+      </w:r>
+    </w:p>
+    <w:p>
+      <w:pPr>
+        <w:spacing w:after="40"/>
+        <w:ind w:left="1296"/>
+      </w:pPr>
+      <w:r>
+        <w:rPr>
+          <w:i/>
+          <w:color w:val="555555"/>
+          <w:sz w:val="20"/>
+        </w:rPr>
+        <w:t>why here: Revenue is important but was given the least weight because critical service failures outweigh profit in this set.</w:t>
+      </w:r>
+    </w:p>
+    <w:p>
+      <w:pPr>
+        <w:spacing w:after="40"/>
+        <w:ind w:left="1296"/>
+      </w:pPr>
+      <w:r>
+        <w:rPr>
+          <w:i/>
+          <w:color w:val="555555"/>
+          <w:sz w:val="20"/>
+        </w:rPr>
+        <w:t>gets wrong: High‑value customers may feel deprioritized when their issues are less severe.</w:t>
+      </w:r>
+    </w:p>
+    <w:p>
+      <w:pPr>
+        <w:spacing w:after="40"/>
+        <w:ind w:left="0"/>
+      </w:pPr>
+      <w:r>
+        <w:rPr>
+          <w:i w:val="0"/>
+          <w:color w:val="111111"/>
+          <w:sz w:val="20"/>
+        </w:rPr>
+      </w:r>
+    </w:p>
+    <w:p>
+      <w:pPr>
+        <w:spacing w:after="40"/>
+        <w:ind w:left="432"/>
+      </w:pPr>
+      <w:r>
+        <w:rPr>
+          <w:i w:val="0"/>
+          <w:color w:val="111111"/>
+          <w:sz w:val="20"/>
+        </w:rPr>
+        <w:t>Closest call between the four:</w:t>
+      </w:r>
+    </w:p>
+    <w:p>
+      <w:pPr>
+        <w:spacing w:after="40"/>
+        <w:ind w:left="864"/>
+      </w:pPr>
+      <w:r>
+        <w:rPr>
+          <w:i/>
+          <w:color w:val="555555"/>
+          <w:sz w:val="20"/>
+        </w:rPr>
+        <w:t>Damage outranked deadline because the data loss affected thousands and halted work, a far greater consequence than a missed SLA on a less critical export failure.</w:t>
+      </w:r>
+    </w:p>
+    <w:p>
+      <w:pPr>
+        <w:spacing w:before="240" w:after="60"/>
+      </w:pPr>
+      <w:r>
+        <w:rPr>
+          <w:b/>
+          <w:color w:val="6D28D9"/>
+          <w:sz w:val="23"/>
+        </w:rPr>
+        <w:t>Step 6   Check the answer before anything happens</w:t>
+      </w:r>
+    </w:p>
+    <w:p>
+      <w:pPr>
+        <w:spacing w:after="40"/>
+        <w:ind w:left="432"/>
+      </w:pPr>
+      <w:r>
+        <w:rPr>
+          <w:i w:val="0"/>
+          <w:color w:val="111111"/>
+          <w:sz w:val="20"/>
+        </w:rPr>
+        <w:t>Did every complaint come back, and were the written rules followed?</w:t>
+      </w:r>
+    </w:p>
+    <w:p>
+      <w:pPr>
+        <w:spacing w:after="40"/>
+        <w:ind w:left="864"/>
+      </w:pPr>
+      <w:r>
+        <w:rPr>
+          <w:i/>
+          <w:color w:val="555555"/>
+          <w:sz w:val="20"/>
+        </w:rPr>
+        <w:t>Yes. Nothing was dropped and no rule was broken.</w:t>
+      </w:r>
+    </w:p>
+    <w:p>
+      <w:pPr>
+        <w:spacing w:after="40"/>
+        <w:ind w:left="0"/>
+      </w:pPr>
+      <w:r>
+        <w:rPr>
+          <w:i w:val="0"/>
+          <w:color w:val="111111"/>
+          <w:sz w:val="20"/>
+        </w:rPr>
+      </w:r>
+    </w:p>
+    <w:p>
+      <w:pPr>
+        <w:spacing w:after="40"/>
+        <w:ind w:left="432"/>
+      </w:pPr>
+      <w:r>
+        <w:rPr>
+          <w:i w:val="0"/>
+          <w:color w:val="111111"/>
+          <w:sz w:val="20"/>
+        </w:rPr>
+        <w:t>Were the reasons it gave actually true?</w:t>
+      </w:r>
+    </w:p>
+    <w:p>
+      <w:pPr>
+        <w:spacing w:after="40"/>
+        <w:ind w:left="864"/>
+      </w:pPr>
+      <w:r>
+        <w:rPr>
+          <w:i/>
+          <w:color w:val="555555"/>
+          <w:sz w:val="20"/>
+        </w:rPr>
+        <w:t>Yes. Every reason matched the numbers we hold.</w:t>
+      </w:r>
+    </w:p>
+    <w:p>
+      <w:pPr>
+        <w:spacing w:after="40"/>
+        <w:ind w:left="0"/>
+      </w:pPr>
+      <w:r>
+        <w:rPr>
+          <w:i w:val="0"/>
+          <w:color w:val="111111"/>
+          <w:sz w:val="20"/>
+        </w:rPr>
+      </w:r>
+    </w:p>
+    <w:p>
+      <w:pPr>
+        <w:spacing w:after="40"/>
+        <w:ind w:left="432"/>
+      </w:pPr>
+      <w:r>
+        <w:rPr>
+          <w:i w:val="0"/>
+          <w:color w:val="111111"/>
+          <w:sz w:val="20"/>
+        </w:rPr>
+        <w:t>How solid was the answer? One number was changed at a time and everything ranked again, to see which places were close calls.</w:t>
+      </w:r>
+    </w:p>
+    <w:p>
+      <w:pPr>
+        <w:spacing w:after="40"/>
+        <w:ind w:left="864"/>
+      </w:pPr>
+      <w:r>
+        <w:rPr>
+          <w:i w:val="0"/>
+          <w:color w:val="555555"/>
+          <w:sz w:val="18"/>
+        </w:rPr>
+        <w:t>TICK-00707  shaky  (3 of 7 small changes move it)</w:t>
+      </w:r>
+    </w:p>
+    <w:p>
+      <w:pPr>
+        <w:spacing w:after="40"/>
+        <w:ind w:left="1296"/>
+      </w:pPr>
+      <w:r>
+        <w:rPr>
+          <w:i/>
+          <w:color w:val="555555"/>
+          <w:sz w:val="18"/>
+        </w:rPr>
+        <w:t>if work was blocked after all, it moves from 4 to 3</w:t>
+      </w:r>
+    </w:p>
+    <w:p>
+      <w:pPr>
+        <w:spacing w:after="40"/>
+        <w:ind w:left="1296"/>
+      </w:pPr>
+      <w:r>
+        <w:rPr>
+          <w:i/>
+          <w:color w:val="555555"/>
+          <w:sz w:val="18"/>
+        </w:rPr>
+        <w:t>if we had a quarter less time left than we thought, it moves from 4 to 2</w:t>
+      </w:r>
+    </w:p>
+    <w:p>
+      <w:pPr>
+        <w:spacing w:after="40"/>
+        <w:ind w:left="864"/>
+      </w:pPr>
+      <w:r>
+        <w:rPr>
+          <w:i w:val="0"/>
+          <w:color w:val="555555"/>
+          <w:sz w:val="18"/>
+        </w:rPr>
+        <w:t>TICK-00171  fairly solid  (1 of 6 small changes move it)</w:t>
+      </w:r>
+    </w:p>
+    <w:p>
+      <w:pPr>
+        <w:spacing w:after="40"/>
+        <w:ind w:left="1296"/>
+      </w:pPr>
+      <w:r>
+        <w:rPr>
+          <w:i/>
+          <w:color w:val="555555"/>
+          <w:sz w:val="18"/>
+        </w:rPr>
+        <w:t>if we had a quarter more time left than we thought, it moves from 2 to 4</w:t>
+      </w:r>
+    </w:p>
+    <w:p>
+      <w:pPr>
+        <w:spacing w:after="40"/>
+        <w:ind w:left="864"/>
+      </w:pPr>
+      <w:r>
+        <w:rPr>
+          <w:i w:val="0"/>
+          <w:color w:val="555555"/>
+          <w:sz w:val="18"/>
+        </w:rPr>
+        <w:t>TICK-00771  shaky  (3 of 6 small changes move it)</w:t>
+      </w:r>
+    </w:p>
+    <w:p>
+      <w:pPr>
+        <w:spacing w:after="40"/>
+        <w:ind w:left="1296"/>
+      </w:pPr>
+      <w:r>
+        <w:rPr>
+          <w:i/>
+          <w:color w:val="555555"/>
+          <w:sz w:val="18"/>
+        </w:rPr>
+        <w:t>if 7 people were affected, not 1, it moves from 5 to 4</w:t>
+      </w:r>
+    </w:p>
+    <w:p>
+      <w:pPr>
+        <w:spacing w:after="40"/>
+        <w:ind w:left="1296"/>
+      </w:pPr>
+      <w:r>
+        <w:rPr>
+          <w:i/>
+          <w:color w:val="555555"/>
+          <w:sz w:val="18"/>
+        </w:rPr>
+        <w:t>if work was blocked after all, it moves from 5 to 3</w:t>
+      </w:r>
+    </w:p>
+    <w:p>
+      <w:pPr>
+        <w:spacing w:after="40"/>
+        <w:ind w:left="864"/>
+      </w:pPr>
+      <w:r>
+        <w:rPr>
+          <w:i w:val="0"/>
+          <w:color w:val="555555"/>
+          <w:sz w:val="18"/>
+        </w:rPr>
+        <w:t>TICK-00266  fairly solid  (2 of 6 small changes move it)</w:t>
+      </w:r>
+    </w:p>
+    <w:p>
+      <w:pPr>
+        <w:spacing w:after="40"/>
+        <w:ind w:left="1296"/>
+      </w:pPr>
+      <w:r>
+        <w:rPr>
+          <w:i/>
+          <w:color w:val="555555"/>
+          <w:sz w:val="18"/>
+        </w:rPr>
+        <w:t>if 7 people were affected, not 1, it moves from 3 to 2</w:t>
+      </w:r>
+    </w:p>
+    <w:p>
+      <w:pPr>
+        <w:spacing w:after="40"/>
+        <w:ind w:left="1296"/>
+      </w:pPr>
+      <w:r>
+        <w:rPr>
+          <w:i/>
+          <w:color w:val="555555"/>
+          <w:sz w:val="18"/>
+        </w:rPr>
+        <w:t>if work was blocked after all, it moves from 3 to 2</w:t>
+      </w:r>
+    </w:p>
+    <w:p>
+      <w:pPr>
+        <w:spacing w:after="40"/>
+        <w:ind w:left="864"/>
+      </w:pPr>
+      <w:r>
+        <w:rPr>
+          <w:i w:val="0"/>
+          <w:color w:val="555555"/>
+          <w:sz w:val="18"/>
+        </w:rPr>
+        <w:t>TICK-00982  solid  (0 of 7 small changes move it)</w:t>
+      </w:r>
+    </w:p>
+    <w:p>
+      <w:pPr>
+        <w:spacing w:after="40"/>
+        <w:ind w:left="864"/>
+      </w:pPr>
+      <w:r>
+        <w:rPr>
+          <w:i w:val="0"/>
+          <w:color w:val="555555"/>
+          <w:sz w:val="18"/>
+        </w:rPr>
+        <w:t>TICK-00135  fairly solid  (1 of 6 small changes move it)</w:t>
+      </w:r>
+    </w:p>
+    <w:p>
+      <w:pPr>
+        <w:spacing w:after="40"/>
+        <w:ind w:left="1296"/>
+      </w:pPr>
+      <w:r>
+        <w:rPr>
+          <w:i/>
+          <w:color w:val="555555"/>
+          <w:sz w:val="18"/>
+        </w:rPr>
+        <w:t>if work was blocked after all, it moves from 6 to 5</w:t>
+      </w:r>
+    </w:p>
+    <w:p>
+      <w:pPr>
+        <w:spacing w:before="240" w:after="60"/>
+      </w:pPr>
+      <w:r>
+        <w:rPr>
+          <w:b/>
+          <w:color w:val="6D28D9"/>
+          <w:sz w:val="23"/>
+        </w:rPr>
+        <w:t>Step 7   Hand them to a person</w:t>
+      </w:r>
+    </w:p>
+    <w:p>
+      <w:pPr>
+        <w:spacing w:after="40"/>
+        <w:ind w:left="432"/>
+      </w:pPr>
+      <w:r>
+        <w:rPr>
+          <w:i w:val="0"/>
+          <w:color w:val="555555"/>
+          <w:sz w:val="18"/>
+        </w:rPr>
+        <w:t>TICK-00171 goes to a person now</w:t>
+      </w:r>
+    </w:p>
+    <w:p>
+      <w:pPr>
+        <w:spacing w:after="40"/>
+        <w:ind w:left="432"/>
+      </w:pPr>
+      <w:r>
+        <w:rPr>
+          <w:i w:val="0"/>
+          <w:color w:val="555555"/>
+          <w:sz w:val="18"/>
+        </w:rPr>
+        <w:t>TICK-00982 goes to a person next</w:t>
+      </w:r>
+    </w:p>
+    <w:p>
+      <w:pPr>
+        <w:spacing w:after="40"/>
+        <w:ind w:left="432"/>
+      </w:pPr>
+      <w:r>
+        <w:rPr>
+          <w:i w:val="0"/>
+          <w:color w:val="555555"/>
+          <w:sz w:val="18"/>
+        </w:rPr>
+        <w:t>TICK-00771 goes to a person next   (the numbers were not settled about this one)</w:t>
       </w:r>
     </w:p>
     <w:p>

</xml_diff>

<commit_message>
Add plain English intake, so complaints can arrive as people actually write them
</commit_message>
<xml_diff>
--- a/data/how_the_agent_thinks.docx
+++ b/data/how_the_agent_thinks.docx
@@ -15278,6 +15278,3144 @@
           <w:sz w:val="18"/>
         </w:rPr>
         <w:t>TICK-00135 goes to a person queued</w:t>
+      </w:r>
+    </w:p>
+    <w:p/>
+    <w:p>
+      <w:pPr>
+        <w:spacing w:after="200"/>
+      </w:pPr>
+      <w:r>
+        <w:rPr>
+          <w:color w:val="CCCCCC"/>
+        </w:rPr>
+        <w:t>______________________________________________________________________________</w:t>
+      </w:r>
+    </w:p>
+    <w:p>
+      <w:r>
+        <w:rPr>
+          <w:b/>
+          <w:color w:val="4C1D95"/>
+          <w:sz w:val="30"/>
+        </w:rPr>
+        <w:t>Run on 16 August 2026 at 22:16:41</w:t>
+      </w:r>
+    </w:p>
+    <w:p>
+      <w:pPr>
+        <w:spacing w:after="40"/>
+        <w:ind w:left="0"/>
+      </w:pPr>
+      <w:r>
+        <w:rPr>
+          <w:i/>
+          <w:color w:val="555555"/>
+          <w:sz w:val="18"/>
+        </w:rPr>
+        <w:t>Recorded as DEC-20260816-221641</w:t>
+      </w:r>
+    </w:p>
+    <w:p>
+      <w:pPr>
+        <w:spacing w:before="240" w:after="60"/>
+      </w:pPr>
+      <w:r>
+        <w:rPr>
+          <w:b/>
+          <w:color w:val="6D28D9"/>
+          <w:sz w:val="23"/>
+        </w:rPr>
+        <w:t>Step 1   Pick up the waiting complaints</w:t>
+      </w:r>
+    </w:p>
+    <w:p>
+      <w:pPr>
+        <w:spacing w:after="40"/>
+        <w:ind w:left="0"/>
+      </w:pPr>
+      <w:r>
+        <w:rPr>
+          <w:i w:val="0"/>
+          <w:color w:val="111111"/>
+          <w:sz w:val="20"/>
+        </w:rPr>
+        <w:t>5 complaints were waiting.</w:t>
+      </w:r>
+    </w:p>
+    <w:p>
+      <w:pPr>
+        <w:spacing w:after="40"/>
+        <w:ind w:left="432"/>
+      </w:pPr>
+      <w:r>
+        <w:rPr>
+          <w:i w:val="0"/>
+          <w:color w:val="555555"/>
+          <w:sz w:val="18"/>
+        </w:rPr>
+        <w:t>NEW-00001   Team locked out of system</w:t>
+      </w:r>
+    </w:p>
+    <w:p>
+      <w:pPr>
+        <w:spacing w:after="40"/>
+        <w:ind w:left="432"/>
+      </w:pPr>
+      <w:r>
+        <w:rPr>
+          <w:i w:val="0"/>
+          <w:color w:val="555555"/>
+          <w:sz w:val="18"/>
+        </w:rPr>
+        <w:t>NEW-00002   Customer data deletion request</w:t>
+      </w:r>
+    </w:p>
+    <w:p>
+      <w:pPr>
+        <w:spacing w:after="40"/>
+        <w:ind w:left="432"/>
+      </w:pPr>
+      <w:r>
+        <w:rPr>
+          <w:i w:val="0"/>
+          <w:color w:val="555555"/>
+          <w:sz w:val="18"/>
+        </w:rPr>
+        <w:t>NEW-00003   Payments failing at checkout</w:t>
+      </w:r>
+    </w:p>
+    <w:p>
+      <w:pPr>
+        <w:spacing w:after="40"/>
+        <w:ind w:left="432"/>
+      </w:pPr>
+      <w:r>
+        <w:rPr>
+          <w:i w:val="0"/>
+          <w:color w:val="555555"/>
+          <w:sz w:val="18"/>
+        </w:rPr>
+        <w:t>NEW-00004   Unknown device session</w:t>
+      </w:r>
+    </w:p>
+    <w:p>
+      <w:pPr>
+        <w:spacing w:after="40"/>
+        <w:ind w:left="432"/>
+      </w:pPr>
+      <w:r>
+        <w:rPr>
+          <w:i w:val="0"/>
+          <w:color w:val="555555"/>
+          <w:sz w:val="18"/>
+        </w:rPr>
+        <w:t>NEW-00005   Dashboard showing outdated data</w:t>
+      </w:r>
+    </w:p>
+    <w:p>
+      <w:pPr>
+        <w:spacing w:before="240" w:after="60"/>
+      </w:pPr>
+      <w:r>
+        <w:rPr>
+          <w:b/>
+          <w:color w:val="6D28D9"/>
+          <w:sz w:val="23"/>
+        </w:rPr>
+        <w:t>Step 2   Look up the three separate systems</w:t>
+      </w:r>
+    </w:p>
+    <w:p>
+      <w:pPr>
+        <w:spacing w:after="40"/>
+        <w:ind w:left="0"/>
+      </w:pPr>
+      <w:r>
+        <w:rPr>
+          <w:i w:val="0"/>
+          <w:color w:val="111111"/>
+          <w:sz w:val="20"/>
+        </w:rPr>
+        <w:t>Each system knows a different part of the story, and none of them can see what the others see.</w:t>
+      </w:r>
+    </w:p>
+    <w:p>
+      <w:pPr>
+        <w:spacing w:after="40"/>
+        <w:ind w:left="432"/>
+      </w:pPr>
+      <w:r>
+        <w:rPr>
+          <w:i w:val="0"/>
+          <w:color w:val="555555"/>
+          <w:sz w:val="18"/>
+        </w:rPr>
+        <w:t>NEW-00001</w:t>
+      </w:r>
+    </w:p>
+    <w:p>
+      <w:pPr>
+        <w:spacing w:after="40"/>
+        <w:ind w:left="864"/>
+      </w:pPr>
+      <w:r>
+        <w:rPr>
+          <w:i w:val="0"/>
+          <w:color w:val="555555"/>
+          <w:sz w:val="18"/>
+        </w:rPr>
+        <w:t>Customer records say: Enterprise plan, pays £27,928 a month, has asked 1 time</w:t>
+      </w:r>
+    </w:p>
+    <w:p>
+      <w:pPr>
+        <w:spacing w:after="40"/>
+        <w:ind w:left="864"/>
+      </w:pPr>
+      <w:r>
+        <w:rPr>
+          <w:i w:val="0"/>
+          <w:color w:val="555555"/>
+          <w:sz w:val="18"/>
+        </w:rPr>
+        <w:t>Monitoring says: Critical, 1676 people affected, work blocked: yes</w:t>
+      </w:r>
+    </w:p>
+    <w:p>
+      <w:pPr>
+        <w:spacing w:after="40"/>
+        <w:ind w:left="864"/>
+      </w:pPr>
+      <w:r>
+        <w:rPr>
+          <w:i w:val="0"/>
+          <w:color w:val="555555"/>
+          <w:sz w:val="18"/>
+        </w:rPr>
+        <w:t>The promise clock says: 2.0 hours promised, 1.6 left</w:t>
+      </w:r>
+    </w:p>
+    <w:p>
+      <w:pPr>
+        <w:spacing w:after="40"/>
+        <w:ind w:left="864"/>
+      </w:pPr>
+      <w:r>
+        <w:rPr>
+          <w:i w:val="0"/>
+          <w:color w:val="555555"/>
+          <w:sz w:val="18"/>
+        </w:rPr>
+        <w:t>The customer themselves said: Critical</w:t>
+      </w:r>
+    </w:p>
+    <w:p>
+      <w:pPr>
+        <w:spacing w:after="40"/>
+        <w:ind w:left="432"/>
+      </w:pPr>
+      <w:r>
+        <w:rPr>
+          <w:i w:val="0"/>
+          <w:color w:val="555555"/>
+          <w:sz w:val="18"/>
+        </w:rPr>
+        <w:t>NEW-00002</w:t>
+      </w:r>
+    </w:p>
+    <w:p>
+      <w:pPr>
+        <w:spacing w:after="40"/>
+        <w:ind w:left="864"/>
+      </w:pPr>
+      <w:r>
+        <w:rPr>
+          <w:i w:val="0"/>
+          <w:color w:val="555555"/>
+          <w:sz w:val="18"/>
+        </w:rPr>
+        <w:t>Customer records say: Basic plan, pays £119 a month, has asked 1 time</w:t>
+      </w:r>
+    </w:p>
+    <w:p>
+      <w:pPr>
+        <w:spacing w:after="40"/>
+        <w:ind w:left="864"/>
+      </w:pPr>
+      <w:r>
+        <w:rPr>
+          <w:i w:val="0"/>
+          <w:color w:val="555555"/>
+          <w:sz w:val="18"/>
+        </w:rPr>
+        <w:t>Monitoring says: Low, 2 people affected, work blocked: no</w:t>
+      </w:r>
+    </w:p>
+    <w:p>
+      <w:pPr>
+        <w:spacing w:after="40"/>
+        <w:ind w:left="864"/>
+      </w:pPr>
+      <w:r>
+        <w:rPr>
+          <w:i w:val="0"/>
+          <w:color w:val="555555"/>
+          <w:sz w:val="18"/>
+        </w:rPr>
+        <w:t>The promise clock says: 24.0 hours promised, 18.7 left</w:t>
+      </w:r>
+    </w:p>
+    <w:p>
+      <w:pPr>
+        <w:spacing w:after="40"/>
+        <w:ind w:left="864"/>
+      </w:pPr>
+      <w:r>
+        <w:rPr>
+          <w:i w:val="0"/>
+          <w:color w:val="555555"/>
+          <w:sz w:val="18"/>
+        </w:rPr>
+        <w:t>The customer themselves said: High</w:t>
+      </w:r>
+    </w:p>
+    <w:p>
+      <w:pPr>
+        <w:spacing w:after="40"/>
+        <w:ind w:left="432"/>
+      </w:pPr>
+      <w:r>
+        <w:rPr>
+          <w:i w:val="0"/>
+          <w:color w:val="555555"/>
+          <w:sz w:val="18"/>
+        </w:rPr>
+        <w:t>NEW-00003</w:t>
+      </w:r>
+    </w:p>
+    <w:p>
+      <w:pPr>
+        <w:spacing w:after="40"/>
+        <w:ind w:left="864"/>
+      </w:pPr>
+      <w:r>
+        <w:rPr>
+          <w:i w:val="0"/>
+          <w:color w:val="555555"/>
+          <w:sz w:val="18"/>
+        </w:rPr>
+        <w:t>Customer records say: Basic plan, pays £104 a month, has asked 1 time</w:t>
+      </w:r>
+    </w:p>
+    <w:p>
+      <w:pPr>
+        <w:spacing w:after="40"/>
+        <w:ind w:left="864"/>
+      </w:pPr>
+      <w:r>
+        <w:rPr>
+          <w:i w:val="0"/>
+          <w:color w:val="555555"/>
+          <w:sz w:val="18"/>
+        </w:rPr>
+        <w:t>Monitoring says: Critical, 2026 people affected, work blocked: yes</w:t>
+      </w:r>
+    </w:p>
+    <w:p>
+      <w:pPr>
+        <w:spacing w:after="40"/>
+        <w:ind w:left="864"/>
+      </w:pPr>
+      <w:r>
+        <w:rPr>
+          <w:i w:val="0"/>
+          <w:color w:val="555555"/>
+          <w:sz w:val="18"/>
+        </w:rPr>
+        <w:t>The promise clock says: 24.0 hours promised, 0.5 left</w:t>
+      </w:r>
+    </w:p>
+    <w:p>
+      <w:pPr>
+        <w:spacing w:after="40"/>
+        <w:ind w:left="864"/>
+      </w:pPr>
+      <w:r>
+        <w:rPr>
+          <w:i w:val="0"/>
+          <w:color w:val="555555"/>
+          <w:sz w:val="18"/>
+        </w:rPr>
+        <w:t>The customer themselves said: High</w:t>
+      </w:r>
+    </w:p>
+    <w:p>
+      <w:pPr>
+        <w:spacing w:after="40"/>
+        <w:ind w:left="432"/>
+      </w:pPr>
+      <w:r>
+        <w:rPr>
+          <w:i w:val="0"/>
+          <w:color w:val="555555"/>
+          <w:sz w:val="18"/>
+        </w:rPr>
+        <w:t>NEW-00004</w:t>
+      </w:r>
+    </w:p>
+    <w:p>
+      <w:pPr>
+        <w:spacing w:after="40"/>
+        <w:ind w:left="864"/>
+      </w:pPr>
+      <w:r>
+        <w:rPr>
+          <w:i w:val="0"/>
+          <w:color w:val="555555"/>
+          <w:sz w:val="18"/>
+        </w:rPr>
+        <w:t>Customer records say: Basic plan, pays £56 a month, has asked 1 time</w:t>
+      </w:r>
+    </w:p>
+    <w:p>
+      <w:pPr>
+        <w:spacing w:after="40"/>
+        <w:ind w:left="864"/>
+      </w:pPr>
+      <w:r>
+        <w:rPr>
+          <w:i w:val="0"/>
+          <w:color w:val="555555"/>
+          <w:sz w:val="18"/>
+        </w:rPr>
+        <w:t>Monitoring says: Low, 2 people affected, work blocked: no</w:t>
+      </w:r>
+    </w:p>
+    <w:p>
+      <w:pPr>
+        <w:spacing w:after="40"/>
+        <w:ind w:left="864"/>
+      </w:pPr>
+      <w:r>
+        <w:rPr>
+          <w:i w:val="0"/>
+          <w:color w:val="555555"/>
+          <w:sz w:val="18"/>
+        </w:rPr>
+        <w:t>The promise clock says: 24.0 hours promised, -5.3 left, already late</w:t>
+      </w:r>
+    </w:p>
+    <w:p>
+      <w:pPr>
+        <w:spacing w:after="40"/>
+        <w:ind w:left="864"/>
+      </w:pPr>
+      <w:r>
+        <w:rPr>
+          <w:i w:val="0"/>
+          <w:color w:val="555555"/>
+          <w:sz w:val="18"/>
+        </w:rPr>
+        <w:t>The customer themselves said: Low</w:t>
+      </w:r>
+    </w:p>
+    <w:p>
+      <w:pPr>
+        <w:spacing w:after="40"/>
+        <w:ind w:left="432"/>
+      </w:pPr>
+      <w:r>
+        <w:rPr>
+          <w:i w:val="0"/>
+          <w:color w:val="555555"/>
+          <w:sz w:val="18"/>
+        </w:rPr>
+        <w:t>NEW-00005</w:t>
+      </w:r>
+    </w:p>
+    <w:p>
+      <w:pPr>
+        <w:spacing w:after="40"/>
+        <w:ind w:left="864"/>
+      </w:pPr>
+      <w:r>
+        <w:rPr>
+          <w:i w:val="0"/>
+          <w:color w:val="555555"/>
+          <w:sz w:val="18"/>
+        </w:rPr>
+        <w:t>Customer records say: Free plan, pays £0 a month, has asked 1 time</w:t>
+      </w:r>
+    </w:p>
+    <w:p>
+      <w:pPr>
+        <w:spacing w:after="40"/>
+        <w:ind w:left="864"/>
+      </w:pPr>
+      <w:r>
+        <w:rPr>
+          <w:i w:val="0"/>
+          <w:color w:val="555555"/>
+          <w:sz w:val="18"/>
+        </w:rPr>
+        <w:t>Monitoring says: Medium, 36 people affected, work blocked: no</w:t>
+      </w:r>
+    </w:p>
+    <w:p>
+      <w:pPr>
+        <w:spacing w:after="40"/>
+        <w:ind w:left="864"/>
+      </w:pPr>
+      <w:r>
+        <w:rPr>
+          <w:i w:val="0"/>
+          <w:color w:val="555555"/>
+          <w:sz w:val="18"/>
+        </w:rPr>
+        <w:t>The promise clock says: 72.0 hours promised, -3.5 left, already late</w:t>
+      </w:r>
+    </w:p>
+    <w:p>
+      <w:pPr>
+        <w:spacing w:after="40"/>
+        <w:ind w:left="864"/>
+      </w:pPr>
+      <w:r>
+        <w:rPr>
+          <w:i w:val="0"/>
+          <w:color w:val="555555"/>
+          <w:sz w:val="18"/>
+        </w:rPr>
+        <w:t>The customer themselves said: Critical</w:t>
+      </w:r>
+    </w:p>
+    <w:p>
+      <w:pPr>
+        <w:spacing w:before="240" w:after="60"/>
+      </w:pPr>
+      <w:r>
+        <w:rPr>
+          <w:b/>
+          <w:color w:val="6D28D9"/>
+          <w:sz w:val="23"/>
+        </w:rPr>
+        <w:t>Step 3   Rank them four different ways</w:t>
+      </w:r>
+    </w:p>
+    <w:p>
+      <w:pPr>
+        <w:spacing w:after="40"/>
+        <w:ind w:left="0"/>
+      </w:pPr>
+      <w:r>
+        <w:rPr>
+          <w:i w:val="0"/>
+          <w:color w:val="111111"/>
+          <w:sz w:val="20"/>
+        </w:rPr>
+        <w:t>Each way is reasonable on its own, and each one is wrong on its own. They are evidence for the agent to weigh, not instructions to follow.</w:t>
+      </w:r>
+    </w:p>
+    <w:p>
+      <w:pPr>
+        <w:spacing w:after="40"/>
+        <w:ind w:left="432"/>
+      </w:pPr>
+      <w:r>
+        <w:rPr>
+          <w:i w:val="0"/>
+          <w:color w:val="555555"/>
+          <w:sz w:val="18"/>
+        </w:rPr>
+        <w:t>By money:  1. NEW-00001  2. NEW-00002  3. NEW-00003  4. NEW-00004  5. NEW-00005</w:t>
+      </w:r>
+    </w:p>
+    <w:p>
+      <w:pPr>
+        <w:spacing w:after="40"/>
+        <w:ind w:left="432"/>
+      </w:pPr>
+      <w:r>
+        <w:rPr>
+          <w:i w:val="0"/>
+          <w:color w:val="555555"/>
+          <w:sz w:val="18"/>
+        </w:rPr>
+        <w:t>By damage:  1. NEW-00003  2. NEW-00001  3. NEW-00005  4. NEW-00002  5. NEW-00004</w:t>
+      </w:r>
+    </w:p>
+    <w:p>
+      <w:pPr>
+        <w:spacing w:after="40"/>
+        <w:ind w:left="432"/>
+      </w:pPr>
+      <w:r>
+        <w:rPr>
+          <w:i w:val="0"/>
+          <w:color w:val="555555"/>
+          <w:sz w:val="18"/>
+        </w:rPr>
+        <w:t>By deadline:  1. NEW-00004  2. NEW-00005  3. NEW-00003  4. NEW-00002  5. NEW-00001</w:t>
+      </w:r>
+    </w:p>
+    <w:p>
+      <w:pPr>
+        <w:spacing w:after="40"/>
+        <w:ind w:left="432"/>
+      </w:pPr>
+      <w:r>
+        <w:rPr>
+          <w:i w:val="0"/>
+          <w:color w:val="555555"/>
+          <w:sz w:val="18"/>
+        </w:rPr>
+        <w:t>By fairness:  1. NEW-00004  2. NEW-00005  3. NEW-00002  4. NEW-00003  5. NEW-00001</w:t>
+      </w:r>
+    </w:p>
+    <w:p>
+      <w:pPr>
+        <w:spacing w:after="40"/>
+        <w:ind w:left="0"/>
+      </w:pPr>
+      <w:r>
+        <w:rPr>
+          <w:i w:val="0"/>
+          <w:color w:val="111111"/>
+          <w:sz w:val="20"/>
+        </w:rPr>
+      </w:r>
+    </w:p>
+    <w:p>
+      <w:pPr>
+        <w:spacing w:after="40"/>
+        <w:ind w:left="432"/>
+      </w:pPr>
+      <w:r>
+        <w:rPr>
+          <w:i w:val="0"/>
+          <w:color w:val="111111"/>
+          <w:sz w:val="20"/>
+        </w:rPr>
+        <w:t>Where the four disagreed most:</w:t>
+      </w:r>
+    </w:p>
+    <w:p>
+      <w:pPr>
+        <w:spacing w:after="40"/>
+        <w:ind w:left="864"/>
+      </w:pPr>
+      <w:r>
+        <w:rPr>
+          <w:i w:val="0"/>
+          <w:color w:val="555555"/>
+          <w:sz w:val="18"/>
+        </w:rPr>
+        <w:t>NEW-00001 was placed as high as 1 and as low as 5. This is where judgement was needed.</w:t>
+      </w:r>
+    </w:p>
+    <w:p>
+      <w:pPr>
+        <w:spacing w:after="40"/>
+        <w:ind w:left="864"/>
+      </w:pPr>
+      <w:r>
+        <w:rPr>
+          <w:i w:val="0"/>
+          <w:color w:val="555555"/>
+          <w:sz w:val="18"/>
+        </w:rPr>
+        <w:t>NEW-00003 was placed as high as 1 and as low as 4. This is where judgement was needed.</w:t>
+      </w:r>
+    </w:p>
+    <w:p>
+      <w:pPr>
+        <w:spacing w:after="40"/>
+        <w:ind w:left="864"/>
+      </w:pPr>
+      <w:r>
+        <w:rPr>
+          <w:i w:val="0"/>
+          <w:color w:val="555555"/>
+          <w:sz w:val="18"/>
+        </w:rPr>
+        <w:t>NEW-00004 was placed as high as 1 and as low as 5. This is where judgement was needed.</w:t>
+      </w:r>
+    </w:p>
+    <w:p>
+      <w:pPr>
+        <w:spacing w:after="40"/>
+        <w:ind w:left="864"/>
+      </w:pPr>
+      <w:r>
+        <w:rPr>
+          <w:i w:val="0"/>
+          <w:color w:val="555555"/>
+          <w:sz w:val="18"/>
+        </w:rPr>
+        <w:t>NEW-00005 was placed as high as 2 and as low as 5. This is where judgement was needed.</w:t>
+      </w:r>
+    </w:p>
+    <w:p>
+      <w:pPr>
+        <w:spacing w:before="240" w:after="60"/>
+      </w:pPr>
+      <w:r>
+        <w:rPr>
+          <w:b/>
+          <w:color w:val="6D28D9"/>
+          <w:sz w:val="23"/>
+        </w:rPr>
+        <w:t>Step 4   Read what the customer actually wrote</w:t>
+      </w:r>
+    </w:p>
+    <w:p>
+      <w:pPr>
+        <w:spacing w:after="40"/>
+        <w:ind w:left="0"/>
+      </w:pPr>
+      <w:r>
+        <w:rPr>
+          <w:i w:val="0"/>
+          <w:color w:val="111111"/>
+          <w:sz w:val="20"/>
+        </w:rPr>
+        <w:t>The four ways above only look at numbers, so they cannot tell a password reset apart from a break-in. Both look like one person with nothing failing. The words are the difference.</w:t>
+      </w:r>
+    </w:p>
+    <w:p>
+      <w:pPr>
+        <w:spacing w:after="40"/>
+        <w:ind w:left="432"/>
+      </w:pPr>
+      <w:r>
+        <w:rPr>
+          <w:i w:val="0"/>
+          <w:color w:val="555555"/>
+          <w:sz w:val="18"/>
+        </w:rPr>
+        <w:t>NEW-00001: “our whole team is locked out. nobody can get in since about 6am. we have a client demo at 10 and I don't know what to tell them”</w:t>
+      </w:r>
+    </w:p>
+    <w:p>
+      <w:pPr>
+        <w:spacing w:after="40"/>
+        <w:ind w:left="432"/>
+      </w:pPr>
+      <w:r>
+        <w:rPr>
+          <w:i w:val="0"/>
+          <w:color w:val="555555"/>
+          <w:sz w:val="18"/>
+        </w:rPr>
+        <w:t>NEW-00002: “I need to flag something. one of our customers has asked us to delete everything we hold on them. I believe there's a legal time limit on this and we're already a few days in”</w:t>
+      </w:r>
+    </w:p>
+    <w:p>
+      <w:pPr>
+        <w:spacing w:after="40"/>
+        <w:ind w:left="432"/>
+      </w:pPr>
+      <w:r>
+        <w:rPr>
+          <w:i w:val="0"/>
+          <w:color w:val="555555"/>
+          <w:sz w:val="18"/>
+        </w:rPr>
+        <w:t>NEW-00003: “payments are failing at checkout. we've had maybe forty customers email us this morning saying their card was declined. our own test card fails too”</w:t>
+      </w:r>
+    </w:p>
+    <w:p>
+      <w:pPr>
+        <w:spacing w:after="40"/>
+        <w:ind w:left="432"/>
+      </w:pPr>
+      <w:r>
+        <w:rPr>
+          <w:i w:val="0"/>
+          <w:color w:val="555555"/>
+          <w:sz w:val="18"/>
+        </w:rPr>
+        <w:t>NEW-00004: “there is a session logged in from a device we don't recognise and I can't work out how to end it. probably nothing but thought I should mention it”</w:t>
+      </w:r>
+    </w:p>
+    <w:p>
+      <w:pPr>
+        <w:spacing w:after="40"/>
+        <w:ind w:left="432"/>
+      </w:pPr>
+      <w:r>
+        <w:rPr>
+          <w:i w:val="0"/>
+          <w:color w:val="555555"/>
+          <w:sz w:val="18"/>
+        </w:rPr>
+        <w:t>NEW-00005: “ABSOLUTELY UNACCEPTABLE. our dashboard chart is showing last month's figures. we pay you thousands every month and I expect better than this. I want someone to call me today”</w:t>
+      </w:r>
+    </w:p>
+    <w:p>
+      <w:pPr>
+        <w:spacing w:before="240" w:after="60"/>
+      </w:pPr>
+      <w:r>
+        <w:rPr>
+          <w:b/>
+          <w:color w:val="6D28D9"/>
+          <w:sz w:val="23"/>
+        </w:rPr>
+        <w:t>Step 5   The AI decides, and says why</w:t>
+      </w:r>
+    </w:p>
+    <w:p>
+      <w:pPr>
+        <w:spacing w:after="40"/>
+        <w:ind w:left="432"/>
+      </w:pPr>
+      <w:r>
+        <w:rPr>
+          <w:i w:val="0"/>
+          <w:color w:val="111111"/>
+          <w:sz w:val="20"/>
+        </w:rPr>
+        <w:t>1. NEW-00001   Team locked out of system</w:t>
+      </w:r>
+    </w:p>
+    <w:p>
+      <w:pPr>
+        <w:spacing w:after="40"/>
+        <w:ind w:left="864"/>
+      </w:pPr>
+      <w:r>
+        <w:rPr>
+          <w:i/>
+          <w:color w:val="555555"/>
+          <w:sz w:val="20"/>
+        </w:rPr>
+        <w:t>High‑paying enterprise with a critical lockout affecting the whole team and a looming demo, so it gets top priority.</w:t>
+      </w:r>
+    </w:p>
+    <w:p>
+      <w:pPr>
+        <w:spacing w:after="40"/>
+        <w:ind w:left="432"/>
+      </w:pPr>
+      <w:r>
+        <w:rPr>
+          <w:i w:val="0"/>
+          <w:color w:val="111111"/>
+          <w:sz w:val="20"/>
+        </w:rPr>
+        <w:t>2. NEW-00003   Payments failing at checkout</w:t>
+      </w:r>
+    </w:p>
+    <w:p>
+      <w:pPr>
+        <w:spacing w:after="40"/>
+        <w:ind w:left="864"/>
+      </w:pPr>
+      <w:r>
+        <w:rPr>
+          <w:i/>
+          <w:color w:val="555555"/>
+          <w:sz w:val="20"/>
+        </w:rPr>
+        <w:t>Critical payment failures block thousands of customers and the SLA is almost due, placing it second.</w:t>
+      </w:r>
+    </w:p>
+    <w:p>
+      <w:pPr>
+        <w:spacing w:after="40"/>
+        <w:ind w:left="432"/>
+      </w:pPr>
+      <w:r>
+        <w:rPr>
+          <w:i w:val="0"/>
+          <w:color w:val="111111"/>
+          <w:sz w:val="20"/>
+        </w:rPr>
+        <w:t>3. NEW-00004   Unknown device session</w:t>
+      </w:r>
+    </w:p>
+    <w:p>
+      <w:pPr>
+        <w:spacing w:after="40"/>
+        <w:ind w:left="864"/>
+      </w:pPr>
+      <w:r>
+        <w:rPr>
+          <w:i/>
+          <w:color w:val="555555"/>
+          <w:sz w:val="20"/>
+        </w:rPr>
+        <w:t>A possible security breach is flagged by policy to be at least third, and the deadline is already missed.</w:t>
+      </w:r>
+    </w:p>
+    <w:p>
+      <w:pPr>
+        <w:spacing w:after="40"/>
+        <w:ind w:left="432"/>
+      </w:pPr>
+      <w:r>
+        <w:rPr>
+          <w:i w:val="0"/>
+          <w:color w:val="111111"/>
+          <w:sz w:val="20"/>
+        </w:rPr>
+        <w:t>4. NEW-00002   Customer data deletion request</w:t>
+      </w:r>
+    </w:p>
+    <w:p>
+      <w:pPr>
+        <w:spacing w:after="40"/>
+        <w:ind w:left="864"/>
+      </w:pPr>
+      <w:r>
+        <w:rPr>
+          <w:i/>
+          <w:color w:val="555555"/>
+          <w:sz w:val="20"/>
+        </w:rPr>
+        <w:t>Legal data‑deletion request must be handled within the SLA but is less urgent than the above issues.</w:t>
+      </w:r>
+    </w:p>
+    <w:p>
+      <w:pPr>
+        <w:spacing w:after="40"/>
+        <w:ind w:left="432"/>
+      </w:pPr>
+      <w:r>
+        <w:rPr>
+          <w:i w:val="0"/>
+          <w:color w:val="111111"/>
+          <w:sz w:val="20"/>
+        </w:rPr>
+        <w:t>5. NEW-00005   Dashboard showing outdated data</w:t>
+      </w:r>
+    </w:p>
+    <w:p>
+      <w:pPr>
+        <w:spacing w:after="40"/>
+        <w:ind w:left="864"/>
+      </w:pPr>
+      <w:r>
+        <w:rPr>
+          <w:i/>
+          <w:color w:val="555555"/>
+          <w:sz w:val="20"/>
+        </w:rPr>
+        <w:t>Dashboard showing stale data affects a free user and, despite being overdue, ranks last after higher‑impact tickets.</w:t>
+      </w:r>
+    </w:p>
+    <w:p>
+      <w:pPr>
+        <w:spacing w:after="40"/>
+        <w:ind w:left="0"/>
+      </w:pPr>
+      <w:r>
+        <w:rPr>
+          <w:i w:val="0"/>
+          <w:color w:val="111111"/>
+          <w:sz w:val="20"/>
+        </w:rPr>
+      </w:r>
+    </w:p>
+    <w:p>
+      <w:pPr>
+        <w:spacing w:after="40"/>
+        <w:ind w:left="432"/>
+      </w:pPr>
+      <w:r>
+        <w:rPr>
+          <w:i w:val="0"/>
+          <w:color w:val="111111"/>
+          <w:sz w:val="20"/>
+        </w:rPr>
+        <w:t>The trade-off it made:</w:t>
+      </w:r>
+    </w:p>
+    <w:p>
+      <w:pPr>
+        <w:spacing w:after="40"/>
+        <w:ind w:left="864"/>
+      </w:pPr>
+      <w:r>
+        <w:rPr>
+          <w:i/>
+          <w:color w:val="555555"/>
+          <w:sz w:val="20"/>
+        </w:rPr>
+        <w:t>We favoured revenue (money) and user impact (damage) over the tighter remaining SLA on the payment‑failure ticket, pushing it to second place. This sacrifices a few minutes of SLA compliance on the payment issue, risking a minor breach cost.</w:t>
+      </w:r>
+    </w:p>
+    <w:p>
+      <w:pPr>
+        <w:spacing w:after="40"/>
+        <w:ind w:left="0"/>
+      </w:pPr>
+      <w:r>
+        <w:rPr>
+          <w:i w:val="0"/>
+          <w:color w:val="111111"/>
+          <w:sz w:val="20"/>
+        </w:rPr>
+      </w:r>
+    </w:p>
+    <w:p>
+      <w:pPr>
+        <w:spacing w:after="40"/>
+        <w:ind w:left="432"/>
+      </w:pPr>
+      <w:r>
+        <w:rPr>
+          <w:i w:val="0"/>
+          <w:color w:val="111111"/>
+          <w:sz w:val="20"/>
+        </w:rPr>
+        <w:t>The closest call:</w:t>
+      </w:r>
+    </w:p>
+    <w:p>
+      <w:pPr>
+        <w:spacing w:after="40"/>
+        <w:ind w:left="864"/>
+      </w:pPr>
+      <w:r>
+        <w:rPr>
+          <w:i/>
+          <w:color w:val="555555"/>
+          <w:sz w:val="20"/>
+        </w:rPr>
+        <w:t>Choosing between NEW-00001 and NEW-00003 was tight; the lockout’s high revenue and upcoming demo versus the payment failure’s larger user base and nearer deadline could both justify top rank.</w:t>
+      </w:r>
+    </w:p>
+    <w:p>
+      <w:pPr>
+        <w:spacing w:after="40"/>
+        <w:ind w:left="0"/>
+      </w:pPr>
+      <w:r>
+        <w:rPr>
+          <w:i w:val="0"/>
+          <w:color w:val="111111"/>
+          <w:sz w:val="20"/>
+        </w:rPr>
+      </w:r>
+    </w:p>
+    <w:p>
+      <w:pPr>
+        <w:spacing w:after="40"/>
+        <w:ind w:left="432"/>
+      </w:pPr>
+      <w:r>
+        <w:rPr>
+          <w:i w:val="0"/>
+          <w:color w:val="111111"/>
+          <w:sz w:val="20"/>
+        </w:rPr>
+        <w:t>How it ranked the four ways of deciding:</w:t>
+      </w:r>
+    </w:p>
+    <w:p>
+      <w:pPr>
+        <w:spacing w:after="40"/>
+        <w:ind w:left="864"/>
+      </w:pPr>
+      <w:r>
+        <w:rPr>
+          <w:i w:val="0"/>
+          <w:color w:val="111111"/>
+          <w:sz w:val="20"/>
+        </w:rPr>
+        <w:t>1. damage</w:t>
+      </w:r>
+    </w:p>
+    <w:p>
+      <w:pPr>
+        <w:spacing w:after="40"/>
+        <w:ind w:left="1296"/>
+      </w:pPr>
+      <w:r>
+        <w:rPr>
+          <w:i/>
+          <w:color w:val="555555"/>
+          <w:sz w:val="20"/>
+        </w:rPr>
+        <w:t>why here: User impact and work blockage affected the most customers in this batch, driving the priority order.</w:t>
+      </w:r>
+    </w:p>
+    <w:p>
+      <w:pPr>
+        <w:spacing w:after="40"/>
+        <w:ind w:left="1296"/>
+      </w:pPr>
+      <w:r>
+        <w:rPr>
+          <w:i/>
+          <w:color w:val="555555"/>
+          <w:sz w:val="20"/>
+        </w:rPr>
+        <w:t>gets wrong: It can over‑prioritise low‑paying customers at the expense of revenue considerations.</w:t>
+      </w:r>
+    </w:p>
+    <w:p>
+      <w:pPr>
+        <w:spacing w:after="40"/>
+        <w:ind w:left="864"/>
+      </w:pPr>
+      <w:r>
+        <w:rPr>
+          <w:i w:val="0"/>
+          <w:color w:val="111111"/>
+          <w:sz w:val="20"/>
+        </w:rPr>
+        <w:t>2. money</w:t>
+      </w:r>
+    </w:p>
+    <w:p>
+      <w:pPr>
+        <w:spacing w:after="40"/>
+        <w:ind w:left="1296"/>
+      </w:pPr>
+      <w:r>
+        <w:rPr>
+          <w:i/>
+          <w:color w:val="555555"/>
+          <w:sz w:val="20"/>
+        </w:rPr>
+        <w:t>why here: Revenue size is a strong business signal, especially for the enterprise lockout.</w:t>
+      </w:r>
+    </w:p>
+    <w:p>
+      <w:pPr>
+        <w:spacing w:after="40"/>
+        <w:ind w:left="1296"/>
+      </w:pPr>
+      <w:r>
+        <w:rPr>
+          <w:i/>
+          <w:color w:val="555555"/>
+          <w:sz w:val="20"/>
+        </w:rPr>
+        <w:t>gets wrong: It may push critical but low‑paying issues down too far.</w:t>
+      </w:r>
+    </w:p>
+    <w:p>
+      <w:pPr>
+        <w:spacing w:after="40"/>
+        <w:ind w:left="864"/>
+      </w:pPr>
+      <w:r>
+        <w:rPr>
+          <w:i w:val="0"/>
+          <w:color w:val="111111"/>
+          <w:sz w:val="20"/>
+        </w:rPr>
+        <w:t>3. deadline</w:t>
+      </w:r>
+    </w:p>
+    <w:p>
+      <w:pPr>
+        <w:spacing w:after="40"/>
+        <w:ind w:left="1296"/>
+      </w:pPr>
+      <w:r>
+        <w:rPr>
+          <w:i/>
+          <w:color w:val="555555"/>
+          <w:sz w:val="20"/>
+        </w:rPr>
+        <w:t>why here: Approaching or missed SLA deadlines indicate urgency that must be respected.</w:t>
+      </w:r>
+    </w:p>
+    <w:p>
+      <w:pPr>
+        <w:spacing w:after="40"/>
+        <w:ind w:left="1296"/>
+      </w:pPr>
+      <w:r>
+        <w:rPr>
+          <w:i/>
+          <w:color w:val="555555"/>
+          <w:sz w:val="20"/>
+        </w:rPr>
+        <w:t>gets wrong: Deadlines alone ignore the scale of impact or revenue.</w:t>
+      </w:r>
+    </w:p>
+    <w:p>
+      <w:pPr>
+        <w:spacing w:after="40"/>
+        <w:ind w:left="864"/>
+      </w:pPr>
+      <w:r>
+        <w:rPr>
+          <w:i w:val="0"/>
+          <w:color w:val="111111"/>
+          <w:sz w:val="20"/>
+        </w:rPr>
+        <w:t>4. fairness</w:t>
+      </w:r>
+    </w:p>
+    <w:p>
+      <w:pPr>
+        <w:spacing w:after="40"/>
+        <w:ind w:left="1296"/>
+      </w:pPr>
+      <w:r>
+        <w:rPr>
+          <w:i/>
+          <w:color w:val="555555"/>
+          <w:sz w:val="20"/>
+        </w:rPr>
+        <w:t>why here: Ensures equal treatment across customers but is less decisive when other signals clash.</w:t>
+      </w:r>
+    </w:p>
+    <w:p>
+      <w:pPr>
+        <w:spacing w:after="40"/>
+        <w:ind w:left="1296"/>
+      </w:pPr>
+      <w:r>
+        <w:rPr>
+          <w:i/>
+          <w:color w:val="555555"/>
+          <w:sz w:val="20"/>
+        </w:rPr>
+        <w:t>gets wrong: Can dilute priority for truly urgent or high‑impact cases.</w:t>
+      </w:r>
+    </w:p>
+    <w:p>
+      <w:pPr>
+        <w:spacing w:after="40"/>
+        <w:ind w:left="0"/>
+      </w:pPr>
+      <w:r>
+        <w:rPr>
+          <w:i w:val="0"/>
+          <w:color w:val="111111"/>
+          <w:sz w:val="20"/>
+        </w:rPr>
+      </w:r>
+    </w:p>
+    <w:p>
+      <w:pPr>
+        <w:spacing w:after="40"/>
+        <w:ind w:left="432"/>
+      </w:pPr>
+      <w:r>
+        <w:rPr>
+          <w:i w:val="0"/>
+          <w:color w:val="111111"/>
+          <w:sz w:val="20"/>
+        </w:rPr>
+        <w:t>Closest call between the four:</w:t>
+      </w:r>
+    </w:p>
+    <w:p>
+      <w:pPr>
+        <w:spacing w:after="40"/>
+        <w:ind w:left="864"/>
+      </w:pPr>
+      <w:r>
+        <w:rPr>
+          <w:i/>
+          <w:color w:val="555555"/>
+          <w:sz w:val="20"/>
+        </w:rPr>
+        <w:t>Damage outranked money because the number of users blocked and complete work stoppage directly affect the customer's operations, outweighing pure revenue considerations in this set.</w:t>
+      </w:r>
+    </w:p>
+    <w:p>
+      <w:pPr>
+        <w:spacing w:before="240" w:after="60"/>
+      </w:pPr>
+      <w:r>
+        <w:rPr>
+          <w:b/>
+          <w:color w:val="6D28D9"/>
+          <w:sz w:val="23"/>
+        </w:rPr>
+        <w:t>Step 6   Check the answer before anything happens</w:t>
+      </w:r>
+    </w:p>
+    <w:p>
+      <w:pPr>
+        <w:spacing w:after="40"/>
+        <w:ind w:left="432"/>
+      </w:pPr>
+      <w:r>
+        <w:rPr>
+          <w:i w:val="0"/>
+          <w:color w:val="111111"/>
+          <w:sz w:val="20"/>
+        </w:rPr>
+        <w:t>Did every complaint come back, and were the written rules followed?</w:t>
+      </w:r>
+    </w:p>
+    <w:p>
+      <w:pPr>
+        <w:spacing w:after="40"/>
+        <w:ind w:left="864"/>
+      </w:pPr>
+      <w:r>
+        <w:rPr>
+          <w:i/>
+          <w:color w:val="555555"/>
+          <w:sz w:val="20"/>
+        </w:rPr>
+        <w:t>Yes. Nothing was dropped and no rule was broken.</w:t>
+      </w:r>
+    </w:p>
+    <w:p>
+      <w:pPr>
+        <w:spacing w:after="40"/>
+        <w:ind w:left="0"/>
+      </w:pPr>
+      <w:r>
+        <w:rPr>
+          <w:i w:val="0"/>
+          <w:color w:val="111111"/>
+          <w:sz w:val="20"/>
+        </w:rPr>
+      </w:r>
+    </w:p>
+    <w:p>
+      <w:pPr>
+        <w:spacing w:after="40"/>
+        <w:ind w:left="432"/>
+      </w:pPr>
+      <w:r>
+        <w:rPr>
+          <w:i w:val="0"/>
+          <w:color w:val="111111"/>
+          <w:sz w:val="20"/>
+        </w:rPr>
+        <w:t>Were the reasons it gave actually true?</w:t>
+      </w:r>
+    </w:p>
+    <w:p>
+      <w:pPr>
+        <w:spacing w:after="40"/>
+        <w:ind w:left="864"/>
+      </w:pPr>
+      <w:r>
+        <w:rPr>
+          <w:i/>
+          <w:color w:val="555555"/>
+          <w:sz w:val="20"/>
+        </w:rPr>
+        <w:t>Yes. Every reason matched the numbers we hold.</w:t>
+      </w:r>
+    </w:p>
+    <w:p>
+      <w:pPr>
+        <w:spacing w:after="40"/>
+        <w:ind w:left="0"/>
+      </w:pPr>
+      <w:r>
+        <w:rPr>
+          <w:i w:val="0"/>
+          <w:color w:val="111111"/>
+          <w:sz w:val="20"/>
+        </w:rPr>
+      </w:r>
+    </w:p>
+    <w:p>
+      <w:pPr>
+        <w:spacing w:after="40"/>
+        <w:ind w:left="432"/>
+      </w:pPr>
+      <w:r>
+        <w:rPr>
+          <w:i w:val="0"/>
+          <w:color w:val="111111"/>
+          <w:sz w:val="20"/>
+        </w:rPr>
+        <w:t>How solid was the answer? One number was changed at a time and everything ranked again, to see which places were close calls.</w:t>
+      </w:r>
+    </w:p>
+    <w:p>
+      <w:pPr>
+        <w:spacing w:after="40"/>
+        <w:ind w:left="864"/>
+      </w:pPr>
+      <w:r>
+        <w:rPr>
+          <w:i w:val="0"/>
+          <w:color w:val="555555"/>
+          <w:sz w:val="18"/>
+        </w:rPr>
+        <w:t>NEW-00001  fairly solid  (2 of 7 small changes move it)</w:t>
+      </w:r>
+    </w:p>
+    <w:p>
+      <w:pPr>
+        <w:spacing w:after="40"/>
+        <w:ind w:left="1296"/>
+      </w:pPr>
+      <w:r>
+        <w:rPr>
+          <w:i/>
+          <w:color w:val="555555"/>
+          <w:sz w:val="18"/>
+        </w:rPr>
+        <w:t>if 3357 people were affected, not 1676, it moves from 4 to 1</w:t>
+      </w:r>
+    </w:p>
+    <w:p>
+      <w:pPr>
+        <w:spacing w:after="40"/>
+        <w:ind w:left="1296"/>
+      </w:pPr>
+      <w:r>
+        <w:rPr>
+          <w:i/>
+          <w:color w:val="555555"/>
+          <w:sz w:val="18"/>
+        </w:rPr>
+        <w:t>if we had a quarter less time left than we thought, it moves from 4 to 2</w:t>
+      </w:r>
+    </w:p>
+    <w:p>
+      <w:pPr>
+        <w:spacing w:after="40"/>
+        <w:ind w:left="864"/>
+      </w:pPr>
+      <w:r>
+        <w:rPr>
+          <w:i w:val="0"/>
+          <w:color w:val="555555"/>
+          <w:sz w:val="18"/>
+        </w:rPr>
+        <w:t>NEW-00002  fairly solid  (1 of 7 small changes move it)</w:t>
+      </w:r>
+    </w:p>
+    <w:p>
+      <w:pPr>
+        <w:spacing w:after="40"/>
+        <w:ind w:left="1296"/>
+      </w:pPr>
+      <w:r>
+        <w:rPr>
+          <w:i/>
+          <w:color w:val="555555"/>
+          <w:sz w:val="18"/>
+        </w:rPr>
+        <w:t>if work was blocked after all, it moves from 5 to 2</w:t>
+      </w:r>
+    </w:p>
+    <w:p>
+      <w:pPr>
+        <w:spacing w:after="40"/>
+        <w:ind w:left="864"/>
+      </w:pPr>
+      <w:r>
+        <w:rPr>
+          <w:i w:val="0"/>
+          <w:color w:val="555555"/>
+          <w:sz w:val="18"/>
+        </w:rPr>
+        <w:t>NEW-00003  fairly solid  (2 of 7 small changes move it)</w:t>
+      </w:r>
+    </w:p>
+    <w:p>
+      <w:pPr>
+        <w:spacing w:after="40"/>
+        <w:ind w:left="1296"/>
+      </w:pPr>
+      <w:r>
+        <w:rPr>
+          <w:i/>
+          <w:color w:val="555555"/>
+          <w:sz w:val="18"/>
+        </w:rPr>
+        <w:t>if only 1013 people were affected, not 2026, it moves from 1 to 2</w:t>
+      </w:r>
+    </w:p>
+    <w:p>
+      <w:pPr>
+        <w:spacing w:after="40"/>
+        <w:ind w:left="1296"/>
+      </w:pPr>
+      <w:r>
+        <w:rPr>
+          <w:i/>
+          <w:color w:val="555555"/>
+          <w:sz w:val="18"/>
+        </w:rPr>
+        <w:t>if work was not actually blocked, it moves from 1 to 2</w:t>
+      </w:r>
+    </w:p>
+    <w:p>
+      <w:pPr>
+        <w:spacing w:after="40"/>
+        <w:ind w:left="864"/>
+      </w:pPr>
+      <w:r>
+        <w:rPr>
+          <w:i w:val="0"/>
+          <w:color w:val="555555"/>
+          <w:sz w:val="18"/>
+        </w:rPr>
+        <w:t>NEW-00004  shaky  (3 of 7 small changes move it)</w:t>
+      </w:r>
+    </w:p>
+    <w:p>
+      <w:pPr>
+        <w:spacing w:after="40"/>
+        <w:ind w:left="1296"/>
+      </w:pPr>
+      <w:r>
+        <w:rPr>
+          <w:i/>
+          <w:color w:val="555555"/>
+          <w:sz w:val="18"/>
+        </w:rPr>
+        <w:t>if 9 people were affected, not 2, it moves from 3 to 2</w:t>
+      </w:r>
+    </w:p>
+    <w:p>
+      <w:pPr>
+        <w:spacing w:after="40"/>
+        <w:ind w:left="1296"/>
+      </w:pPr>
+      <w:r>
+        <w:rPr>
+          <w:i/>
+          <w:color w:val="555555"/>
+          <w:sz w:val="18"/>
+        </w:rPr>
+        <w:t>if work was blocked after all, it moves from 3 to 1</w:t>
+      </w:r>
+    </w:p>
+    <w:p>
+      <w:pPr>
+        <w:spacing w:after="40"/>
+        <w:ind w:left="864"/>
+      </w:pPr>
+      <w:r>
+        <w:rPr>
+          <w:i w:val="0"/>
+          <w:color w:val="555555"/>
+          <w:sz w:val="18"/>
+        </w:rPr>
+        <w:t>NEW-00005  fairly solid  (1 of 6 small changes move it)</w:t>
+      </w:r>
+    </w:p>
+    <w:p>
+      <w:pPr>
+        <w:spacing w:after="40"/>
+        <w:ind w:left="1296"/>
+      </w:pPr>
+      <w:r>
+        <w:rPr>
+          <w:i/>
+          <w:color w:val="555555"/>
+          <w:sz w:val="18"/>
+        </w:rPr>
+        <w:t>if this customer pays us £20,000 a month more than recorded, it moves from 2 to 1</w:t>
+      </w:r>
+    </w:p>
+    <w:p>
+      <w:pPr>
+        <w:spacing w:before="240" w:after="60"/>
+      </w:pPr>
+      <w:r>
+        <w:rPr>
+          <w:b/>
+          <w:color w:val="6D28D9"/>
+          <w:sz w:val="23"/>
+        </w:rPr>
+        <w:t>Step 7   Hand them to a person</w:t>
+      </w:r>
+    </w:p>
+    <w:p>
+      <w:pPr>
+        <w:spacing w:after="40"/>
+        <w:ind w:left="432"/>
+      </w:pPr>
+      <w:r>
+        <w:rPr>
+          <w:i w:val="0"/>
+          <w:color w:val="555555"/>
+          <w:sz w:val="18"/>
+        </w:rPr>
+        <w:t>NEW-00001 goes to a person now</w:t>
+      </w:r>
+    </w:p>
+    <w:p>
+      <w:pPr>
+        <w:spacing w:after="40"/>
+        <w:ind w:left="432"/>
+      </w:pPr>
+      <w:r>
+        <w:rPr>
+          <w:i w:val="0"/>
+          <w:color w:val="555555"/>
+          <w:sz w:val="18"/>
+        </w:rPr>
+        <w:t>NEW-00003 goes to a person next</w:t>
+      </w:r>
+    </w:p>
+    <w:p>
+      <w:pPr>
+        <w:spacing w:after="40"/>
+        <w:ind w:left="432"/>
+      </w:pPr>
+      <w:r>
+        <w:rPr>
+          <w:i w:val="0"/>
+          <w:color w:val="555555"/>
+          <w:sz w:val="18"/>
+        </w:rPr>
+        <w:t>NEW-00004 goes to a person next   (the numbers were not settled about this one)</w:t>
+      </w:r>
+    </w:p>
+    <w:p>
+      <w:pPr>
+        <w:spacing w:after="40"/>
+        <w:ind w:left="432"/>
+      </w:pPr>
+      <w:r>
+        <w:rPr>
+          <w:i w:val="0"/>
+          <w:color w:val="555555"/>
+          <w:sz w:val="18"/>
+        </w:rPr>
+        <w:t>NEW-00002 goes to a person queued</w:t>
+      </w:r>
+    </w:p>
+    <w:p>
+      <w:pPr>
+        <w:spacing w:after="40"/>
+        <w:ind w:left="432"/>
+      </w:pPr>
+      <w:r>
+        <w:rPr>
+          <w:i w:val="0"/>
+          <w:color w:val="555555"/>
+          <w:sz w:val="18"/>
+        </w:rPr>
+        <w:t>NEW-00005 goes to a person queued</w:t>
+      </w:r>
+    </w:p>
+    <w:p/>
+    <w:p>
+      <w:pPr>
+        <w:spacing w:after="200"/>
+      </w:pPr>
+      <w:r>
+        <w:rPr>
+          <w:color w:val="CCCCCC"/>
+        </w:rPr>
+        <w:t>______________________________________________________________________________</w:t>
+      </w:r>
+    </w:p>
+    <w:p>
+      <w:r>
+        <w:rPr>
+          <w:b/>
+          <w:color w:val="4C1D95"/>
+          <w:sz w:val="30"/>
+        </w:rPr>
+        <w:t>Run on 16 August 2026 at 22:20:49</w:t>
+      </w:r>
+    </w:p>
+    <w:p>
+      <w:pPr>
+        <w:spacing w:after="40"/>
+        <w:ind w:left="0"/>
+      </w:pPr>
+      <w:r>
+        <w:rPr>
+          <w:i/>
+          <w:color w:val="555555"/>
+          <w:sz w:val="18"/>
+        </w:rPr>
+        <w:t>Recorded as DEC-20260816-222049</w:t>
+      </w:r>
+    </w:p>
+    <w:p>
+      <w:pPr>
+        <w:spacing w:before="240" w:after="60"/>
+      </w:pPr>
+      <w:r>
+        <w:rPr>
+          <w:b/>
+          <w:color w:val="6D28D9"/>
+          <w:sz w:val="23"/>
+        </w:rPr>
+        <w:t>Step 1   Pick up the waiting complaints</w:t>
+      </w:r>
+    </w:p>
+    <w:p>
+      <w:pPr>
+        <w:spacing w:after="40"/>
+        <w:ind w:left="0"/>
+      </w:pPr>
+      <w:r>
+        <w:rPr>
+          <w:i w:val="0"/>
+          <w:color w:val="111111"/>
+          <w:sz w:val="20"/>
+        </w:rPr>
+        <w:t>5 complaints were waiting.</w:t>
+      </w:r>
+    </w:p>
+    <w:p>
+      <w:pPr>
+        <w:spacing w:after="40"/>
+        <w:ind w:left="432"/>
+      </w:pPr>
+      <w:r>
+        <w:rPr>
+          <w:i w:val="0"/>
+          <w:color w:val="555555"/>
+          <w:sz w:val="18"/>
+        </w:rPr>
+        <w:t>NEW-00001   Team locked out</w:t>
+      </w:r>
+    </w:p>
+    <w:p>
+      <w:pPr>
+        <w:spacing w:after="40"/>
+        <w:ind w:left="432"/>
+      </w:pPr>
+      <w:r>
+        <w:rPr>
+          <w:i w:val="0"/>
+          <w:color w:val="555555"/>
+          <w:sz w:val="18"/>
+        </w:rPr>
+        <w:t>NEW-00002   Customer data deletion request</w:t>
+      </w:r>
+    </w:p>
+    <w:p>
+      <w:pPr>
+        <w:spacing w:after="40"/>
+        <w:ind w:left="432"/>
+      </w:pPr>
+      <w:r>
+        <w:rPr>
+          <w:i w:val="0"/>
+          <w:color w:val="555555"/>
+          <w:sz w:val="18"/>
+        </w:rPr>
+        <w:t>NEW-00003   Payments failing at checkout</w:t>
+      </w:r>
+    </w:p>
+    <w:p>
+      <w:pPr>
+        <w:spacing w:after="40"/>
+        <w:ind w:left="432"/>
+      </w:pPr>
+      <w:r>
+        <w:rPr>
+          <w:i w:val="0"/>
+          <w:color w:val="555555"/>
+          <w:sz w:val="18"/>
+        </w:rPr>
+        <w:t>NEW-00004   Unknown device session</w:t>
+      </w:r>
+    </w:p>
+    <w:p>
+      <w:pPr>
+        <w:spacing w:after="40"/>
+        <w:ind w:left="432"/>
+      </w:pPr>
+      <w:r>
+        <w:rPr>
+          <w:i w:val="0"/>
+          <w:color w:val="555555"/>
+          <w:sz w:val="18"/>
+        </w:rPr>
+        <w:t>NEW-00005   Dashboard showing outdated data</w:t>
+      </w:r>
+    </w:p>
+    <w:p>
+      <w:pPr>
+        <w:spacing w:before="240" w:after="60"/>
+      </w:pPr>
+      <w:r>
+        <w:rPr>
+          <w:b/>
+          <w:color w:val="6D28D9"/>
+          <w:sz w:val="23"/>
+        </w:rPr>
+        <w:t>Step 2   Look up the three separate systems</w:t>
+      </w:r>
+    </w:p>
+    <w:p>
+      <w:pPr>
+        <w:spacing w:after="40"/>
+        <w:ind w:left="0"/>
+      </w:pPr>
+      <w:r>
+        <w:rPr>
+          <w:i w:val="0"/>
+          <w:color w:val="111111"/>
+          <w:sz w:val="20"/>
+        </w:rPr>
+        <w:t>Each system knows a different part of the story, and none of them can see what the others see.</w:t>
+      </w:r>
+    </w:p>
+    <w:p>
+      <w:pPr>
+        <w:spacing w:after="40"/>
+        <w:ind w:left="432"/>
+      </w:pPr>
+      <w:r>
+        <w:rPr>
+          <w:i w:val="0"/>
+          <w:color w:val="555555"/>
+          <w:sz w:val="18"/>
+        </w:rPr>
+        <w:t>NEW-00001</w:t>
+      </w:r>
+    </w:p>
+    <w:p>
+      <w:pPr>
+        <w:spacing w:after="40"/>
+        <w:ind w:left="864"/>
+      </w:pPr>
+      <w:r>
+        <w:rPr>
+          <w:i w:val="0"/>
+          <w:color w:val="555555"/>
+          <w:sz w:val="18"/>
+        </w:rPr>
+        <w:t>Customer records say: Free plan, pays £0 a month, has asked 1 time</w:t>
+      </w:r>
+    </w:p>
+    <w:p>
+      <w:pPr>
+        <w:spacing w:after="40"/>
+        <w:ind w:left="864"/>
+      </w:pPr>
+      <w:r>
+        <w:rPr>
+          <w:i w:val="0"/>
+          <w:color w:val="555555"/>
+          <w:sz w:val="18"/>
+        </w:rPr>
+        <w:t>Monitoring says: Critical, 2860 people affected, work blocked: yes</w:t>
+      </w:r>
+    </w:p>
+    <w:p>
+      <w:pPr>
+        <w:spacing w:after="40"/>
+        <w:ind w:left="864"/>
+      </w:pPr>
+      <w:r>
+        <w:rPr>
+          <w:i w:val="0"/>
+          <w:color w:val="555555"/>
+          <w:sz w:val="18"/>
+        </w:rPr>
+        <w:t>The promise clock says: 72.0 hours promised, 2.9 left</w:t>
+      </w:r>
+    </w:p>
+    <w:p>
+      <w:pPr>
+        <w:spacing w:after="40"/>
+        <w:ind w:left="864"/>
+      </w:pPr>
+      <w:r>
+        <w:rPr>
+          <w:i w:val="0"/>
+          <w:color w:val="555555"/>
+          <w:sz w:val="18"/>
+        </w:rPr>
+        <w:t>The customer themselves said: Critical</w:t>
+      </w:r>
+    </w:p>
+    <w:p>
+      <w:pPr>
+        <w:spacing w:after="40"/>
+        <w:ind w:left="432"/>
+      </w:pPr>
+      <w:r>
+        <w:rPr>
+          <w:i w:val="0"/>
+          <w:color w:val="555555"/>
+          <w:sz w:val="18"/>
+        </w:rPr>
+        <w:t>NEW-00002</w:t>
+      </w:r>
+    </w:p>
+    <w:p>
+      <w:pPr>
+        <w:spacing w:after="40"/>
+        <w:ind w:left="864"/>
+      </w:pPr>
+      <w:r>
+        <w:rPr>
+          <w:i w:val="0"/>
+          <w:color w:val="555555"/>
+          <w:sz w:val="18"/>
+        </w:rPr>
+        <w:t>Customer records say: Free plan, pays £0 a month, has asked 1 time</w:t>
+      </w:r>
+    </w:p>
+    <w:p>
+      <w:pPr>
+        <w:spacing w:after="40"/>
+        <w:ind w:left="864"/>
+      </w:pPr>
+      <w:r>
+        <w:rPr>
+          <w:i w:val="0"/>
+          <w:color w:val="555555"/>
+          <w:sz w:val="18"/>
+        </w:rPr>
+        <w:t>Monitoring says: Low, 1 person affected, work blocked: no</w:t>
+      </w:r>
+    </w:p>
+    <w:p>
+      <w:pPr>
+        <w:spacing w:after="40"/>
+        <w:ind w:left="864"/>
+      </w:pPr>
+      <w:r>
+        <w:rPr>
+          <w:i w:val="0"/>
+          <w:color w:val="555555"/>
+          <w:sz w:val="18"/>
+        </w:rPr>
+        <w:t>The promise clock says: 72.0 hours promised, 12.0 left</w:t>
+      </w:r>
+    </w:p>
+    <w:p>
+      <w:pPr>
+        <w:spacing w:after="40"/>
+        <w:ind w:left="864"/>
+      </w:pPr>
+      <w:r>
+        <w:rPr>
+          <w:i w:val="0"/>
+          <w:color w:val="555555"/>
+          <w:sz w:val="18"/>
+        </w:rPr>
+        <w:t>The customer themselves said: High</w:t>
+      </w:r>
+    </w:p>
+    <w:p>
+      <w:pPr>
+        <w:spacing w:after="40"/>
+        <w:ind w:left="432"/>
+      </w:pPr>
+      <w:r>
+        <w:rPr>
+          <w:i w:val="0"/>
+          <w:color w:val="555555"/>
+          <w:sz w:val="18"/>
+        </w:rPr>
+        <w:t>NEW-00003</w:t>
+      </w:r>
+    </w:p>
+    <w:p>
+      <w:pPr>
+        <w:spacing w:after="40"/>
+        <w:ind w:left="864"/>
+      </w:pPr>
+      <w:r>
+        <w:rPr>
+          <w:i w:val="0"/>
+          <w:color w:val="555555"/>
+          <w:sz w:val="18"/>
+        </w:rPr>
+        <w:t>Customer records say: Free plan, pays £0 a month, has asked 1 time</w:t>
+      </w:r>
+    </w:p>
+    <w:p>
+      <w:pPr>
+        <w:spacing w:after="40"/>
+        <w:ind w:left="864"/>
+      </w:pPr>
+      <w:r>
+        <w:rPr>
+          <w:i w:val="0"/>
+          <w:color w:val="555555"/>
+          <w:sz w:val="18"/>
+        </w:rPr>
+        <w:t>Monitoring says: Critical, 1306 people affected, work blocked: yes</w:t>
+      </w:r>
+    </w:p>
+    <w:p>
+      <w:pPr>
+        <w:spacing w:after="40"/>
+        <w:ind w:left="864"/>
+      </w:pPr>
+      <w:r>
+        <w:rPr>
+          <w:i w:val="0"/>
+          <w:color w:val="555555"/>
+          <w:sz w:val="18"/>
+        </w:rPr>
+        <w:t>The promise clock says: 72.0 hours promised, 48.3 left</w:t>
+      </w:r>
+    </w:p>
+    <w:p>
+      <w:pPr>
+        <w:spacing w:after="40"/>
+        <w:ind w:left="864"/>
+      </w:pPr>
+      <w:r>
+        <w:rPr>
+          <w:i w:val="0"/>
+          <w:color w:val="555555"/>
+          <w:sz w:val="18"/>
+        </w:rPr>
+        <w:t>The customer themselves said: High</w:t>
+      </w:r>
+    </w:p>
+    <w:p>
+      <w:pPr>
+        <w:spacing w:after="40"/>
+        <w:ind w:left="432"/>
+      </w:pPr>
+      <w:r>
+        <w:rPr>
+          <w:i w:val="0"/>
+          <w:color w:val="555555"/>
+          <w:sz w:val="18"/>
+        </w:rPr>
+        <w:t>NEW-00004</w:t>
+      </w:r>
+    </w:p>
+    <w:p>
+      <w:pPr>
+        <w:spacing w:after="40"/>
+        <w:ind w:left="864"/>
+      </w:pPr>
+      <w:r>
+        <w:rPr>
+          <w:i w:val="0"/>
+          <w:color w:val="555555"/>
+          <w:sz w:val="18"/>
+        </w:rPr>
+        <w:t>Customer records say: Free plan, pays £0 a month, has asked 1 time</w:t>
+      </w:r>
+    </w:p>
+    <w:p>
+      <w:pPr>
+        <w:spacing w:after="40"/>
+        <w:ind w:left="864"/>
+      </w:pPr>
+      <w:r>
+        <w:rPr>
+          <w:i w:val="0"/>
+          <w:color w:val="555555"/>
+          <w:sz w:val="18"/>
+        </w:rPr>
+        <w:t>Monitoring says: Low, 1 person affected, work blocked: no</w:t>
+      </w:r>
+    </w:p>
+    <w:p>
+      <w:pPr>
+        <w:spacing w:after="40"/>
+        <w:ind w:left="864"/>
+      </w:pPr>
+      <w:r>
+        <w:rPr>
+          <w:i w:val="0"/>
+          <w:color w:val="555555"/>
+          <w:sz w:val="18"/>
+        </w:rPr>
+        <w:t>The promise clock says: 72.0 hours promised, 61.6 left</w:t>
+      </w:r>
+    </w:p>
+    <w:p>
+      <w:pPr>
+        <w:spacing w:after="40"/>
+        <w:ind w:left="864"/>
+      </w:pPr>
+      <w:r>
+        <w:rPr>
+          <w:i w:val="0"/>
+          <w:color w:val="555555"/>
+          <w:sz w:val="18"/>
+        </w:rPr>
+        <w:t>The customer themselves said: Low</w:t>
+      </w:r>
+    </w:p>
+    <w:p>
+      <w:pPr>
+        <w:spacing w:after="40"/>
+        <w:ind w:left="432"/>
+      </w:pPr>
+      <w:r>
+        <w:rPr>
+          <w:i w:val="0"/>
+          <w:color w:val="555555"/>
+          <w:sz w:val="18"/>
+        </w:rPr>
+        <w:t>NEW-00005</w:t>
+      </w:r>
+    </w:p>
+    <w:p>
+      <w:pPr>
+        <w:spacing w:after="40"/>
+        <w:ind w:left="864"/>
+      </w:pPr>
+      <w:r>
+        <w:rPr>
+          <w:i w:val="0"/>
+          <w:color w:val="555555"/>
+          <w:sz w:val="18"/>
+        </w:rPr>
+        <w:t>Customer records say: Free plan, pays £0 a month, has asked 1 time</w:t>
+      </w:r>
+    </w:p>
+    <w:p>
+      <w:pPr>
+        <w:spacing w:after="40"/>
+        <w:ind w:left="864"/>
+      </w:pPr>
+      <w:r>
+        <w:rPr>
+          <w:i w:val="0"/>
+          <w:color w:val="555555"/>
+          <w:sz w:val="18"/>
+        </w:rPr>
+        <w:t>Monitoring says: Low, 16 people affected, work blocked: no</w:t>
+      </w:r>
+    </w:p>
+    <w:p>
+      <w:pPr>
+        <w:spacing w:after="40"/>
+        <w:ind w:left="864"/>
+      </w:pPr>
+      <w:r>
+        <w:rPr>
+          <w:i w:val="0"/>
+          <w:color w:val="555555"/>
+          <w:sz w:val="18"/>
+        </w:rPr>
+        <w:t>The promise clock says: 72.0 hours promised, 62.2 left</w:t>
+      </w:r>
+    </w:p>
+    <w:p>
+      <w:pPr>
+        <w:spacing w:after="40"/>
+        <w:ind w:left="864"/>
+      </w:pPr>
+      <w:r>
+        <w:rPr>
+          <w:i w:val="0"/>
+          <w:color w:val="555555"/>
+          <w:sz w:val="18"/>
+        </w:rPr>
+        <w:t>The customer themselves said: High</w:t>
+      </w:r>
+    </w:p>
+    <w:p>
+      <w:pPr>
+        <w:spacing w:before="240" w:after="60"/>
+      </w:pPr>
+      <w:r>
+        <w:rPr>
+          <w:b/>
+          <w:color w:val="6D28D9"/>
+          <w:sz w:val="23"/>
+        </w:rPr>
+        <w:t>Step 3   Rank them four different ways</w:t>
+      </w:r>
+    </w:p>
+    <w:p>
+      <w:pPr>
+        <w:spacing w:after="40"/>
+        <w:ind w:left="0"/>
+      </w:pPr>
+      <w:r>
+        <w:rPr>
+          <w:i w:val="0"/>
+          <w:color w:val="111111"/>
+          <w:sz w:val="20"/>
+        </w:rPr>
+        <w:t>Each way is reasonable on its own, and each one is wrong on its own. They are evidence for the agent to weigh, not instructions to follow.</w:t>
+      </w:r>
+    </w:p>
+    <w:p>
+      <w:pPr>
+        <w:spacing w:after="40"/>
+        <w:ind w:left="432"/>
+      </w:pPr>
+      <w:r>
+        <w:rPr>
+          <w:i w:val="0"/>
+          <w:color w:val="555555"/>
+          <w:sz w:val="18"/>
+        </w:rPr>
+        <w:t>By money:  1. NEW-00001  2. NEW-00002  3. NEW-00003  4. NEW-00004  5. NEW-00005</w:t>
+      </w:r>
+    </w:p>
+    <w:p>
+      <w:pPr>
+        <w:spacing w:after="40"/>
+        <w:ind w:left="432"/>
+      </w:pPr>
+      <w:r>
+        <w:rPr>
+          <w:i w:val="0"/>
+          <w:color w:val="555555"/>
+          <w:sz w:val="18"/>
+        </w:rPr>
+        <w:t>By damage:  1. NEW-00001  2. NEW-00003  3. NEW-00005  4. NEW-00002  5. NEW-00004</w:t>
+      </w:r>
+    </w:p>
+    <w:p>
+      <w:pPr>
+        <w:spacing w:after="40"/>
+        <w:ind w:left="432"/>
+      </w:pPr>
+      <w:r>
+        <w:rPr>
+          <w:i w:val="0"/>
+          <w:color w:val="555555"/>
+          <w:sz w:val="18"/>
+        </w:rPr>
+        <w:t>By deadline:  1. NEW-00001  2. NEW-00002  3. NEW-00003  4. NEW-00004  5. NEW-00005</w:t>
+      </w:r>
+    </w:p>
+    <w:p>
+      <w:pPr>
+        <w:spacing w:after="40"/>
+        <w:ind w:left="432"/>
+      </w:pPr>
+      <w:r>
+        <w:rPr>
+          <w:i w:val="0"/>
+          <w:color w:val="555555"/>
+          <w:sz w:val="18"/>
+        </w:rPr>
+        <w:t>By fairness:  1. NEW-00001  2. NEW-00002  3. NEW-00003  4. NEW-00004  5. NEW-00005</w:t>
+      </w:r>
+    </w:p>
+    <w:p>
+      <w:pPr>
+        <w:spacing w:after="40"/>
+        <w:ind w:left="0"/>
+      </w:pPr>
+      <w:r>
+        <w:rPr>
+          <w:i w:val="0"/>
+          <w:color w:val="111111"/>
+          <w:sz w:val="20"/>
+        </w:rPr>
+      </w:r>
+    </w:p>
+    <w:p>
+      <w:pPr>
+        <w:spacing w:after="40"/>
+        <w:ind w:left="432"/>
+      </w:pPr>
+      <w:r>
+        <w:rPr>
+          <w:i w:val="0"/>
+          <w:color w:val="111111"/>
+          <w:sz w:val="20"/>
+        </w:rPr>
+        <w:t>Where the four disagreed most:</w:t>
+      </w:r>
+    </w:p>
+    <w:p>
+      <w:pPr>
+        <w:spacing w:before="240" w:after="60"/>
+      </w:pPr>
+      <w:r>
+        <w:rPr>
+          <w:b/>
+          <w:color w:val="6D28D9"/>
+          <w:sz w:val="23"/>
+        </w:rPr>
+        <w:t>Step 4   Read what the customer actually wrote</w:t>
+      </w:r>
+    </w:p>
+    <w:p>
+      <w:pPr>
+        <w:spacing w:after="40"/>
+        <w:ind w:left="0"/>
+      </w:pPr>
+      <w:r>
+        <w:rPr>
+          <w:i w:val="0"/>
+          <w:color w:val="111111"/>
+          <w:sz w:val="20"/>
+        </w:rPr>
+        <w:t>The four ways above only look at numbers, so they cannot tell a password reset apart from a break-in. Both look like one person with nothing failing. The words are the difference.</w:t>
+      </w:r>
+    </w:p>
+    <w:p>
+      <w:pPr>
+        <w:spacing w:after="40"/>
+        <w:ind w:left="432"/>
+      </w:pPr>
+      <w:r>
+        <w:rPr>
+          <w:i w:val="0"/>
+          <w:color w:val="555555"/>
+          <w:sz w:val="18"/>
+        </w:rPr>
+        <w:t>NEW-00001: “our whole team is locked out. nobody can get in since about 6am. we have a client demo at 10 and I don't know what to tell them”</w:t>
+      </w:r>
+    </w:p>
+    <w:p>
+      <w:pPr>
+        <w:spacing w:after="40"/>
+        <w:ind w:left="432"/>
+      </w:pPr>
+      <w:r>
+        <w:rPr>
+          <w:i w:val="0"/>
+          <w:color w:val="555555"/>
+          <w:sz w:val="18"/>
+        </w:rPr>
+        <w:t>NEW-00002: “I need to flag something. one of our customers has asked us to delete everything we hold on them. I believe there's a legal time limit on this and we're already a few days in”</w:t>
+      </w:r>
+    </w:p>
+    <w:p>
+      <w:pPr>
+        <w:spacing w:after="40"/>
+        <w:ind w:left="432"/>
+      </w:pPr>
+      <w:r>
+        <w:rPr>
+          <w:i w:val="0"/>
+          <w:color w:val="555555"/>
+          <w:sz w:val="18"/>
+        </w:rPr>
+        <w:t>NEW-00003: “payments are failing at checkout. we've had maybe forty customers email us this morning saying their card was declined. our own test card fails too”</w:t>
+      </w:r>
+    </w:p>
+    <w:p>
+      <w:pPr>
+        <w:spacing w:after="40"/>
+        <w:ind w:left="432"/>
+      </w:pPr>
+      <w:r>
+        <w:rPr>
+          <w:i w:val="0"/>
+          <w:color w:val="555555"/>
+          <w:sz w:val="18"/>
+        </w:rPr>
+        <w:t>NEW-00004: “there is a session logged in from a device we don't recognise and I can't work out how to end it. probably nothing but thought I should mention it”</w:t>
+      </w:r>
+    </w:p>
+    <w:p>
+      <w:pPr>
+        <w:spacing w:after="40"/>
+        <w:ind w:left="432"/>
+      </w:pPr>
+      <w:r>
+        <w:rPr>
+          <w:i w:val="0"/>
+          <w:color w:val="555555"/>
+          <w:sz w:val="18"/>
+        </w:rPr>
+        <w:t>NEW-00005: “ABSOLUTELY UNACCEPTABLE. our dashboard chart is showing last month's figures. we pay you thousands every month and I expect better than this. I want someone to call me today”</w:t>
+      </w:r>
+    </w:p>
+    <w:p>
+      <w:pPr>
+        <w:spacing w:before="240" w:after="60"/>
+      </w:pPr>
+      <w:r>
+        <w:rPr>
+          <w:b/>
+          <w:color w:val="6D28D9"/>
+          <w:sz w:val="23"/>
+        </w:rPr>
+        <w:t>Step 5   The AI decides, and says why</w:t>
+      </w:r>
+    </w:p>
+    <w:p>
+      <w:pPr>
+        <w:spacing w:after="40"/>
+        <w:ind w:left="432"/>
+      </w:pPr>
+      <w:r>
+        <w:rPr>
+          <w:i w:val="0"/>
+          <w:color w:val="111111"/>
+          <w:sz w:val="20"/>
+        </w:rPr>
+        <w:t>1. NEW-00001   Team locked out</w:t>
+      </w:r>
+    </w:p>
+    <w:p>
+      <w:pPr>
+        <w:spacing w:after="40"/>
+        <w:ind w:left="864"/>
+      </w:pPr>
+      <w:r>
+        <w:rPr>
+          <w:i/>
+          <w:color w:val="555555"/>
+          <w:sz w:val="20"/>
+        </w:rPr>
+        <w:t>Critical lockout affecting thousands and blocking work with only 2.9 h left makes it top priority.</w:t>
+      </w:r>
+    </w:p>
+    <w:p>
+      <w:pPr>
+        <w:spacing w:after="40"/>
+        <w:ind w:left="432"/>
+      </w:pPr>
+      <w:r>
+        <w:rPr>
+          <w:i w:val="0"/>
+          <w:color w:val="111111"/>
+          <w:sz w:val="20"/>
+        </w:rPr>
+        <w:t>2. NEW-00003   Payments failing at checkout</w:t>
+      </w:r>
+    </w:p>
+    <w:p>
+      <w:pPr>
+        <w:spacing w:after="40"/>
+        <w:ind w:left="864"/>
+      </w:pPr>
+      <w:r>
+        <w:rPr>
+          <w:i/>
+          <w:color w:val="555555"/>
+          <w:sz w:val="20"/>
+        </w:rPr>
+        <w:t>Payments failing blocks revenue for over a thousand users and is critical, though deadline is farther out.</w:t>
+      </w:r>
+    </w:p>
+    <w:p>
+      <w:pPr>
+        <w:spacing w:after="40"/>
+        <w:ind w:left="432"/>
+      </w:pPr>
+      <w:r>
+        <w:rPr>
+          <w:i w:val="0"/>
+          <w:color w:val="111111"/>
+          <w:sz w:val="20"/>
+        </w:rPr>
+        <w:t>3. NEW-00004   Unknown device session</w:t>
+      </w:r>
+    </w:p>
+    <w:p>
+      <w:pPr>
+        <w:spacing w:after="40"/>
+        <w:ind w:left="864"/>
+      </w:pPr>
+      <w:r>
+        <w:rPr>
+          <w:i/>
+          <w:color w:val="555555"/>
+          <w:sz w:val="20"/>
+        </w:rPr>
+        <w:t>Potential security breach triggers policy requiring at‑least top‑3 placement despite low monitored severity.</w:t>
+      </w:r>
+    </w:p>
+    <w:p>
+      <w:pPr>
+        <w:spacing w:after="40"/>
+        <w:ind w:left="432"/>
+      </w:pPr>
+      <w:r>
+        <w:rPr>
+          <w:i w:val="0"/>
+          <w:color w:val="111111"/>
+          <w:sz w:val="20"/>
+        </w:rPr>
+        <w:t>4. NEW-00002   Customer data deletion request</w:t>
+      </w:r>
+    </w:p>
+    <w:p>
+      <w:pPr>
+        <w:spacing w:after="40"/>
+        <w:ind w:left="864"/>
+      </w:pPr>
+      <w:r>
+        <w:rPr>
+          <w:i/>
+          <w:color w:val="555555"/>
+          <w:sz w:val="20"/>
+        </w:rPr>
+        <w:t>Legal GDPR deletion request must be handled within the statutory window, so it ranks high.</w:t>
+      </w:r>
+    </w:p>
+    <w:p>
+      <w:pPr>
+        <w:spacing w:after="40"/>
+        <w:ind w:left="432"/>
+      </w:pPr>
+      <w:r>
+        <w:rPr>
+          <w:i w:val="0"/>
+          <w:color w:val="111111"/>
+          <w:sz w:val="20"/>
+        </w:rPr>
+        <w:t>5. NEW-00005   Dashboard showing outdated data</w:t>
+      </w:r>
+    </w:p>
+    <w:p>
+      <w:pPr>
+        <w:spacing w:after="40"/>
+        <w:ind w:left="864"/>
+      </w:pPr>
+      <w:r>
+        <w:rPr>
+          <w:i/>
+          <w:color w:val="555555"/>
+          <w:sz w:val="20"/>
+        </w:rPr>
+        <w:t>Dashboard showing stale data affects few users and is not blocked, so it stays last.</w:t>
+      </w:r>
+    </w:p>
+    <w:p>
+      <w:pPr>
+        <w:spacing w:after="40"/>
+        <w:ind w:left="0"/>
+      </w:pPr>
+      <w:r>
+        <w:rPr>
+          <w:i w:val="0"/>
+          <w:color w:val="111111"/>
+          <w:sz w:val="20"/>
+        </w:rPr>
+      </w:r>
+    </w:p>
+    <w:p>
+      <w:pPr>
+        <w:spacing w:after="40"/>
+        <w:ind w:left="432"/>
+      </w:pPr>
+      <w:r>
+        <w:rPr>
+          <w:i w:val="0"/>
+          <w:color w:val="111111"/>
+          <w:sz w:val="20"/>
+        </w:rPr>
+        <w:t>The trade-off it made:</w:t>
+      </w:r>
+    </w:p>
+    <w:p>
+      <w:pPr>
+        <w:spacing w:after="40"/>
+        <w:ind w:left="864"/>
+      </w:pPr>
+      <w:r>
+        <w:rPr>
+          <w:i/>
+          <w:color w:val="555555"/>
+          <w:sz w:val="20"/>
+        </w:rPr>
+        <w:t>We favored immediate business impact and security/legal compliance over fairness to free‑plan customers and monetary value. This sacrifices quicker service for paying customers, costing potential goodwill from high‑paying accounts.</w:t>
+      </w:r>
+    </w:p>
+    <w:p>
+      <w:pPr>
+        <w:spacing w:after="40"/>
+        <w:ind w:left="0"/>
+      </w:pPr>
+      <w:r>
+        <w:rPr>
+          <w:i w:val="0"/>
+          <w:color w:val="111111"/>
+          <w:sz w:val="20"/>
+        </w:rPr>
+      </w:r>
+    </w:p>
+    <w:p>
+      <w:pPr>
+        <w:spacing w:after="40"/>
+        <w:ind w:left="432"/>
+      </w:pPr>
+      <w:r>
+        <w:rPr>
+          <w:i w:val="0"/>
+          <w:color w:val="111111"/>
+          <w:sz w:val="20"/>
+        </w:rPr>
+        <w:t>The closest call:</w:t>
+      </w:r>
+    </w:p>
+    <w:p>
+      <w:pPr>
+        <w:spacing w:after="40"/>
+        <w:ind w:left="864"/>
+      </w:pPr>
+      <w:r>
+        <w:rPr>
+          <w:i/>
+          <w:color w:val="555555"/>
+          <w:sz w:val="20"/>
+        </w:rPr>
+        <w:t>Choosing between the security incident (NEW-00004) and the GDPR request (NEW-00002) was hardest; both have mandatory uplift rules and either could reasonably sit at position three.</w:t>
+      </w:r>
+    </w:p>
+    <w:p>
+      <w:pPr>
+        <w:spacing w:after="40"/>
+        <w:ind w:left="0"/>
+      </w:pPr>
+      <w:r>
+        <w:rPr>
+          <w:i w:val="0"/>
+          <w:color w:val="111111"/>
+          <w:sz w:val="20"/>
+        </w:rPr>
+      </w:r>
+    </w:p>
+    <w:p>
+      <w:pPr>
+        <w:spacing w:after="40"/>
+        <w:ind w:left="432"/>
+      </w:pPr>
+      <w:r>
+        <w:rPr>
+          <w:i w:val="0"/>
+          <w:color w:val="111111"/>
+          <w:sz w:val="20"/>
+        </w:rPr>
+        <w:t>How it ranked the four ways of deciding:</w:t>
+      </w:r>
+    </w:p>
+    <w:p>
+      <w:pPr>
+        <w:spacing w:after="40"/>
+        <w:ind w:left="864"/>
+      </w:pPr>
+      <w:r>
+        <w:rPr>
+          <w:i w:val="0"/>
+          <w:color w:val="111111"/>
+          <w:sz w:val="20"/>
+        </w:rPr>
+        <w:t>1. damage</w:t>
+      </w:r>
+    </w:p>
+    <w:p>
+      <w:pPr>
+        <w:spacing w:after="40"/>
+        <w:ind w:left="1296"/>
+      </w:pPr>
+      <w:r>
+        <w:rPr>
+          <w:i/>
+          <w:color w:val="555555"/>
+          <w:sz w:val="20"/>
+        </w:rPr>
+        <w:t>why here: User impact and work blockage are the clearest signs of business harm for this batch</w:t>
+      </w:r>
+    </w:p>
+    <w:p>
+      <w:pPr>
+        <w:spacing w:after="40"/>
+        <w:ind w:left="1296"/>
+      </w:pPr>
+      <w:r>
+        <w:rPr>
+          <w:i/>
+          <w:color w:val="555555"/>
+          <w:sz w:val="20"/>
+        </w:rPr>
+        <w:t>gets wrong: It can under‑weight legal deadlines that are critical regardless of user count</w:t>
+      </w:r>
+    </w:p>
+    <w:p>
+      <w:pPr>
+        <w:spacing w:after="40"/>
+        <w:ind w:left="864"/>
+      </w:pPr>
+      <w:r>
+        <w:rPr>
+          <w:i w:val="0"/>
+          <w:color w:val="111111"/>
+          <w:sz w:val="20"/>
+        </w:rPr>
+        <w:t>2. deadline</w:t>
+      </w:r>
+    </w:p>
+    <w:p>
+      <w:pPr>
+        <w:spacing w:after="40"/>
+        <w:ind w:left="1296"/>
+      </w:pPr>
+      <w:r>
+        <w:rPr>
+          <w:i/>
+          <w:color w:val="555555"/>
+          <w:sz w:val="20"/>
+        </w:rPr>
+        <w:t>why here: Time left before promised resolution directly drives urgency</w:t>
+      </w:r>
+    </w:p>
+    <w:p>
+      <w:pPr>
+        <w:spacing w:after="40"/>
+        <w:ind w:left="1296"/>
+      </w:pPr>
+      <w:r>
+        <w:rPr>
+          <w:i/>
+          <w:color w:val="555555"/>
+          <w:sz w:val="20"/>
+        </w:rPr>
+        <w:t>gets wrong: It ignores the scale of impact, so a far‑away deadline on a massive outage might be deprioritized</w:t>
+      </w:r>
+    </w:p>
+    <w:p>
+      <w:pPr>
+        <w:spacing w:after="40"/>
+        <w:ind w:left="864"/>
+      </w:pPr>
+      <w:r>
+        <w:rPr>
+          <w:i w:val="0"/>
+          <w:color w:val="111111"/>
+          <w:sz w:val="20"/>
+        </w:rPr>
+        <w:t>3. fairness</w:t>
+      </w:r>
+    </w:p>
+    <w:p>
+      <w:pPr>
+        <w:spacing w:after="40"/>
+        <w:ind w:left="1296"/>
+      </w:pPr>
+      <w:r>
+        <w:rPr>
+          <w:i/>
+          <w:color w:val="555555"/>
+          <w:sz w:val="20"/>
+        </w:rPr>
+        <w:t>why here: Ensures free‑plan customers with real problems are not pushed to the bottom</w:t>
+      </w:r>
+    </w:p>
+    <w:p>
+      <w:pPr>
+        <w:spacing w:after="40"/>
+        <w:ind w:left="1296"/>
+      </w:pPr>
+      <w:r>
+        <w:rPr>
+          <w:i/>
+          <w:color w:val="555555"/>
+          <w:sz w:val="20"/>
+        </w:rPr>
+        <w:t>gets wrong: May elevate low‑impact tickets above higher‑value ones</w:t>
+      </w:r>
+    </w:p>
+    <w:p>
+      <w:pPr>
+        <w:spacing w:after="40"/>
+        <w:ind w:left="864"/>
+      </w:pPr>
+      <w:r>
+        <w:rPr>
+          <w:i w:val="0"/>
+          <w:color w:val="111111"/>
+          <w:sz w:val="20"/>
+        </w:rPr>
+        <w:t>4. money</w:t>
+      </w:r>
+    </w:p>
+    <w:p>
+      <w:pPr>
+        <w:spacing w:after="40"/>
+        <w:ind w:left="1296"/>
+      </w:pPr>
+      <w:r>
+        <w:rPr>
+          <w:i/>
+          <w:color w:val="555555"/>
+          <w:sz w:val="20"/>
+        </w:rPr>
+        <w:t>why here: Revenue is least relevant when critical functionality is broken</w:t>
+      </w:r>
+    </w:p>
+    <w:p>
+      <w:pPr>
+        <w:spacing w:after="40"/>
+        <w:ind w:left="1296"/>
+      </w:pPr>
+      <w:r>
+        <w:rPr>
+          <w:i/>
+          <w:color w:val="555555"/>
+          <w:sz w:val="20"/>
+        </w:rPr>
+        <w:t>gets wrong: Could delay attention to high‑paying customers whose issues also affect revenue</w:t>
+      </w:r>
+    </w:p>
+    <w:p>
+      <w:pPr>
+        <w:spacing w:after="40"/>
+        <w:ind w:left="0"/>
+      </w:pPr>
+      <w:r>
+        <w:rPr>
+          <w:i w:val="0"/>
+          <w:color w:val="111111"/>
+          <w:sz w:val="20"/>
+        </w:rPr>
+      </w:r>
+    </w:p>
+    <w:p>
+      <w:pPr>
+        <w:spacing w:after="40"/>
+        <w:ind w:left="432"/>
+      </w:pPr>
+      <w:r>
+        <w:rPr>
+          <w:i w:val="0"/>
+          <w:color w:val="111111"/>
+          <w:sz w:val="20"/>
+        </w:rPr>
+        <w:t>Closest call between the four:</w:t>
+      </w:r>
+    </w:p>
+    <w:p>
+      <w:pPr>
+        <w:spacing w:after="40"/>
+        <w:ind w:left="864"/>
+      </w:pPr>
+      <w:r>
+        <w:rPr>
+          <w:i/>
+          <w:color w:val="555555"/>
+          <w:sz w:val="20"/>
+        </w:rPr>
+        <w:t>Damage outranked deadline because the tickets with the greatest user impact also happened to have the tightest time constraints, reinforcing the priority of impact over pure timing.</w:t>
+      </w:r>
+    </w:p>
+    <w:p>
+      <w:pPr>
+        <w:spacing w:before="240" w:after="60"/>
+      </w:pPr>
+      <w:r>
+        <w:rPr>
+          <w:b/>
+          <w:color w:val="6D28D9"/>
+          <w:sz w:val="23"/>
+        </w:rPr>
+        <w:t>Step 6   Check the answer before anything happens</w:t>
+      </w:r>
+    </w:p>
+    <w:p>
+      <w:pPr>
+        <w:spacing w:after="40"/>
+        <w:ind w:left="432"/>
+      </w:pPr>
+      <w:r>
+        <w:rPr>
+          <w:i w:val="0"/>
+          <w:color w:val="111111"/>
+          <w:sz w:val="20"/>
+        </w:rPr>
+        <w:t>Did every complaint come back, and were the written rules followed?</w:t>
+      </w:r>
+    </w:p>
+    <w:p>
+      <w:pPr>
+        <w:spacing w:after="40"/>
+        <w:ind w:left="864"/>
+      </w:pPr>
+      <w:r>
+        <w:rPr>
+          <w:i/>
+          <w:color w:val="555555"/>
+          <w:sz w:val="20"/>
+        </w:rPr>
+        <w:t>Yes. Nothing was dropped and no rule was broken.</w:t>
+      </w:r>
+    </w:p>
+    <w:p>
+      <w:pPr>
+        <w:spacing w:after="40"/>
+        <w:ind w:left="0"/>
+      </w:pPr>
+      <w:r>
+        <w:rPr>
+          <w:i w:val="0"/>
+          <w:color w:val="111111"/>
+          <w:sz w:val="20"/>
+        </w:rPr>
+      </w:r>
+    </w:p>
+    <w:p>
+      <w:pPr>
+        <w:spacing w:after="40"/>
+        <w:ind w:left="432"/>
+      </w:pPr>
+      <w:r>
+        <w:rPr>
+          <w:i w:val="0"/>
+          <w:color w:val="111111"/>
+          <w:sz w:val="20"/>
+        </w:rPr>
+        <w:t>Were the reasons it gave actually true?</w:t>
+      </w:r>
+    </w:p>
+    <w:p>
+      <w:pPr>
+        <w:spacing w:after="40"/>
+        <w:ind w:left="864"/>
+      </w:pPr>
+      <w:r>
+        <w:rPr>
+          <w:i/>
+          <w:color w:val="555555"/>
+          <w:sz w:val="20"/>
+        </w:rPr>
+        <w:t>Yes. Every reason matched the numbers we hold.</w:t>
+      </w:r>
+    </w:p>
+    <w:p>
+      <w:pPr>
+        <w:spacing w:after="40"/>
+        <w:ind w:left="0"/>
+      </w:pPr>
+      <w:r>
+        <w:rPr>
+          <w:i w:val="0"/>
+          <w:color w:val="111111"/>
+          <w:sz w:val="20"/>
+        </w:rPr>
+      </w:r>
+    </w:p>
+    <w:p>
+      <w:pPr>
+        <w:spacing w:after="40"/>
+        <w:ind w:left="432"/>
+      </w:pPr>
+      <w:r>
+        <w:rPr>
+          <w:i w:val="0"/>
+          <w:color w:val="111111"/>
+          <w:sz w:val="20"/>
+        </w:rPr>
+        <w:t>How solid was the answer? One number was changed at a time and everything ranked again, to see which places were close calls.</w:t>
+      </w:r>
+    </w:p>
+    <w:p>
+      <w:pPr>
+        <w:spacing w:after="40"/>
+        <w:ind w:left="864"/>
+      </w:pPr>
+      <w:r>
+        <w:rPr>
+          <w:i w:val="0"/>
+          <w:color w:val="555555"/>
+          <w:sz w:val="18"/>
+        </w:rPr>
+        <w:t>NEW-00001  solid  (0 of 6 small changes move it)</w:t>
+      </w:r>
+    </w:p>
+    <w:p>
+      <w:pPr>
+        <w:spacing w:after="40"/>
+        <w:ind w:left="864"/>
+      </w:pPr>
+      <w:r>
+        <w:rPr>
+          <w:i w:val="0"/>
+          <w:color w:val="555555"/>
+          <w:sz w:val="18"/>
+        </w:rPr>
+        <w:t>NEW-00002  fairly solid  (2 of 5 small changes move it)</w:t>
+      </w:r>
+    </w:p>
+    <w:p>
+      <w:pPr>
+        <w:spacing w:after="40"/>
+        <w:ind w:left="1296"/>
+      </w:pPr>
+      <w:r>
+        <w:rPr>
+          <w:i/>
+          <w:color w:val="555555"/>
+          <w:sz w:val="18"/>
+        </w:rPr>
+        <w:t>if work was blocked after all, it moves from 3 to 2</w:t>
+      </w:r>
+    </w:p>
+    <w:p>
+      <w:pPr>
+        <w:spacing w:after="40"/>
+        <w:ind w:left="1296"/>
+      </w:pPr>
+      <w:r>
+        <w:rPr>
+          <w:i/>
+          <w:color w:val="555555"/>
+          <w:sz w:val="18"/>
+        </w:rPr>
+        <w:t>if we had a quarter less time left than we thought, it moves from 3 to 2</w:t>
+      </w:r>
+    </w:p>
+    <w:p>
+      <w:pPr>
+        <w:spacing w:after="40"/>
+        <w:ind w:left="864"/>
+      </w:pPr>
+      <w:r>
+        <w:rPr>
+          <w:i w:val="0"/>
+          <w:color w:val="555555"/>
+          <w:sz w:val="18"/>
+        </w:rPr>
+        <w:t>NEW-00003  fairly solid  (1 of 6 small changes move it)</w:t>
+      </w:r>
+    </w:p>
+    <w:p>
+      <w:pPr>
+        <w:spacing w:after="40"/>
+        <w:ind w:left="1296"/>
+      </w:pPr>
+      <w:r>
+        <w:rPr>
+          <w:i/>
+          <w:color w:val="555555"/>
+          <w:sz w:val="18"/>
+        </w:rPr>
+        <w:t>if we had a quarter more time left than we thought, it moves from 2 to 3</w:t>
+      </w:r>
+    </w:p>
+    <w:p>
+      <w:pPr>
+        <w:spacing w:after="40"/>
+        <w:ind w:left="864"/>
+      </w:pPr>
+      <w:r>
+        <w:rPr>
+          <w:i w:val="0"/>
+          <w:color w:val="555555"/>
+          <w:sz w:val="18"/>
+        </w:rPr>
+        <w:t>NEW-00004  shaky  (4 of 5 small changes move it)</w:t>
+      </w:r>
+    </w:p>
+    <w:p>
+      <w:pPr>
+        <w:spacing w:after="40"/>
+        <w:ind w:left="1296"/>
+      </w:pPr>
+      <w:r>
+        <w:rPr>
+          <w:i/>
+          <w:color w:val="555555"/>
+          <w:sz w:val="18"/>
+        </w:rPr>
+        <w:t>if 7 people were affected, not 1, it moves from 5 to 4</w:t>
+      </w:r>
+    </w:p>
+    <w:p>
+      <w:pPr>
+        <w:spacing w:after="40"/>
+        <w:ind w:left="1296"/>
+      </w:pPr>
+      <w:r>
+        <w:rPr>
+          <w:i/>
+          <w:color w:val="555555"/>
+          <w:sz w:val="18"/>
+        </w:rPr>
+        <w:t>if work was blocked after all, it moves from 5 to 4</w:t>
+      </w:r>
+    </w:p>
+    <w:p>
+      <w:pPr>
+        <w:spacing w:after="40"/>
+        <w:ind w:left="864"/>
+      </w:pPr>
+      <w:r>
+        <w:rPr>
+          <w:i w:val="0"/>
+          <w:color w:val="555555"/>
+          <w:sz w:val="18"/>
+        </w:rPr>
+        <w:t>NEW-00005  solid  (0 of 6 small changes move it)</w:t>
+      </w:r>
+    </w:p>
+    <w:p>
+      <w:pPr>
+        <w:spacing w:before="240" w:after="60"/>
+      </w:pPr>
+      <w:r>
+        <w:rPr>
+          <w:b/>
+          <w:color w:val="6D28D9"/>
+          <w:sz w:val="23"/>
+        </w:rPr>
+        <w:t>Step 7   Hand them to a person</w:t>
+      </w:r>
+    </w:p>
+    <w:p>
+      <w:pPr>
+        <w:spacing w:after="40"/>
+        <w:ind w:left="432"/>
+      </w:pPr>
+      <w:r>
+        <w:rPr>
+          <w:i w:val="0"/>
+          <w:color w:val="555555"/>
+          <w:sz w:val="18"/>
+        </w:rPr>
+        <w:t>NEW-00001 goes to a person now</w:t>
+      </w:r>
+    </w:p>
+    <w:p>
+      <w:pPr>
+        <w:spacing w:after="40"/>
+        <w:ind w:left="432"/>
+      </w:pPr>
+      <w:r>
+        <w:rPr>
+          <w:i w:val="0"/>
+          <w:color w:val="555555"/>
+          <w:sz w:val="18"/>
+        </w:rPr>
+        <w:t>NEW-00003 goes to a person next</w:t>
+      </w:r>
+    </w:p>
+    <w:p>
+      <w:pPr>
+        <w:spacing w:after="40"/>
+        <w:ind w:left="432"/>
+      </w:pPr>
+      <w:r>
+        <w:rPr>
+          <w:i w:val="0"/>
+          <w:color w:val="555555"/>
+          <w:sz w:val="18"/>
+        </w:rPr>
+        <w:t>NEW-00004 goes to a person next   (the numbers were not settled about this one)</w:t>
+      </w:r>
+    </w:p>
+    <w:p>
+      <w:pPr>
+        <w:spacing w:after="40"/>
+        <w:ind w:left="432"/>
+      </w:pPr>
+      <w:r>
+        <w:rPr>
+          <w:i w:val="0"/>
+          <w:color w:val="555555"/>
+          <w:sz w:val="18"/>
+        </w:rPr>
+        <w:t>NEW-00002 goes to a person queued</w:t>
+      </w:r>
+    </w:p>
+    <w:p>
+      <w:pPr>
+        <w:spacing w:after="40"/>
+        <w:ind w:left="432"/>
+      </w:pPr>
+      <w:r>
+        <w:rPr>
+          <w:i w:val="0"/>
+          <w:color w:val="555555"/>
+          <w:sz w:val="18"/>
+        </w:rPr>
+        <w:t>NEW-00005 goes to a person queued</w:t>
       </w:r>
     </w:p>
     <w:p/>

</xml_diff>

<commit_message>
Explain why Docker was left out
</commit_message>
<xml_diff>
--- a/data/how_the_agent_thinks.docx
+++ b/data/how_the_agent_thinks.docx
@@ -18084,6 +18084,3046 @@
           <w:sz w:val="20"/>
         </w:rPr>
         <w:t>Damage outranked deadline because the tickets with the greatest user impact also happened to have the tightest time constraints, reinforcing the priority of impact over pure timing.</w:t>
+      </w:r>
+    </w:p>
+    <w:p>
+      <w:pPr>
+        <w:spacing w:before="240" w:after="60"/>
+      </w:pPr>
+      <w:r>
+        <w:rPr>
+          <w:b/>
+          <w:color w:val="6D28D9"/>
+          <w:sz w:val="23"/>
+        </w:rPr>
+        <w:t>Step 6   Check the answer before anything happens</w:t>
+      </w:r>
+    </w:p>
+    <w:p>
+      <w:pPr>
+        <w:spacing w:after="40"/>
+        <w:ind w:left="432"/>
+      </w:pPr>
+      <w:r>
+        <w:rPr>
+          <w:i w:val="0"/>
+          <w:color w:val="111111"/>
+          <w:sz w:val="20"/>
+        </w:rPr>
+        <w:t>Did every complaint come back, and were the written rules followed?</w:t>
+      </w:r>
+    </w:p>
+    <w:p>
+      <w:pPr>
+        <w:spacing w:after="40"/>
+        <w:ind w:left="864"/>
+      </w:pPr>
+      <w:r>
+        <w:rPr>
+          <w:i/>
+          <w:color w:val="555555"/>
+          <w:sz w:val="20"/>
+        </w:rPr>
+        <w:t>Yes. Nothing was dropped and no rule was broken.</w:t>
+      </w:r>
+    </w:p>
+    <w:p>
+      <w:pPr>
+        <w:spacing w:after="40"/>
+        <w:ind w:left="0"/>
+      </w:pPr>
+      <w:r>
+        <w:rPr>
+          <w:i w:val="0"/>
+          <w:color w:val="111111"/>
+          <w:sz w:val="20"/>
+        </w:rPr>
+      </w:r>
+    </w:p>
+    <w:p>
+      <w:pPr>
+        <w:spacing w:after="40"/>
+        <w:ind w:left="432"/>
+      </w:pPr>
+      <w:r>
+        <w:rPr>
+          <w:i w:val="0"/>
+          <w:color w:val="111111"/>
+          <w:sz w:val="20"/>
+        </w:rPr>
+        <w:t>Were the reasons it gave actually true?</w:t>
+      </w:r>
+    </w:p>
+    <w:p>
+      <w:pPr>
+        <w:spacing w:after="40"/>
+        <w:ind w:left="864"/>
+      </w:pPr>
+      <w:r>
+        <w:rPr>
+          <w:i/>
+          <w:color w:val="555555"/>
+          <w:sz w:val="20"/>
+        </w:rPr>
+        <w:t>Yes. Every reason matched the numbers we hold.</w:t>
+      </w:r>
+    </w:p>
+    <w:p>
+      <w:pPr>
+        <w:spacing w:after="40"/>
+        <w:ind w:left="0"/>
+      </w:pPr>
+      <w:r>
+        <w:rPr>
+          <w:i w:val="0"/>
+          <w:color w:val="111111"/>
+          <w:sz w:val="20"/>
+        </w:rPr>
+      </w:r>
+    </w:p>
+    <w:p>
+      <w:pPr>
+        <w:spacing w:after="40"/>
+        <w:ind w:left="432"/>
+      </w:pPr>
+      <w:r>
+        <w:rPr>
+          <w:i w:val="0"/>
+          <w:color w:val="111111"/>
+          <w:sz w:val="20"/>
+        </w:rPr>
+        <w:t>How solid was the answer? One number was changed at a time and everything ranked again, to see which places were close calls.</w:t>
+      </w:r>
+    </w:p>
+    <w:p>
+      <w:pPr>
+        <w:spacing w:after="40"/>
+        <w:ind w:left="864"/>
+      </w:pPr>
+      <w:r>
+        <w:rPr>
+          <w:i w:val="0"/>
+          <w:color w:val="555555"/>
+          <w:sz w:val="18"/>
+        </w:rPr>
+        <w:t>NEW-00001  solid  (0 of 6 small changes move it)</w:t>
+      </w:r>
+    </w:p>
+    <w:p>
+      <w:pPr>
+        <w:spacing w:after="40"/>
+        <w:ind w:left="864"/>
+      </w:pPr>
+      <w:r>
+        <w:rPr>
+          <w:i w:val="0"/>
+          <w:color w:val="555555"/>
+          <w:sz w:val="18"/>
+        </w:rPr>
+        <w:t>NEW-00002  fairly solid  (2 of 5 small changes move it)</w:t>
+      </w:r>
+    </w:p>
+    <w:p>
+      <w:pPr>
+        <w:spacing w:after="40"/>
+        <w:ind w:left="1296"/>
+      </w:pPr>
+      <w:r>
+        <w:rPr>
+          <w:i/>
+          <w:color w:val="555555"/>
+          <w:sz w:val="18"/>
+        </w:rPr>
+        <w:t>if work was blocked after all, it moves from 3 to 2</w:t>
+      </w:r>
+    </w:p>
+    <w:p>
+      <w:pPr>
+        <w:spacing w:after="40"/>
+        <w:ind w:left="1296"/>
+      </w:pPr>
+      <w:r>
+        <w:rPr>
+          <w:i/>
+          <w:color w:val="555555"/>
+          <w:sz w:val="18"/>
+        </w:rPr>
+        <w:t>if we had a quarter less time left than we thought, it moves from 3 to 2</w:t>
+      </w:r>
+    </w:p>
+    <w:p>
+      <w:pPr>
+        <w:spacing w:after="40"/>
+        <w:ind w:left="864"/>
+      </w:pPr>
+      <w:r>
+        <w:rPr>
+          <w:i w:val="0"/>
+          <w:color w:val="555555"/>
+          <w:sz w:val="18"/>
+        </w:rPr>
+        <w:t>NEW-00003  fairly solid  (1 of 6 small changes move it)</w:t>
+      </w:r>
+    </w:p>
+    <w:p>
+      <w:pPr>
+        <w:spacing w:after="40"/>
+        <w:ind w:left="1296"/>
+      </w:pPr>
+      <w:r>
+        <w:rPr>
+          <w:i/>
+          <w:color w:val="555555"/>
+          <w:sz w:val="18"/>
+        </w:rPr>
+        <w:t>if we had a quarter more time left than we thought, it moves from 2 to 3</w:t>
+      </w:r>
+    </w:p>
+    <w:p>
+      <w:pPr>
+        <w:spacing w:after="40"/>
+        <w:ind w:left="864"/>
+      </w:pPr>
+      <w:r>
+        <w:rPr>
+          <w:i w:val="0"/>
+          <w:color w:val="555555"/>
+          <w:sz w:val="18"/>
+        </w:rPr>
+        <w:t>NEW-00004  shaky  (4 of 5 small changes move it)</w:t>
+      </w:r>
+    </w:p>
+    <w:p>
+      <w:pPr>
+        <w:spacing w:after="40"/>
+        <w:ind w:left="1296"/>
+      </w:pPr>
+      <w:r>
+        <w:rPr>
+          <w:i/>
+          <w:color w:val="555555"/>
+          <w:sz w:val="18"/>
+        </w:rPr>
+        <w:t>if 7 people were affected, not 1, it moves from 5 to 4</w:t>
+      </w:r>
+    </w:p>
+    <w:p>
+      <w:pPr>
+        <w:spacing w:after="40"/>
+        <w:ind w:left="1296"/>
+      </w:pPr>
+      <w:r>
+        <w:rPr>
+          <w:i/>
+          <w:color w:val="555555"/>
+          <w:sz w:val="18"/>
+        </w:rPr>
+        <w:t>if work was blocked after all, it moves from 5 to 4</w:t>
+      </w:r>
+    </w:p>
+    <w:p>
+      <w:pPr>
+        <w:spacing w:after="40"/>
+        <w:ind w:left="864"/>
+      </w:pPr>
+      <w:r>
+        <w:rPr>
+          <w:i w:val="0"/>
+          <w:color w:val="555555"/>
+          <w:sz w:val="18"/>
+        </w:rPr>
+        <w:t>NEW-00005  solid  (0 of 6 small changes move it)</w:t>
+      </w:r>
+    </w:p>
+    <w:p>
+      <w:pPr>
+        <w:spacing w:before="240" w:after="60"/>
+      </w:pPr>
+      <w:r>
+        <w:rPr>
+          <w:b/>
+          <w:color w:val="6D28D9"/>
+          <w:sz w:val="23"/>
+        </w:rPr>
+        <w:t>Step 7   Hand them to a person</w:t>
+      </w:r>
+    </w:p>
+    <w:p>
+      <w:pPr>
+        <w:spacing w:after="40"/>
+        <w:ind w:left="432"/>
+      </w:pPr>
+      <w:r>
+        <w:rPr>
+          <w:i w:val="0"/>
+          <w:color w:val="555555"/>
+          <w:sz w:val="18"/>
+        </w:rPr>
+        <w:t>NEW-00001 goes to a person now</w:t>
+      </w:r>
+    </w:p>
+    <w:p>
+      <w:pPr>
+        <w:spacing w:after="40"/>
+        <w:ind w:left="432"/>
+      </w:pPr>
+      <w:r>
+        <w:rPr>
+          <w:i w:val="0"/>
+          <w:color w:val="555555"/>
+          <w:sz w:val="18"/>
+        </w:rPr>
+        <w:t>NEW-00003 goes to a person next</w:t>
+      </w:r>
+    </w:p>
+    <w:p>
+      <w:pPr>
+        <w:spacing w:after="40"/>
+        <w:ind w:left="432"/>
+      </w:pPr>
+      <w:r>
+        <w:rPr>
+          <w:i w:val="0"/>
+          <w:color w:val="555555"/>
+          <w:sz w:val="18"/>
+        </w:rPr>
+        <w:t>NEW-00004 goes to a person next   (the numbers were not settled about this one)</w:t>
+      </w:r>
+    </w:p>
+    <w:p>
+      <w:pPr>
+        <w:spacing w:after="40"/>
+        <w:ind w:left="432"/>
+      </w:pPr>
+      <w:r>
+        <w:rPr>
+          <w:i w:val="0"/>
+          <w:color w:val="555555"/>
+          <w:sz w:val="18"/>
+        </w:rPr>
+        <w:t>NEW-00002 goes to a person queued</w:t>
+      </w:r>
+    </w:p>
+    <w:p>
+      <w:pPr>
+        <w:spacing w:after="40"/>
+        <w:ind w:left="432"/>
+      </w:pPr>
+      <w:r>
+        <w:rPr>
+          <w:i w:val="0"/>
+          <w:color w:val="555555"/>
+          <w:sz w:val="18"/>
+        </w:rPr>
+        <w:t>NEW-00005 goes to a person queued</w:t>
+      </w:r>
+    </w:p>
+    <w:p/>
+    <w:p>
+      <w:pPr>
+        <w:spacing w:after="200"/>
+      </w:pPr>
+      <w:r>
+        <w:rPr>
+          <w:color w:val="CCCCCC"/>
+        </w:rPr>
+        <w:t>______________________________________________________________________________</w:t>
+      </w:r>
+    </w:p>
+    <w:p>
+      <w:r>
+        <w:rPr>
+          <w:b/>
+          <w:color w:val="4C1D95"/>
+          <w:sz w:val="30"/>
+        </w:rPr>
+        <w:t>Run on 17 August 2026 at 13:38:59</w:t>
+      </w:r>
+    </w:p>
+    <w:p>
+      <w:pPr>
+        <w:spacing w:after="40"/>
+        <w:ind w:left="0"/>
+      </w:pPr>
+      <w:r>
+        <w:rPr>
+          <w:i/>
+          <w:color w:val="555555"/>
+          <w:sz w:val="18"/>
+        </w:rPr>
+        <w:t>Recorded as DEC-20260817-133859</w:t>
+      </w:r>
+    </w:p>
+    <w:p>
+      <w:pPr>
+        <w:spacing w:before="240" w:after="60"/>
+      </w:pPr>
+      <w:r>
+        <w:rPr>
+          <w:b/>
+          <w:color w:val="6D28D9"/>
+          <w:sz w:val="23"/>
+        </w:rPr>
+        <w:t>Step 1   Pick up the waiting complaints</w:t>
+      </w:r>
+    </w:p>
+    <w:p>
+      <w:pPr>
+        <w:spacing w:after="40"/>
+        <w:ind w:left="0"/>
+      </w:pPr>
+      <w:r>
+        <w:rPr>
+          <w:i w:val="0"/>
+          <w:color w:val="111111"/>
+          <w:sz w:val="20"/>
+        </w:rPr>
+        <w:t>5 complaints were waiting.</w:t>
+      </w:r>
+    </w:p>
+    <w:p>
+      <w:pPr>
+        <w:spacing w:after="40"/>
+        <w:ind w:left="432"/>
+      </w:pPr>
+      <w:r>
+        <w:rPr>
+          <w:i w:val="0"/>
+          <w:color w:val="555555"/>
+          <w:sz w:val="18"/>
+        </w:rPr>
+        <w:t>NEW-00001   Team locked out</w:t>
+      </w:r>
+    </w:p>
+    <w:p>
+      <w:pPr>
+        <w:spacing w:after="40"/>
+        <w:ind w:left="432"/>
+      </w:pPr>
+      <w:r>
+        <w:rPr>
+          <w:i w:val="0"/>
+          <w:color w:val="555555"/>
+          <w:sz w:val="18"/>
+        </w:rPr>
+        <w:t>NEW-00002   Customer data deletion request</w:t>
+      </w:r>
+    </w:p>
+    <w:p>
+      <w:pPr>
+        <w:spacing w:after="40"/>
+        <w:ind w:left="432"/>
+      </w:pPr>
+      <w:r>
+        <w:rPr>
+          <w:i w:val="0"/>
+          <w:color w:val="555555"/>
+          <w:sz w:val="18"/>
+        </w:rPr>
+        <w:t>NEW-00003   Payments failing at checkout</w:t>
+      </w:r>
+    </w:p>
+    <w:p>
+      <w:pPr>
+        <w:spacing w:after="40"/>
+        <w:ind w:left="432"/>
+      </w:pPr>
+      <w:r>
+        <w:rPr>
+          <w:i w:val="0"/>
+          <w:color w:val="555555"/>
+          <w:sz w:val="18"/>
+        </w:rPr>
+        <w:t>NEW-00004   Unknown device session</w:t>
+      </w:r>
+    </w:p>
+    <w:p>
+      <w:pPr>
+        <w:spacing w:after="40"/>
+        <w:ind w:left="432"/>
+      </w:pPr>
+      <w:r>
+        <w:rPr>
+          <w:i w:val="0"/>
+          <w:color w:val="555555"/>
+          <w:sz w:val="18"/>
+        </w:rPr>
+        <w:t>NEW-00005   Dashboard showing outdated data</w:t>
+      </w:r>
+    </w:p>
+    <w:p>
+      <w:pPr>
+        <w:spacing w:before="240" w:after="60"/>
+      </w:pPr>
+      <w:r>
+        <w:rPr>
+          <w:b/>
+          <w:color w:val="6D28D9"/>
+          <w:sz w:val="23"/>
+        </w:rPr>
+        <w:t>Step 2   Look up the three separate systems</w:t>
+      </w:r>
+    </w:p>
+    <w:p>
+      <w:pPr>
+        <w:spacing w:after="40"/>
+        <w:ind w:left="0"/>
+      </w:pPr>
+      <w:r>
+        <w:rPr>
+          <w:i w:val="0"/>
+          <w:color w:val="111111"/>
+          <w:sz w:val="20"/>
+        </w:rPr>
+        <w:t>Each system knows a different part of the story, and none of them can see what the others see.</w:t>
+      </w:r>
+    </w:p>
+    <w:p>
+      <w:pPr>
+        <w:spacing w:after="40"/>
+        <w:ind w:left="432"/>
+      </w:pPr>
+      <w:r>
+        <w:rPr>
+          <w:i w:val="0"/>
+          <w:color w:val="555555"/>
+          <w:sz w:val="18"/>
+        </w:rPr>
+        <w:t>NEW-00001</w:t>
+      </w:r>
+    </w:p>
+    <w:p>
+      <w:pPr>
+        <w:spacing w:after="40"/>
+        <w:ind w:left="864"/>
+      </w:pPr>
+      <w:r>
+        <w:rPr>
+          <w:i w:val="0"/>
+          <w:color w:val="555555"/>
+          <w:sz w:val="18"/>
+        </w:rPr>
+        <w:t>Customer records say: Free plan, pays £0 a month, has asked 1 time</w:t>
+      </w:r>
+    </w:p>
+    <w:p>
+      <w:pPr>
+        <w:spacing w:after="40"/>
+        <w:ind w:left="864"/>
+      </w:pPr>
+      <w:r>
+        <w:rPr>
+          <w:i w:val="0"/>
+          <w:color w:val="555555"/>
+          <w:sz w:val="18"/>
+        </w:rPr>
+        <w:t>Monitoring says: Critical, 2860 people affected, work blocked: yes</w:t>
+      </w:r>
+    </w:p>
+    <w:p>
+      <w:pPr>
+        <w:spacing w:after="40"/>
+        <w:ind w:left="864"/>
+      </w:pPr>
+      <w:r>
+        <w:rPr>
+          <w:i w:val="0"/>
+          <w:color w:val="555555"/>
+          <w:sz w:val="18"/>
+        </w:rPr>
+        <w:t>The promise clock says: 72.0 hours promised, 2.9 left</w:t>
+      </w:r>
+    </w:p>
+    <w:p>
+      <w:pPr>
+        <w:spacing w:after="40"/>
+        <w:ind w:left="864"/>
+      </w:pPr>
+      <w:r>
+        <w:rPr>
+          <w:i w:val="0"/>
+          <w:color w:val="555555"/>
+          <w:sz w:val="18"/>
+        </w:rPr>
+        <w:t>The customer themselves said: Critical</w:t>
+      </w:r>
+    </w:p>
+    <w:p>
+      <w:pPr>
+        <w:spacing w:after="40"/>
+        <w:ind w:left="432"/>
+      </w:pPr>
+      <w:r>
+        <w:rPr>
+          <w:i w:val="0"/>
+          <w:color w:val="555555"/>
+          <w:sz w:val="18"/>
+        </w:rPr>
+        <w:t>NEW-00002</w:t>
+      </w:r>
+    </w:p>
+    <w:p>
+      <w:pPr>
+        <w:spacing w:after="40"/>
+        <w:ind w:left="864"/>
+      </w:pPr>
+      <w:r>
+        <w:rPr>
+          <w:i w:val="0"/>
+          <w:color w:val="555555"/>
+          <w:sz w:val="18"/>
+        </w:rPr>
+        <w:t>Customer records say: Free plan, pays £0 a month, has asked 1 time</w:t>
+      </w:r>
+    </w:p>
+    <w:p>
+      <w:pPr>
+        <w:spacing w:after="40"/>
+        <w:ind w:left="864"/>
+      </w:pPr>
+      <w:r>
+        <w:rPr>
+          <w:i w:val="0"/>
+          <w:color w:val="555555"/>
+          <w:sz w:val="18"/>
+        </w:rPr>
+        <w:t>Monitoring says: Low, 1 person affected, work blocked: no</w:t>
+      </w:r>
+    </w:p>
+    <w:p>
+      <w:pPr>
+        <w:spacing w:after="40"/>
+        <w:ind w:left="864"/>
+      </w:pPr>
+      <w:r>
+        <w:rPr>
+          <w:i w:val="0"/>
+          <w:color w:val="555555"/>
+          <w:sz w:val="18"/>
+        </w:rPr>
+        <w:t>The promise clock says: 72.0 hours promised, 12.0 left</w:t>
+      </w:r>
+    </w:p>
+    <w:p>
+      <w:pPr>
+        <w:spacing w:after="40"/>
+        <w:ind w:left="864"/>
+      </w:pPr>
+      <w:r>
+        <w:rPr>
+          <w:i w:val="0"/>
+          <w:color w:val="555555"/>
+          <w:sz w:val="18"/>
+        </w:rPr>
+        <w:t>The customer themselves said: High</w:t>
+      </w:r>
+    </w:p>
+    <w:p>
+      <w:pPr>
+        <w:spacing w:after="40"/>
+        <w:ind w:left="432"/>
+      </w:pPr>
+      <w:r>
+        <w:rPr>
+          <w:i w:val="0"/>
+          <w:color w:val="555555"/>
+          <w:sz w:val="18"/>
+        </w:rPr>
+        <w:t>NEW-00003</w:t>
+      </w:r>
+    </w:p>
+    <w:p>
+      <w:pPr>
+        <w:spacing w:after="40"/>
+        <w:ind w:left="864"/>
+      </w:pPr>
+      <w:r>
+        <w:rPr>
+          <w:i w:val="0"/>
+          <w:color w:val="555555"/>
+          <w:sz w:val="18"/>
+        </w:rPr>
+        <w:t>Customer records say: Free plan, pays £0 a month, has asked 1 time</w:t>
+      </w:r>
+    </w:p>
+    <w:p>
+      <w:pPr>
+        <w:spacing w:after="40"/>
+        <w:ind w:left="864"/>
+      </w:pPr>
+      <w:r>
+        <w:rPr>
+          <w:i w:val="0"/>
+          <w:color w:val="555555"/>
+          <w:sz w:val="18"/>
+        </w:rPr>
+        <w:t>Monitoring says: Critical, 1306 people affected, work blocked: yes</w:t>
+      </w:r>
+    </w:p>
+    <w:p>
+      <w:pPr>
+        <w:spacing w:after="40"/>
+        <w:ind w:left="864"/>
+      </w:pPr>
+      <w:r>
+        <w:rPr>
+          <w:i w:val="0"/>
+          <w:color w:val="555555"/>
+          <w:sz w:val="18"/>
+        </w:rPr>
+        <w:t>The promise clock says: 72.0 hours promised, 48.3 left</w:t>
+      </w:r>
+    </w:p>
+    <w:p>
+      <w:pPr>
+        <w:spacing w:after="40"/>
+        <w:ind w:left="864"/>
+      </w:pPr>
+      <w:r>
+        <w:rPr>
+          <w:i w:val="0"/>
+          <w:color w:val="555555"/>
+          <w:sz w:val="18"/>
+        </w:rPr>
+        <w:t>The customer themselves said: High</w:t>
+      </w:r>
+    </w:p>
+    <w:p>
+      <w:pPr>
+        <w:spacing w:after="40"/>
+        <w:ind w:left="432"/>
+      </w:pPr>
+      <w:r>
+        <w:rPr>
+          <w:i w:val="0"/>
+          <w:color w:val="555555"/>
+          <w:sz w:val="18"/>
+        </w:rPr>
+        <w:t>NEW-00004</w:t>
+      </w:r>
+    </w:p>
+    <w:p>
+      <w:pPr>
+        <w:spacing w:after="40"/>
+        <w:ind w:left="864"/>
+      </w:pPr>
+      <w:r>
+        <w:rPr>
+          <w:i w:val="0"/>
+          <w:color w:val="555555"/>
+          <w:sz w:val="18"/>
+        </w:rPr>
+        <w:t>Customer records say: Free plan, pays £0 a month, has asked 1 time</w:t>
+      </w:r>
+    </w:p>
+    <w:p>
+      <w:pPr>
+        <w:spacing w:after="40"/>
+        <w:ind w:left="864"/>
+      </w:pPr>
+      <w:r>
+        <w:rPr>
+          <w:i w:val="0"/>
+          <w:color w:val="555555"/>
+          <w:sz w:val="18"/>
+        </w:rPr>
+        <w:t>Monitoring says: Low, 1 person affected, work blocked: no</w:t>
+      </w:r>
+    </w:p>
+    <w:p>
+      <w:pPr>
+        <w:spacing w:after="40"/>
+        <w:ind w:left="864"/>
+      </w:pPr>
+      <w:r>
+        <w:rPr>
+          <w:i w:val="0"/>
+          <w:color w:val="555555"/>
+          <w:sz w:val="18"/>
+        </w:rPr>
+        <w:t>The promise clock says: 72.0 hours promised, 61.6 left</w:t>
+      </w:r>
+    </w:p>
+    <w:p>
+      <w:pPr>
+        <w:spacing w:after="40"/>
+        <w:ind w:left="864"/>
+      </w:pPr>
+      <w:r>
+        <w:rPr>
+          <w:i w:val="0"/>
+          <w:color w:val="555555"/>
+          <w:sz w:val="18"/>
+        </w:rPr>
+        <w:t>The customer themselves said: Low</w:t>
+      </w:r>
+    </w:p>
+    <w:p>
+      <w:pPr>
+        <w:spacing w:after="40"/>
+        <w:ind w:left="432"/>
+      </w:pPr>
+      <w:r>
+        <w:rPr>
+          <w:i w:val="0"/>
+          <w:color w:val="555555"/>
+          <w:sz w:val="18"/>
+        </w:rPr>
+        <w:t>NEW-00005</w:t>
+      </w:r>
+    </w:p>
+    <w:p>
+      <w:pPr>
+        <w:spacing w:after="40"/>
+        <w:ind w:left="864"/>
+      </w:pPr>
+      <w:r>
+        <w:rPr>
+          <w:i w:val="0"/>
+          <w:color w:val="555555"/>
+          <w:sz w:val="18"/>
+        </w:rPr>
+        <w:t>Customer records say: Free plan, pays £0 a month, has asked 1 time</w:t>
+      </w:r>
+    </w:p>
+    <w:p>
+      <w:pPr>
+        <w:spacing w:after="40"/>
+        <w:ind w:left="864"/>
+      </w:pPr>
+      <w:r>
+        <w:rPr>
+          <w:i w:val="0"/>
+          <w:color w:val="555555"/>
+          <w:sz w:val="18"/>
+        </w:rPr>
+        <w:t>Monitoring says: Low, 16 people affected, work blocked: no</w:t>
+      </w:r>
+    </w:p>
+    <w:p>
+      <w:pPr>
+        <w:spacing w:after="40"/>
+        <w:ind w:left="864"/>
+      </w:pPr>
+      <w:r>
+        <w:rPr>
+          <w:i w:val="0"/>
+          <w:color w:val="555555"/>
+          <w:sz w:val="18"/>
+        </w:rPr>
+        <w:t>The promise clock says: 72.0 hours promised, 62.2 left</w:t>
+      </w:r>
+    </w:p>
+    <w:p>
+      <w:pPr>
+        <w:spacing w:after="40"/>
+        <w:ind w:left="864"/>
+      </w:pPr>
+      <w:r>
+        <w:rPr>
+          <w:i w:val="0"/>
+          <w:color w:val="555555"/>
+          <w:sz w:val="18"/>
+        </w:rPr>
+        <w:t>The customer themselves said: High</w:t>
+      </w:r>
+    </w:p>
+    <w:p>
+      <w:pPr>
+        <w:spacing w:before="240" w:after="60"/>
+      </w:pPr>
+      <w:r>
+        <w:rPr>
+          <w:b/>
+          <w:color w:val="6D28D9"/>
+          <w:sz w:val="23"/>
+        </w:rPr>
+        <w:t>Step 3   Rank them four different ways</w:t>
+      </w:r>
+    </w:p>
+    <w:p>
+      <w:pPr>
+        <w:spacing w:after="40"/>
+        <w:ind w:left="0"/>
+      </w:pPr>
+      <w:r>
+        <w:rPr>
+          <w:i w:val="0"/>
+          <w:color w:val="111111"/>
+          <w:sz w:val="20"/>
+        </w:rPr>
+        <w:t>Each way is reasonable on its own, and each one is wrong on its own. They are evidence for the agent to weigh, not instructions to follow.</w:t>
+      </w:r>
+    </w:p>
+    <w:p>
+      <w:pPr>
+        <w:spacing w:after="40"/>
+        <w:ind w:left="432"/>
+      </w:pPr>
+      <w:r>
+        <w:rPr>
+          <w:i w:val="0"/>
+          <w:color w:val="555555"/>
+          <w:sz w:val="18"/>
+        </w:rPr>
+        <w:t>By money:  1. NEW-00001  2. NEW-00002  3. NEW-00003  4. NEW-00004  5. NEW-00005</w:t>
+      </w:r>
+    </w:p>
+    <w:p>
+      <w:pPr>
+        <w:spacing w:after="40"/>
+        <w:ind w:left="432"/>
+      </w:pPr>
+      <w:r>
+        <w:rPr>
+          <w:i w:val="0"/>
+          <w:color w:val="555555"/>
+          <w:sz w:val="18"/>
+        </w:rPr>
+        <w:t>By damage:  1. NEW-00001  2. NEW-00003  3. NEW-00005  4. NEW-00002  5. NEW-00004</w:t>
+      </w:r>
+    </w:p>
+    <w:p>
+      <w:pPr>
+        <w:spacing w:after="40"/>
+        <w:ind w:left="432"/>
+      </w:pPr>
+      <w:r>
+        <w:rPr>
+          <w:i w:val="0"/>
+          <w:color w:val="555555"/>
+          <w:sz w:val="18"/>
+        </w:rPr>
+        <w:t>By deadline:  1. NEW-00001  2. NEW-00002  3. NEW-00003  4. NEW-00004  5. NEW-00005</w:t>
+      </w:r>
+    </w:p>
+    <w:p>
+      <w:pPr>
+        <w:spacing w:after="40"/>
+        <w:ind w:left="432"/>
+      </w:pPr>
+      <w:r>
+        <w:rPr>
+          <w:i w:val="0"/>
+          <w:color w:val="555555"/>
+          <w:sz w:val="18"/>
+        </w:rPr>
+        <w:t>By fairness:  1. NEW-00001  2. NEW-00002  3. NEW-00003  4. NEW-00004  5. NEW-00005</w:t>
+      </w:r>
+    </w:p>
+    <w:p>
+      <w:pPr>
+        <w:spacing w:after="40"/>
+        <w:ind w:left="0"/>
+      </w:pPr>
+      <w:r>
+        <w:rPr>
+          <w:i w:val="0"/>
+          <w:color w:val="111111"/>
+          <w:sz w:val="20"/>
+        </w:rPr>
+      </w:r>
+    </w:p>
+    <w:p>
+      <w:pPr>
+        <w:spacing w:after="40"/>
+        <w:ind w:left="432"/>
+      </w:pPr>
+      <w:r>
+        <w:rPr>
+          <w:i w:val="0"/>
+          <w:color w:val="111111"/>
+          <w:sz w:val="20"/>
+        </w:rPr>
+        <w:t>Where the four disagreed most:</w:t>
+      </w:r>
+    </w:p>
+    <w:p>
+      <w:pPr>
+        <w:spacing w:before="240" w:after="60"/>
+      </w:pPr>
+      <w:r>
+        <w:rPr>
+          <w:b/>
+          <w:color w:val="6D28D9"/>
+          <w:sz w:val="23"/>
+        </w:rPr>
+        <w:t>Step 4   Read what the customer actually wrote</w:t>
+      </w:r>
+    </w:p>
+    <w:p>
+      <w:pPr>
+        <w:spacing w:after="40"/>
+        <w:ind w:left="0"/>
+      </w:pPr>
+      <w:r>
+        <w:rPr>
+          <w:i w:val="0"/>
+          <w:color w:val="111111"/>
+          <w:sz w:val="20"/>
+        </w:rPr>
+        <w:t>The four ways above only look at numbers, so they cannot tell a password reset apart from a break-in. Both look like one person with nothing failing. The words are the difference.</w:t>
+      </w:r>
+    </w:p>
+    <w:p>
+      <w:pPr>
+        <w:spacing w:after="40"/>
+        <w:ind w:left="432"/>
+      </w:pPr>
+      <w:r>
+        <w:rPr>
+          <w:i w:val="0"/>
+          <w:color w:val="555555"/>
+          <w:sz w:val="18"/>
+        </w:rPr>
+        <w:t>NEW-00001: “our whole team is locked out. nobody can get in since about 6am. we have a client demo at 10 and I don't know what to tell them”</w:t>
+      </w:r>
+    </w:p>
+    <w:p>
+      <w:pPr>
+        <w:spacing w:after="40"/>
+        <w:ind w:left="432"/>
+      </w:pPr>
+      <w:r>
+        <w:rPr>
+          <w:i w:val="0"/>
+          <w:color w:val="555555"/>
+          <w:sz w:val="18"/>
+        </w:rPr>
+        <w:t>NEW-00002: “I need to flag something. one of our customers has asked us to delete everything we hold on them. I believe there's a legal time limit on this and we're already a few days in”</w:t>
+      </w:r>
+    </w:p>
+    <w:p>
+      <w:pPr>
+        <w:spacing w:after="40"/>
+        <w:ind w:left="432"/>
+      </w:pPr>
+      <w:r>
+        <w:rPr>
+          <w:i w:val="0"/>
+          <w:color w:val="555555"/>
+          <w:sz w:val="18"/>
+        </w:rPr>
+        <w:t>NEW-00003: “payments are failing at checkout. we've had maybe forty customers email us this morning saying their card was declined. our own test card fails too”</w:t>
+      </w:r>
+    </w:p>
+    <w:p>
+      <w:pPr>
+        <w:spacing w:after="40"/>
+        <w:ind w:left="432"/>
+      </w:pPr>
+      <w:r>
+        <w:rPr>
+          <w:i w:val="0"/>
+          <w:color w:val="555555"/>
+          <w:sz w:val="18"/>
+        </w:rPr>
+        <w:t>NEW-00004: “there is a session logged in from a device we don't recognise and I can't work out how to end it. probably nothing but thought I should mention it”</w:t>
+      </w:r>
+    </w:p>
+    <w:p>
+      <w:pPr>
+        <w:spacing w:after="40"/>
+        <w:ind w:left="432"/>
+      </w:pPr>
+      <w:r>
+        <w:rPr>
+          <w:i w:val="0"/>
+          <w:color w:val="555555"/>
+          <w:sz w:val="18"/>
+        </w:rPr>
+        <w:t>NEW-00005: “ABSOLUTELY UNACCEPTABLE. our dashboard chart is showing last month's figures. we pay you thousands every month and I expect better than this. I want someone to call me today”</w:t>
+      </w:r>
+    </w:p>
+    <w:p>
+      <w:pPr>
+        <w:spacing w:before="240" w:after="60"/>
+      </w:pPr>
+      <w:r>
+        <w:rPr>
+          <w:b/>
+          <w:color w:val="6D28D9"/>
+          <w:sz w:val="23"/>
+        </w:rPr>
+        <w:t>Step 5   The AI decides, and says why</w:t>
+      </w:r>
+    </w:p>
+    <w:p>
+      <w:pPr>
+        <w:spacing w:after="40"/>
+        <w:ind w:left="432"/>
+      </w:pPr>
+      <w:r>
+        <w:rPr>
+          <w:i w:val="0"/>
+          <w:color w:val="111111"/>
+          <w:sz w:val="20"/>
+        </w:rPr>
+        <w:t>1. NEW-00001   Team locked out</w:t>
+      </w:r>
+    </w:p>
+    <w:p>
+      <w:pPr>
+        <w:spacing w:after="40"/>
+        <w:ind w:left="864"/>
+      </w:pPr>
+      <w:r>
+        <w:rPr>
+          <w:i/>
+          <w:color w:val="555555"/>
+          <w:sz w:val="20"/>
+        </w:rPr>
+        <w:t>Critical team lockout affecting all users and blocking work with a demo in hours forces it to the top.</w:t>
+      </w:r>
+    </w:p>
+    <w:p>
+      <w:pPr>
+        <w:spacing w:after="40"/>
+        <w:ind w:left="432"/>
+      </w:pPr>
+      <w:r>
+        <w:rPr>
+          <w:i w:val="0"/>
+          <w:color w:val="111111"/>
+          <w:sz w:val="20"/>
+        </w:rPr>
+        <w:t>2. NEW-00003   Payments failing at checkout</w:t>
+      </w:r>
+    </w:p>
+    <w:p>
+      <w:pPr>
+        <w:spacing w:after="40"/>
+        <w:ind w:left="864"/>
+      </w:pPr>
+      <w:r>
+        <w:rPr>
+          <w:i/>
+          <w:color w:val="555555"/>
+          <w:sz w:val="20"/>
+        </w:rPr>
+        <w:t>Widespread payment failures block transactions for many users, making it the next priority.</w:t>
+      </w:r>
+    </w:p>
+    <w:p>
+      <w:pPr>
+        <w:spacing w:after="40"/>
+        <w:ind w:left="432"/>
+      </w:pPr>
+      <w:r>
+        <w:rPr>
+          <w:i w:val="0"/>
+          <w:color w:val="111111"/>
+          <w:sz w:val="20"/>
+        </w:rPr>
+        <w:t>3. NEW-00004   Unknown device session</w:t>
+      </w:r>
+    </w:p>
+    <w:p>
+      <w:pPr>
+        <w:spacing w:after="40"/>
+        <w:ind w:left="864"/>
+      </w:pPr>
+      <w:r>
+        <w:rPr>
+          <w:i/>
+          <w:color w:val="555555"/>
+          <w:sz w:val="20"/>
+        </w:rPr>
+        <w:t>Potential security breach, despite low monitored impact, is lifted by policy to at least third place.</w:t>
+      </w:r>
+    </w:p>
+    <w:p>
+      <w:pPr>
+        <w:spacing w:after="40"/>
+        <w:ind w:left="432"/>
+      </w:pPr>
+      <w:r>
+        <w:rPr>
+          <w:i w:val="0"/>
+          <w:color w:val="111111"/>
+          <w:sz w:val="20"/>
+        </w:rPr>
+        <w:t>4. NEW-00002   Customer data deletion request</w:t>
+      </w:r>
+    </w:p>
+    <w:p>
+      <w:pPr>
+        <w:spacing w:after="40"/>
+        <w:ind w:left="864"/>
+      </w:pPr>
+      <w:r>
+        <w:rPr>
+          <w:i/>
+          <w:color w:val="555555"/>
+          <w:sz w:val="20"/>
+        </w:rPr>
+        <w:t>Legal data deletion request must be handled within statutory time, so it stays within the top four.</w:t>
+      </w:r>
+    </w:p>
+    <w:p>
+      <w:pPr>
+        <w:spacing w:after="40"/>
+        <w:ind w:left="432"/>
+      </w:pPr>
+      <w:r>
+        <w:rPr>
+          <w:i w:val="0"/>
+          <w:color w:val="111111"/>
+          <w:sz w:val="20"/>
+        </w:rPr>
+        <w:t>5. NEW-00005   Dashboard showing outdated data</w:t>
+      </w:r>
+    </w:p>
+    <w:p>
+      <w:pPr>
+        <w:spacing w:after="40"/>
+        <w:ind w:left="864"/>
+      </w:pPr>
+      <w:r>
+        <w:rPr>
+          <w:i/>
+          <w:color w:val="555555"/>
+          <w:sz w:val="20"/>
+        </w:rPr>
+        <w:t>Dashboard showing stale data impacts few users and can wait behind higher‑impact issues.</w:t>
+      </w:r>
+    </w:p>
+    <w:p>
+      <w:pPr>
+        <w:spacing w:after="40"/>
+        <w:ind w:left="0"/>
+      </w:pPr>
+      <w:r>
+        <w:rPr>
+          <w:i w:val="0"/>
+          <w:color w:val="111111"/>
+          <w:sz w:val="20"/>
+        </w:rPr>
+      </w:r>
+    </w:p>
+    <w:p>
+      <w:pPr>
+        <w:spacing w:after="40"/>
+        <w:ind w:left="432"/>
+      </w:pPr>
+      <w:r>
+        <w:rPr>
+          <w:i w:val="0"/>
+          <w:color w:val="111111"/>
+          <w:sz w:val="20"/>
+        </w:rPr>
+        <w:t>The trade-off it made:</w:t>
+      </w:r>
+    </w:p>
+    <w:p>
+      <w:pPr>
+        <w:spacing w:after="40"/>
+        <w:ind w:left="864"/>
+      </w:pPr>
+      <w:r>
+        <w:rPr>
+          <w:i/>
+          <w:color w:val="555555"/>
+          <w:sz w:val="20"/>
+        </w:rPr>
+        <w:t>We favoured impact and security/legal risk over pure monitoring severity and customer‑expressed urgency. This means a low‑severity security alert jumps ahead of a legal request, costing a slight delay on the compliance ticket but protecting the platform and avoiding possible breach penalties.</w:t>
+      </w:r>
+    </w:p>
+    <w:p>
+      <w:pPr>
+        <w:spacing w:after="40"/>
+        <w:ind w:left="0"/>
+      </w:pPr>
+      <w:r>
+        <w:rPr>
+          <w:i w:val="0"/>
+          <w:color w:val="111111"/>
+          <w:sz w:val="20"/>
+        </w:rPr>
+      </w:r>
+    </w:p>
+    <w:p>
+      <w:pPr>
+        <w:spacing w:after="40"/>
+        <w:ind w:left="432"/>
+      </w:pPr>
+      <w:r>
+        <w:rPr>
+          <w:i w:val="0"/>
+          <w:color w:val="111111"/>
+          <w:sz w:val="20"/>
+        </w:rPr>
+        <w:t>The closest call:</w:t>
+      </w:r>
+    </w:p>
+    <w:p>
+      <w:pPr>
+        <w:spacing w:after="40"/>
+        <w:ind w:left="864"/>
+      </w:pPr>
+      <w:r>
+        <w:rPr>
+          <w:i/>
+          <w:color w:val="555555"/>
+          <w:sz w:val="20"/>
+        </w:rPr>
+        <w:t>Balancing the legal deletion request (NEW-00002) against the suspected security incident (NEW-00004) was toughest; either could be justified as third, but we placed security higher to respect the explicit policy lift.</w:t>
+      </w:r>
+    </w:p>
+    <w:p>
+      <w:pPr>
+        <w:spacing w:after="40"/>
+        <w:ind w:left="0"/>
+      </w:pPr>
+      <w:r>
+        <w:rPr>
+          <w:i w:val="0"/>
+          <w:color w:val="111111"/>
+          <w:sz w:val="20"/>
+        </w:rPr>
+      </w:r>
+    </w:p>
+    <w:p>
+      <w:pPr>
+        <w:spacing w:after="40"/>
+        <w:ind w:left="432"/>
+      </w:pPr>
+      <w:r>
+        <w:rPr>
+          <w:i w:val="0"/>
+          <w:color w:val="111111"/>
+          <w:sz w:val="20"/>
+        </w:rPr>
+        <w:t>How it ranked the four ways of deciding:</w:t>
+      </w:r>
+    </w:p>
+    <w:p>
+      <w:pPr>
+        <w:spacing w:after="40"/>
+        <w:ind w:left="864"/>
+      </w:pPr>
+      <w:r>
+        <w:rPr>
+          <w:i w:val="0"/>
+          <w:color w:val="111111"/>
+          <w:sz w:val="20"/>
+        </w:rPr>
+        <w:t>1. damage</w:t>
+      </w:r>
+    </w:p>
+    <w:p>
+      <w:pPr>
+        <w:spacing w:after="40"/>
+        <w:ind w:left="1296"/>
+      </w:pPr>
+      <w:r>
+        <w:rPr>
+          <w:i/>
+          <w:color w:val="555555"/>
+          <w:sz w:val="20"/>
+        </w:rPr>
+        <w:t>why here: Impact on users and work blockage directly affect business continuity, which was the dominant factor across tickets.</w:t>
+      </w:r>
+    </w:p>
+    <w:p>
+      <w:pPr>
+        <w:spacing w:after="40"/>
+        <w:ind w:left="1296"/>
+      </w:pPr>
+      <w:r>
+        <w:rPr>
+          <w:i/>
+          <w:color w:val="555555"/>
+          <w:sz w:val="20"/>
+        </w:rPr>
+        <w:t>gets wrong: It can undervalue legal or security obligations that have low immediate user impact but high downstream risk</w:t>
+      </w:r>
+    </w:p>
+    <w:p>
+      <w:pPr>
+        <w:spacing w:after="40"/>
+        <w:ind w:left="864"/>
+      </w:pPr>
+      <w:r>
+        <w:rPr>
+          <w:i w:val="0"/>
+          <w:color w:val="111111"/>
+          <w:sz w:val="20"/>
+        </w:rPr>
+        <w:t>2. deadline</w:t>
+      </w:r>
+    </w:p>
+    <w:p>
+      <w:pPr>
+        <w:spacing w:after="40"/>
+        <w:ind w:left="1296"/>
+      </w:pPr>
+      <w:r>
+        <w:rPr>
+          <w:i/>
+          <w:color w:val="555555"/>
+          <w:sz w:val="20"/>
+        </w:rPr>
+        <w:t>why here: Statutory and SLA deadlines dictate urgency beyond raw impact, especially for compliance tickets.</w:t>
+      </w:r>
+    </w:p>
+    <w:p>
+      <w:pPr>
+        <w:spacing w:after="40"/>
+        <w:ind w:left="1296"/>
+      </w:pPr>
+      <w:r>
+        <w:rPr>
+          <w:i/>
+          <w:color w:val="555555"/>
+          <w:sz w:val="20"/>
+        </w:rPr>
+        <w:t>gets wrong: May push a less‑critical but time‑sensitive request ahead of a higher‑impact incident</w:t>
+      </w:r>
+    </w:p>
+    <w:p>
+      <w:pPr>
+        <w:spacing w:after="40"/>
+        <w:ind w:left="864"/>
+      </w:pPr>
+      <w:r>
+        <w:rPr>
+          <w:i w:val="0"/>
+          <w:color w:val="111111"/>
+          <w:sz w:val="20"/>
+        </w:rPr>
+        <w:t>3. fairness</w:t>
+      </w:r>
+    </w:p>
+    <w:p>
+      <w:pPr>
+        <w:spacing w:after="40"/>
+        <w:ind w:left="1296"/>
+      </w:pPr>
+      <w:r>
+        <w:rPr>
+          <w:i/>
+          <w:color w:val="555555"/>
+          <w:sz w:val="20"/>
+        </w:rPr>
+        <w:t>why here: Considers customer sentiment and equity, useful when impact metrics are similar.</w:t>
+      </w:r>
+    </w:p>
+    <w:p>
+      <w:pPr>
+        <w:spacing w:after="40"/>
+        <w:ind w:left="1296"/>
+      </w:pPr>
+      <w:r>
+        <w:rPr>
+          <w:i/>
+          <w:color w:val="555555"/>
+          <w:sz w:val="20"/>
+        </w:rPr>
+        <w:t>gets wrong: Subjective and can be skewed by angry customers exaggerating severity</w:t>
+      </w:r>
+    </w:p>
+    <w:p>
+      <w:pPr>
+        <w:spacing w:after="40"/>
+        <w:ind w:left="864"/>
+      </w:pPr>
+      <w:r>
+        <w:rPr>
+          <w:i w:val="0"/>
+          <w:color w:val="111111"/>
+          <w:sz w:val="20"/>
+        </w:rPr>
+        <w:t>4. money</w:t>
+      </w:r>
+    </w:p>
+    <w:p>
+      <w:pPr>
+        <w:spacing w:after="40"/>
+        <w:ind w:left="1296"/>
+      </w:pPr>
+      <w:r>
+        <w:rPr>
+          <w:i/>
+          <w:color w:val="555555"/>
+          <w:sz w:val="20"/>
+        </w:rPr>
+        <w:t>why here: All tickets are from free plans, so revenue provides no useful differentiation.</w:t>
+      </w:r>
+    </w:p>
+    <w:p>
+      <w:pPr>
+        <w:spacing w:after="40"/>
+        <w:ind w:left="1296"/>
+      </w:pPr>
+      <w:r>
+        <w:rPr>
+          <w:i/>
+          <w:color w:val="555555"/>
+          <w:sz w:val="20"/>
+        </w:rPr>
+        <w:t>gets wrong: Ignores potential long‑term value of high‑paying customers, though not relevant here</w:t>
+      </w:r>
+    </w:p>
+    <w:p>
+      <w:pPr>
+        <w:spacing w:after="40"/>
+        <w:ind w:left="0"/>
+      </w:pPr>
+      <w:r>
+        <w:rPr>
+          <w:i w:val="0"/>
+          <w:color w:val="111111"/>
+          <w:sz w:val="20"/>
+        </w:rPr>
+      </w:r>
+    </w:p>
+    <w:p>
+      <w:pPr>
+        <w:spacing w:after="40"/>
+        <w:ind w:left="432"/>
+      </w:pPr>
+      <w:r>
+        <w:rPr>
+          <w:i w:val="0"/>
+          <w:color w:val="111111"/>
+          <w:sz w:val="20"/>
+        </w:rPr>
+        <w:t>Closest call between the four:</w:t>
+      </w:r>
+    </w:p>
+    <w:p>
+      <w:pPr>
+        <w:spacing w:after="40"/>
+        <w:ind w:left="864"/>
+      </w:pPr>
+      <w:r>
+        <w:rPr>
+          <w:i/>
+          <w:color w:val="555555"/>
+          <w:sz w:val="20"/>
+        </w:rPr>
+        <w:t>Damage outranked deadline because the lockout affected thousands and blocked a live demo, a concrete business loss that outweighed any timing considerations.</w:t>
+      </w:r>
+    </w:p>
+    <w:p>
+      <w:pPr>
+        <w:spacing w:before="240" w:after="60"/>
+      </w:pPr>
+      <w:r>
+        <w:rPr>
+          <w:b/>
+          <w:color w:val="6D28D9"/>
+          <w:sz w:val="23"/>
+        </w:rPr>
+        <w:t>Step 6   Check the answer before anything happens</w:t>
+      </w:r>
+    </w:p>
+    <w:p>
+      <w:pPr>
+        <w:spacing w:after="40"/>
+        <w:ind w:left="432"/>
+      </w:pPr>
+      <w:r>
+        <w:rPr>
+          <w:i w:val="0"/>
+          <w:color w:val="111111"/>
+          <w:sz w:val="20"/>
+        </w:rPr>
+        <w:t>Did every complaint come back, and were the written rules followed?</w:t>
+      </w:r>
+    </w:p>
+    <w:p>
+      <w:pPr>
+        <w:spacing w:after="40"/>
+        <w:ind w:left="864"/>
+      </w:pPr>
+      <w:r>
+        <w:rPr>
+          <w:i/>
+          <w:color w:val="555555"/>
+          <w:sz w:val="20"/>
+        </w:rPr>
+        <w:t>Yes. Nothing was dropped and no rule was broken.</w:t>
+      </w:r>
+    </w:p>
+    <w:p>
+      <w:pPr>
+        <w:spacing w:after="40"/>
+        <w:ind w:left="0"/>
+      </w:pPr>
+      <w:r>
+        <w:rPr>
+          <w:i w:val="0"/>
+          <w:color w:val="111111"/>
+          <w:sz w:val="20"/>
+        </w:rPr>
+      </w:r>
+    </w:p>
+    <w:p>
+      <w:pPr>
+        <w:spacing w:after="40"/>
+        <w:ind w:left="432"/>
+      </w:pPr>
+      <w:r>
+        <w:rPr>
+          <w:i w:val="0"/>
+          <w:color w:val="111111"/>
+          <w:sz w:val="20"/>
+        </w:rPr>
+        <w:t>Were the reasons it gave actually true?</w:t>
+      </w:r>
+    </w:p>
+    <w:p>
+      <w:pPr>
+        <w:spacing w:after="40"/>
+        <w:ind w:left="864"/>
+      </w:pPr>
+      <w:r>
+        <w:rPr>
+          <w:i/>
+          <w:color w:val="555555"/>
+          <w:sz w:val="20"/>
+        </w:rPr>
+        <w:t>Yes. Every reason matched the numbers we hold.</w:t>
+      </w:r>
+    </w:p>
+    <w:p>
+      <w:pPr>
+        <w:spacing w:after="40"/>
+        <w:ind w:left="0"/>
+      </w:pPr>
+      <w:r>
+        <w:rPr>
+          <w:i w:val="0"/>
+          <w:color w:val="111111"/>
+          <w:sz w:val="20"/>
+        </w:rPr>
+      </w:r>
+    </w:p>
+    <w:p>
+      <w:pPr>
+        <w:spacing w:after="40"/>
+        <w:ind w:left="432"/>
+      </w:pPr>
+      <w:r>
+        <w:rPr>
+          <w:i w:val="0"/>
+          <w:color w:val="111111"/>
+          <w:sz w:val="20"/>
+        </w:rPr>
+        <w:t>How solid was the answer? One number was changed at a time and everything ranked again, to see which places were close calls.</w:t>
+      </w:r>
+    </w:p>
+    <w:p>
+      <w:pPr>
+        <w:spacing w:after="40"/>
+        <w:ind w:left="864"/>
+      </w:pPr>
+      <w:r>
+        <w:rPr>
+          <w:i w:val="0"/>
+          <w:color w:val="555555"/>
+          <w:sz w:val="18"/>
+        </w:rPr>
+        <w:t>NEW-00001  solid  (0 of 6 small changes move it)</w:t>
+      </w:r>
+    </w:p>
+    <w:p>
+      <w:pPr>
+        <w:spacing w:after="40"/>
+        <w:ind w:left="864"/>
+      </w:pPr>
+      <w:r>
+        <w:rPr>
+          <w:i w:val="0"/>
+          <w:color w:val="555555"/>
+          <w:sz w:val="18"/>
+        </w:rPr>
+        <w:t>NEW-00002  fairly solid  (2 of 5 small changes move it)</w:t>
+      </w:r>
+    </w:p>
+    <w:p>
+      <w:pPr>
+        <w:spacing w:after="40"/>
+        <w:ind w:left="1296"/>
+      </w:pPr>
+      <w:r>
+        <w:rPr>
+          <w:i/>
+          <w:color w:val="555555"/>
+          <w:sz w:val="18"/>
+        </w:rPr>
+        <w:t>if work was blocked after all, it moves from 3 to 2</w:t>
+      </w:r>
+    </w:p>
+    <w:p>
+      <w:pPr>
+        <w:spacing w:after="40"/>
+        <w:ind w:left="1296"/>
+      </w:pPr>
+      <w:r>
+        <w:rPr>
+          <w:i/>
+          <w:color w:val="555555"/>
+          <w:sz w:val="18"/>
+        </w:rPr>
+        <w:t>if we had a quarter less time left than we thought, it moves from 3 to 2</w:t>
+      </w:r>
+    </w:p>
+    <w:p>
+      <w:pPr>
+        <w:spacing w:after="40"/>
+        <w:ind w:left="864"/>
+      </w:pPr>
+      <w:r>
+        <w:rPr>
+          <w:i w:val="0"/>
+          <w:color w:val="555555"/>
+          <w:sz w:val="18"/>
+        </w:rPr>
+        <w:t>NEW-00003  fairly solid  (1 of 6 small changes move it)</w:t>
+      </w:r>
+    </w:p>
+    <w:p>
+      <w:pPr>
+        <w:spacing w:after="40"/>
+        <w:ind w:left="1296"/>
+      </w:pPr>
+      <w:r>
+        <w:rPr>
+          <w:i/>
+          <w:color w:val="555555"/>
+          <w:sz w:val="18"/>
+        </w:rPr>
+        <w:t>if we had a quarter more time left than we thought, it moves from 2 to 3</w:t>
+      </w:r>
+    </w:p>
+    <w:p>
+      <w:pPr>
+        <w:spacing w:after="40"/>
+        <w:ind w:left="864"/>
+      </w:pPr>
+      <w:r>
+        <w:rPr>
+          <w:i w:val="0"/>
+          <w:color w:val="555555"/>
+          <w:sz w:val="18"/>
+        </w:rPr>
+        <w:t>NEW-00004  shaky  (4 of 5 small changes move it)</w:t>
+      </w:r>
+    </w:p>
+    <w:p>
+      <w:pPr>
+        <w:spacing w:after="40"/>
+        <w:ind w:left="1296"/>
+      </w:pPr>
+      <w:r>
+        <w:rPr>
+          <w:i/>
+          <w:color w:val="555555"/>
+          <w:sz w:val="18"/>
+        </w:rPr>
+        <w:t>if 7 people were affected, not 1, it moves from 5 to 4</w:t>
+      </w:r>
+    </w:p>
+    <w:p>
+      <w:pPr>
+        <w:spacing w:after="40"/>
+        <w:ind w:left="1296"/>
+      </w:pPr>
+      <w:r>
+        <w:rPr>
+          <w:i/>
+          <w:color w:val="555555"/>
+          <w:sz w:val="18"/>
+        </w:rPr>
+        <w:t>if work was blocked after all, it moves from 5 to 4</w:t>
+      </w:r>
+    </w:p>
+    <w:p>
+      <w:pPr>
+        <w:spacing w:after="40"/>
+        <w:ind w:left="864"/>
+      </w:pPr>
+      <w:r>
+        <w:rPr>
+          <w:i w:val="0"/>
+          <w:color w:val="555555"/>
+          <w:sz w:val="18"/>
+        </w:rPr>
+        <w:t>NEW-00005  solid  (0 of 6 small changes move it)</w:t>
+      </w:r>
+    </w:p>
+    <w:p>
+      <w:pPr>
+        <w:spacing w:before="240" w:after="60"/>
+      </w:pPr>
+      <w:r>
+        <w:rPr>
+          <w:b/>
+          <w:color w:val="6D28D9"/>
+          <w:sz w:val="23"/>
+        </w:rPr>
+        <w:t>Step 7   Hand them to a person</w:t>
+      </w:r>
+    </w:p>
+    <w:p>
+      <w:pPr>
+        <w:spacing w:after="40"/>
+        <w:ind w:left="432"/>
+      </w:pPr>
+      <w:r>
+        <w:rPr>
+          <w:i w:val="0"/>
+          <w:color w:val="555555"/>
+          <w:sz w:val="18"/>
+        </w:rPr>
+        <w:t>NEW-00001 goes to a person now</w:t>
+      </w:r>
+    </w:p>
+    <w:p>
+      <w:pPr>
+        <w:spacing w:after="40"/>
+        <w:ind w:left="432"/>
+      </w:pPr>
+      <w:r>
+        <w:rPr>
+          <w:i w:val="0"/>
+          <w:color w:val="555555"/>
+          <w:sz w:val="18"/>
+        </w:rPr>
+        <w:t>NEW-00003 goes to a person next</w:t>
+      </w:r>
+    </w:p>
+    <w:p>
+      <w:pPr>
+        <w:spacing w:after="40"/>
+        <w:ind w:left="432"/>
+      </w:pPr>
+      <w:r>
+        <w:rPr>
+          <w:i w:val="0"/>
+          <w:color w:val="555555"/>
+          <w:sz w:val="18"/>
+        </w:rPr>
+        <w:t>NEW-00004 goes to a person next   (the numbers were not settled about this one)</w:t>
+      </w:r>
+    </w:p>
+    <w:p>
+      <w:pPr>
+        <w:spacing w:after="40"/>
+        <w:ind w:left="432"/>
+      </w:pPr>
+      <w:r>
+        <w:rPr>
+          <w:i w:val="0"/>
+          <w:color w:val="555555"/>
+          <w:sz w:val="18"/>
+        </w:rPr>
+        <w:t>NEW-00002 goes to a person queued</w:t>
+      </w:r>
+    </w:p>
+    <w:p>
+      <w:pPr>
+        <w:spacing w:after="40"/>
+        <w:ind w:left="432"/>
+      </w:pPr>
+      <w:r>
+        <w:rPr>
+          <w:i w:val="0"/>
+          <w:color w:val="555555"/>
+          <w:sz w:val="18"/>
+        </w:rPr>
+        <w:t>NEW-00005 goes to a person queued</w:t>
+      </w:r>
+    </w:p>
+    <w:p/>
+    <w:p>
+      <w:pPr>
+        <w:spacing w:after="200"/>
+      </w:pPr>
+      <w:r>
+        <w:rPr>
+          <w:color w:val="CCCCCC"/>
+        </w:rPr>
+        <w:t>______________________________________________________________________________</w:t>
+      </w:r>
+    </w:p>
+    <w:p>
+      <w:r>
+        <w:rPr>
+          <w:b/>
+          <w:color w:val="4C1D95"/>
+          <w:sz w:val="30"/>
+        </w:rPr>
+        <w:t>Run on 17 August 2026 at 13:51:28</w:t>
+      </w:r>
+    </w:p>
+    <w:p>
+      <w:pPr>
+        <w:spacing w:after="40"/>
+        <w:ind w:left="0"/>
+      </w:pPr>
+      <w:r>
+        <w:rPr>
+          <w:i/>
+          <w:color w:val="555555"/>
+          <w:sz w:val="18"/>
+        </w:rPr>
+        <w:t>Recorded as DEC-20260817-135128</w:t>
+      </w:r>
+    </w:p>
+    <w:p>
+      <w:pPr>
+        <w:spacing w:before="240" w:after="60"/>
+      </w:pPr>
+      <w:r>
+        <w:rPr>
+          <w:b/>
+          <w:color w:val="6D28D9"/>
+          <w:sz w:val="23"/>
+        </w:rPr>
+        <w:t>Step 1   Pick up the waiting complaints</w:t>
+      </w:r>
+    </w:p>
+    <w:p>
+      <w:pPr>
+        <w:spacing w:after="40"/>
+        <w:ind w:left="0"/>
+      </w:pPr>
+      <w:r>
+        <w:rPr>
+          <w:i w:val="0"/>
+          <w:color w:val="111111"/>
+          <w:sz w:val="20"/>
+        </w:rPr>
+        <w:t>5 complaints were waiting.</w:t>
+      </w:r>
+    </w:p>
+    <w:p>
+      <w:pPr>
+        <w:spacing w:after="40"/>
+        <w:ind w:left="432"/>
+      </w:pPr>
+      <w:r>
+        <w:rPr>
+          <w:i w:val="0"/>
+          <w:color w:val="555555"/>
+          <w:sz w:val="18"/>
+        </w:rPr>
+        <w:t>NEW-00001   Team locked out</w:t>
+      </w:r>
+    </w:p>
+    <w:p>
+      <w:pPr>
+        <w:spacing w:after="40"/>
+        <w:ind w:left="432"/>
+      </w:pPr>
+      <w:r>
+        <w:rPr>
+          <w:i w:val="0"/>
+          <w:color w:val="555555"/>
+          <w:sz w:val="18"/>
+        </w:rPr>
+        <w:t>NEW-00002   Customer data deletion request</w:t>
+      </w:r>
+    </w:p>
+    <w:p>
+      <w:pPr>
+        <w:spacing w:after="40"/>
+        <w:ind w:left="432"/>
+      </w:pPr>
+      <w:r>
+        <w:rPr>
+          <w:i w:val="0"/>
+          <w:color w:val="555555"/>
+          <w:sz w:val="18"/>
+        </w:rPr>
+        <w:t>NEW-00003   Payments failing at checkout</w:t>
+      </w:r>
+    </w:p>
+    <w:p>
+      <w:pPr>
+        <w:spacing w:after="40"/>
+        <w:ind w:left="432"/>
+      </w:pPr>
+      <w:r>
+        <w:rPr>
+          <w:i w:val="0"/>
+          <w:color w:val="555555"/>
+          <w:sz w:val="18"/>
+        </w:rPr>
+        <w:t>NEW-00004   Unknown device session</w:t>
+      </w:r>
+    </w:p>
+    <w:p>
+      <w:pPr>
+        <w:spacing w:after="40"/>
+        <w:ind w:left="432"/>
+      </w:pPr>
+      <w:r>
+        <w:rPr>
+          <w:i w:val="0"/>
+          <w:color w:val="555555"/>
+          <w:sz w:val="18"/>
+        </w:rPr>
+        <w:t>NEW-00005   Dashboard showing outdated data</w:t>
+      </w:r>
+    </w:p>
+    <w:p>
+      <w:pPr>
+        <w:spacing w:before="240" w:after="60"/>
+      </w:pPr>
+      <w:r>
+        <w:rPr>
+          <w:b/>
+          <w:color w:val="6D28D9"/>
+          <w:sz w:val="23"/>
+        </w:rPr>
+        <w:t>Step 2   Look up the three separate systems</w:t>
+      </w:r>
+    </w:p>
+    <w:p>
+      <w:pPr>
+        <w:spacing w:after="40"/>
+        <w:ind w:left="0"/>
+      </w:pPr>
+      <w:r>
+        <w:rPr>
+          <w:i w:val="0"/>
+          <w:color w:val="111111"/>
+          <w:sz w:val="20"/>
+        </w:rPr>
+        <w:t>Each system knows a different part of the story, and none of them can see what the others see.</w:t>
+      </w:r>
+    </w:p>
+    <w:p>
+      <w:pPr>
+        <w:spacing w:after="40"/>
+        <w:ind w:left="432"/>
+      </w:pPr>
+      <w:r>
+        <w:rPr>
+          <w:i w:val="0"/>
+          <w:color w:val="555555"/>
+          <w:sz w:val="18"/>
+        </w:rPr>
+        <w:t>NEW-00001</w:t>
+      </w:r>
+    </w:p>
+    <w:p>
+      <w:pPr>
+        <w:spacing w:after="40"/>
+        <w:ind w:left="864"/>
+      </w:pPr>
+      <w:r>
+        <w:rPr>
+          <w:i w:val="0"/>
+          <w:color w:val="555555"/>
+          <w:sz w:val="18"/>
+        </w:rPr>
+        <w:t>Customer records say: Free plan, pays £0 a month, has asked 1 time</w:t>
+      </w:r>
+    </w:p>
+    <w:p>
+      <w:pPr>
+        <w:spacing w:after="40"/>
+        <w:ind w:left="864"/>
+      </w:pPr>
+      <w:r>
+        <w:rPr>
+          <w:i w:val="0"/>
+          <w:color w:val="555555"/>
+          <w:sz w:val="18"/>
+        </w:rPr>
+        <w:t>Monitoring says: Critical, 2860 people affected, work blocked: yes</w:t>
+      </w:r>
+    </w:p>
+    <w:p>
+      <w:pPr>
+        <w:spacing w:after="40"/>
+        <w:ind w:left="864"/>
+      </w:pPr>
+      <w:r>
+        <w:rPr>
+          <w:i w:val="0"/>
+          <w:color w:val="555555"/>
+          <w:sz w:val="18"/>
+        </w:rPr>
+        <w:t>The promise clock says: 72.0 hours promised, 2.9 left</w:t>
+      </w:r>
+    </w:p>
+    <w:p>
+      <w:pPr>
+        <w:spacing w:after="40"/>
+        <w:ind w:left="864"/>
+      </w:pPr>
+      <w:r>
+        <w:rPr>
+          <w:i w:val="0"/>
+          <w:color w:val="555555"/>
+          <w:sz w:val="18"/>
+        </w:rPr>
+        <w:t>The customer themselves said: Critical</w:t>
+      </w:r>
+    </w:p>
+    <w:p>
+      <w:pPr>
+        <w:spacing w:after="40"/>
+        <w:ind w:left="432"/>
+      </w:pPr>
+      <w:r>
+        <w:rPr>
+          <w:i w:val="0"/>
+          <w:color w:val="555555"/>
+          <w:sz w:val="18"/>
+        </w:rPr>
+        <w:t>NEW-00002</w:t>
+      </w:r>
+    </w:p>
+    <w:p>
+      <w:pPr>
+        <w:spacing w:after="40"/>
+        <w:ind w:left="864"/>
+      </w:pPr>
+      <w:r>
+        <w:rPr>
+          <w:i w:val="0"/>
+          <w:color w:val="555555"/>
+          <w:sz w:val="18"/>
+        </w:rPr>
+        <w:t>Customer records say: Free plan, pays £0 a month, has asked 1 time</w:t>
+      </w:r>
+    </w:p>
+    <w:p>
+      <w:pPr>
+        <w:spacing w:after="40"/>
+        <w:ind w:left="864"/>
+      </w:pPr>
+      <w:r>
+        <w:rPr>
+          <w:i w:val="0"/>
+          <w:color w:val="555555"/>
+          <w:sz w:val="18"/>
+        </w:rPr>
+        <w:t>Monitoring says: Low, 1 person affected, work blocked: no</w:t>
+      </w:r>
+    </w:p>
+    <w:p>
+      <w:pPr>
+        <w:spacing w:after="40"/>
+        <w:ind w:left="864"/>
+      </w:pPr>
+      <w:r>
+        <w:rPr>
+          <w:i w:val="0"/>
+          <w:color w:val="555555"/>
+          <w:sz w:val="18"/>
+        </w:rPr>
+        <w:t>The promise clock says: 72.0 hours promised, 12.0 left</w:t>
+      </w:r>
+    </w:p>
+    <w:p>
+      <w:pPr>
+        <w:spacing w:after="40"/>
+        <w:ind w:left="864"/>
+      </w:pPr>
+      <w:r>
+        <w:rPr>
+          <w:i w:val="0"/>
+          <w:color w:val="555555"/>
+          <w:sz w:val="18"/>
+        </w:rPr>
+        <w:t>The customer themselves said: High</w:t>
+      </w:r>
+    </w:p>
+    <w:p>
+      <w:pPr>
+        <w:spacing w:after="40"/>
+        <w:ind w:left="432"/>
+      </w:pPr>
+      <w:r>
+        <w:rPr>
+          <w:i w:val="0"/>
+          <w:color w:val="555555"/>
+          <w:sz w:val="18"/>
+        </w:rPr>
+        <w:t>NEW-00003</w:t>
+      </w:r>
+    </w:p>
+    <w:p>
+      <w:pPr>
+        <w:spacing w:after="40"/>
+        <w:ind w:left="864"/>
+      </w:pPr>
+      <w:r>
+        <w:rPr>
+          <w:i w:val="0"/>
+          <w:color w:val="555555"/>
+          <w:sz w:val="18"/>
+        </w:rPr>
+        <w:t>Customer records say: Free plan, pays £0 a month, has asked 1 time</w:t>
+      </w:r>
+    </w:p>
+    <w:p>
+      <w:pPr>
+        <w:spacing w:after="40"/>
+        <w:ind w:left="864"/>
+      </w:pPr>
+      <w:r>
+        <w:rPr>
+          <w:i w:val="0"/>
+          <w:color w:val="555555"/>
+          <w:sz w:val="18"/>
+        </w:rPr>
+        <w:t>Monitoring says: Critical, 1306 people affected, work blocked: yes</w:t>
+      </w:r>
+    </w:p>
+    <w:p>
+      <w:pPr>
+        <w:spacing w:after="40"/>
+        <w:ind w:left="864"/>
+      </w:pPr>
+      <w:r>
+        <w:rPr>
+          <w:i w:val="0"/>
+          <w:color w:val="555555"/>
+          <w:sz w:val="18"/>
+        </w:rPr>
+        <w:t>The promise clock says: 72.0 hours promised, 48.3 left</w:t>
+      </w:r>
+    </w:p>
+    <w:p>
+      <w:pPr>
+        <w:spacing w:after="40"/>
+        <w:ind w:left="864"/>
+      </w:pPr>
+      <w:r>
+        <w:rPr>
+          <w:i w:val="0"/>
+          <w:color w:val="555555"/>
+          <w:sz w:val="18"/>
+        </w:rPr>
+        <w:t>The customer themselves said: High</w:t>
+      </w:r>
+    </w:p>
+    <w:p>
+      <w:pPr>
+        <w:spacing w:after="40"/>
+        <w:ind w:left="432"/>
+      </w:pPr>
+      <w:r>
+        <w:rPr>
+          <w:i w:val="0"/>
+          <w:color w:val="555555"/>
+          <w:sz w:val="18"/>
+        </w:rPr>
+        <w:t>NEW-00004</w:t>
+      </w:r>
+    </w:p>
+    <w:p>
+      <w:pPr>
+        <w:spacing w:after="40"/>
+        <w:ind w:left="864"/>
+      </w:pPr>
+      <w:r>
+        <w:rPr>
+          <w:i w:val="0"/>
+          <w:color w:val="555555"/>
+          <w:sz w:val="18"/>
+        </w:rPr>
+        <w:t>Customer records say: Free plan, pays £0 a month, has asked 1 time</w:t>
+      </w:r>
+    </w:p>
+    <w:p>
+      <w:pPr>
+        <w:spacing w:after="40"/>
+        <w:ind w:left="864"/>
+      </w:pPr>
+      <w:r>
+        <w:rPr>
+          <w:i w:val="0"/>
+          <w:color w:val="555555"/>
+          <w:sz w:val="18"/>
+        </w:rPr>
+        <w:t>Monitoring says: Low, 1 person affected, work blocked: no</w:t>
+      </w:r>
+    </w:p>
+    <w:p>
+      <w:pPr>
+        <w:spacing w:after="40"/>
+        <w:ind w:left="864"/>
+      </w:pPr>
+      <w:r>
+        <w:rPr>
+          <w:i w:val="0"/>
+          <w:color w:val="555555"/>
+          <w:sz w:val="18"/>
+        </w:rPr>
+        <w:t>The promise clock says: 72.0 hours promised, 61.6 left</w:t>
+      </w:r>
+    </w:p>
+    <w:p>
+      <w:pPr>
+        <w:spacing w:after="40"/>
+        <w:ind w:left="864"/>
+      </w:pPr>
+      <w:r>
+        <w:rPr>
+          <w:i w:val="0"/>
+          <w:color w:val="555555"/>
+          <w:sz w:val="18"/>
+        </w:rPr>
+        <w:t>The customer themselves said: Low</w:t>
+      </w:r>
+    </w:p>
+    <w:p>
+      <w:pPr>
+        <w:spacing w:after="40"/>
+        <w:ind w:left="432"/>
+      </w:pPr>
+      <w:r>
+        <w:rPr>
+          <w:i w:val="0"/>
+          <w:color w:val="555555"/>
+          <w:sz w:val="18"/>
+        </w:rPr>
+        <w:t>NEW-00005</w:t>
+      </w:r>
+    </w:p>
+    <w:p>
+      <w:pPr>
+        <w:spacing w:after="40"/>
+        <w:ind w:left="864"/>
+      </w:pPr>
+      <w:r>
+        <w:rPr>
+          <w:i w:val="0"/>
+          <w:color w:val="555555"/>
+          <w:sz w:val="18"/>
+        </w:rPr>
+        <w:t>Customer records say: Free plan, pays £0 a month, has asked 1 time</w:t>
+      </w:r>
+    </w:p>
+    <w:p>
+      <w:pPr>
+        <w:spacing w:after="40"/>
+        <w:ind w:left="864"/>
+      </w:pPr>
+      <w:r>
+        <w:rPr>
+          <w:i w:val="0"/>
+          <w:color w:val="555555"/>
+          <w:sz w:val="18"/>
+        </w:rPr>
+        <w:t>Monitoring says: Low, 16 people affected, work blocked: no</w:t>
+      </w:r>
+    </w:p>
+    <w:p>
+      <w:pPr>
+        <w:spacing w:after="40"/>
+        <w:ind w:left="864"/>
+      </w:pPr>
+      <w:r>
+        <w:rPr>
+          <w:i w:val="0"/>
+          <w:color w:val="555555"/>
+          <w:sz w:val="18"/>
+        </w:rPr>
+        <w:t>The promise clock says: 72.0 hours promised, 62.2 left</w:t>
+      </w:r>
+    </w:p>
+    <w:p>
+      <w:pPr>
+        <w:spacing w:after="40"/>
+        <w:ind w:left="864"/>
+      </w:pPr>
+      <w:r>
+        <w:rPr>
+          <w:i w:val="0"/>
+          <w:color w:val="555555"/>
+          <w:sz w:val="18"/>
+        </w:rPr>
+        <w:t>The customer themselves said: High</w:t>
+      </w:r>
+    </w:p>
+    <w:p>
+      <w:pPr>
+        <w:spacing w:before="240" w:after="60"/>
+      </w:pPr>
+      <w:r>
+        <w:rPr>
+          <w:b/>
+          <w:color w:val="6D28D9"/>
+          <w:sz w:val="23"/>
+        </w:rPr>
+        <w:t>Step 3   Rank them four different ways</w:t>
+      </w:r>
+    </w:p>
+    <w:p>
+      <w:pPr>
+        <w:spacing w:after="40"/>
+        <w:ind w:left="0"/>
+      </w:pPr>
+      <w:r>
+        <w:rPr>
+          <w:i w:val="0"/>
+          <w:color w:val="111111"/>
+          <w:sz w:val="20"/>
+        </w:rPr>
+        <w:t>Each way is reasonable on its own, and each one is wrong on its own. They are evidence for the agent to weigh, not instructions to follow.</w:t>
+      </w:r>
+    </w:p>
+    <w:p>
+      <w:pPr>
+        <w:spacing w:after="40"/>
+        <w:ind w:left="432"/>
+      </w:pPr>
+      <w:r>
+        <w:rPr>
+          <w:i w:val="0"/>
+          <w:color w:val="555555"/>
+          <w:sz w:val="18"/>
+        </w:rPr>
+        <w:t>By money:  1. NEW-00001  2. NEW-00002  3. NEW-00003  4. NEW-00004  5. NEW-00005</w:t>
+      </w:r>
+    </w:p>
+    <w:p>
+      <w:pPr>
+        <w:spacing w:after="40"/>
+        <w:ind w:left="432"/>
+      </w:pPr>
+      <w:r>
+        <w:rPr>
+          <w:i w:val="0"/>
+          <w:color w:val="555555"/>
+          <w:sz w:val="18"/>
+        </w:rPr>
+        <w:t>By damage:  1. NEW-00001  2. NEW-00003  3. NEW-00005  4. NEW-00002  5. NEW-00004</w:t>
+      </w:r>
+    </w:p>
+    <w:p>
+      <w:pPr>
+        <w:spacing w:after="40"/>
+        <w:ind w:left="432"/>
+      </w:pPr>
+      <w:r>
+        <w:rPr>
+          <w:i w:val="0"/>
+          <w:color w:val="555555"/>
+          <w:sz w:val="18"/>
+        </w:rPr>
+        <w:t>By deadline:  1. NEW-00001  2. NEW-00002  3. NEW-00003  4. NEW-00004  5. NEW-00005</w:t>
+      </w:r>
+    </w:p>
+    <w:p>
+      <w:pPr>
+        <w:spacing w:after="40"/>
+        <w:ind w:left="432"/>
+      </w:pPr>
+      <w:r>
+        <w:rPr>
+          <w:i w:val="0"/>
+          <w:color w:val="555555"/>
+          <w:sz w:val="18"/>
+        </w:rPr>
+        <w:t>By fairness:  1. NEW-00001  2. NEW-00002  3. NEW-00003  4. NEW-00004  5. NEW-00005</w:t>
+      </w:r>
+    </w:p>
+    <w:p>
+      <w:pPr>
+        <w:spacing w:after="40"/>
+        <w:ind w:left="0"/>
+      </w:pPr>
+      <w:r>
+        <w:rPr>
+          <w:i w:val="0"/>
+          <w:color w:val="111111"/>
+          <w:sz w:val="20"/>
+        </w:rPr>
+      </w:r>
+    </w:p>
+    <w:p>
+      <w:pPr>
+        <w:spacing w:after="40"/>
+        <w:ind w:left="432"/>
+      </w:pPr>
+      <w:r>
+        <w:rPr>
+          <w:i w:val="0"/>
+          <w:color w:val="111111"/>
+          <w:sz w:val="20"/>
+        </w:rPr>
+        <w:t>Where the four disagreed most:</w:t>
+      </w:r>
+    </w:p>
+    <w:p>
+      <w:pPr>
+        <w:spacing w:before="240" w:after="60"/>
+      </w:pPr>
+      <w:r>
+        <w:rPr>
+          <w:b/>
+          <w:color w:val="6D28D9"/>
+          <w:sz w:val="23"/>
+        </w:rPr>
+        <w:t>Step 4   Read what the customer actually wrote</w:t>
+      </w:r>
+    </w:p>
+    <w:p>
+      <w:pPr>
+        <w:spacing w:after="40"/>
+        <w:ind w:left="0"/>
+      </w:pPr>
+      <w:r>
+        <w:rPr>
+          <w:i w:val="0"/>
+          <w:color w:val="111111"/>
+          <w:sz w:val="20"/>
+        </w:rPr>
+        <w:t>The four ways above only look at numbers, so they cannot tell a password reset apart from a break-in. Both look like one person with nothing failing. The words are the difference.</w:t>
+      </w:r>
+    </w:p>
+    <w:p>
+      <w:pPr>
+        <w:spacing w:after="40"/>
+        <w:ind w:left="432"/>
+      </w:pPr>
+      <w:r>
+        <w:rPr>
+          <w:i w:val="0"/>
+          <w:color w:val="555555"/>
+          <w:sz w:val="18"/>
+        </w:rPr>
+        <w:t>NEW-00001: “our whole team is locked out. nobody can get in since about 6am. we have a client demo at 10 and I don't know what to tell them”</w:t>
+      </w:r>
+    </w:p>
+    <w:p>
+      <w:pPr>
+        <w:spacing w:after="40"/>
+        <w:ind w:left="432"/>
+      </w:pPr>
+      <w:r>
+        <w:rPr>
+          <w:i w:val="0"/>
+          <w:color w:val="555555"/>
+          <w:sz w:val="18"/>
+        </w:rPr>
+        <w:t>NEW-00002: “I need to flag something. one of our customers has asked us to delete everything we hold on them. I believe there's a legal time limit on this and we're already a few days in”</w:t>
+      </w:r>
+    </w:p>
+    <w:p>
+      <w:pPr>
+        <w:spacing w:after="40"/>
+        <w:ind w:left="432"/>
+      </w:pPr>
+      <w:r>
+        <w:rPr>
+          <w:i w:val="0"/>
+          <w:color w:val="555555"/>
+          <w:sz w:val="18"/>
+        </w:rPr>
+        <w:t>NEW-00003: “payments are failing at checkout. we've had maybe forty customers email us this morning saying their card was declined. our own test card fails too”</w:t>
+      </w:r>
+    </w:p>
+    <w:p>
+      <w:pPr>
+        <w:spacing w:after="40"/>
+        <w:ind w:left="432"/>
+      </w:pPr>
+      <w:r>
+        <w:rPr>
+          <w:i w:val="0"/>
+          <w:color w:val="555555"/>
+          <w:sz w:val="18"/>
+        </w:rPr>
+        <w:t>NEW-00004: “there is a session logged in from a device we don't recognise and I can't work out how to end it. probably nothing but thought I should mention it”</w:t>
+      </w:r>
+    </w:p>
+    <w:p>
+      <w:pPr>
+        <w:spacing w:after="40"/>
+        <w:ind w:left="432"/>
+      </w:pPr>
+      <w:r>
+        <w:rPr>
+          <w:i w:val="0"/>
+          <w:color w:val="555555"/>
+          <w:sz w:val="18"/>
+        </w:rPr>
+        <w:t>NEW-00005: “ABSOLUTELY UNACCEPTABLE. our dashboard chart is showing last month's figures. we pay you thousands every month and I expect better than this. I want someone to call me today”</w:t>
+      </w:r>
+    </w:p>
+    <w:p>
+      <w:pPr>
+        <w:spacing w:before="240" w:after="60"/>
+      </w:pPr>
+      <w:r>
+        <w:rPr>
+          <w:b/>
+          <w:color w:val="6D28D9"/>
+          <w:sz w:val="23"/>
+        </w:rPr>
+        <w:t>Step 5   The AI decides, and says why</w:t>
+      </w:r>
+    </w:p>
+    <w:p>
+      <w:pPr>
+        <w:spacing w:after="40"/>
+        <w:ind w:left="432"/>
+      </w:pPr>
+      <w:r>
+        <w:rPr>
+          <w:i w:val="0"/>
+          <w:color w:val="111111"/>
+          <w:sz w:val="20"/>
+        </w:rPr>
+        <w:t>1. NEW-00001   Team locked out</w:t>
+      </w:r>
+    </w:p>
+    <w:p>
+      <w:pPr>
+        <w:spacing w:after="40"/>
+        <w:ind w:left="864"/>
+      </w:pPr>
+      <w:r>
+        <w:rPr>
+          <w:i/>
+          <w:color w:val="555555"/>
+          <w:sz w:val="20"/>
+        </w:rPr>
+        <w:t>Critical lockout affecting all users and a pending demo forces it to the top.</w:t>
+      </w:r>
+    </w:p>
+    <w:p>
+      <w:pPr>
+        <w:spacing w:after="40"/>
+        <w:ind w:left="432"/>
+      </w:pPr>
+      <w:r>
+        <w:rPr>
+          <w:i w:val="0"/>
+          <w:color w:val="111111"/>
+          <w:sz w:val="20"/>
+        </w:rPr>
+        <w:t>2. NEW-00003   Payments failing at checkout</w:t>
+      </w:r>
+    </w:p>
+    <w:p>
+      <w:pPr>
+        <w:spacing w:after="40"/>
+        <w:ind w:left="864"/>
+      </w:pPr>
+      <w:r>
+        <w:rPr>
+          <w:i/>
+          <w:color w:val="555555"/>
+          <w:sz w:val="20"/>
+        </w:rPr>
+        <w:t>Widespread payment failures block commerce for many customers, demanding immediate attention.</w:t>
+      </w:r>
+    </w:p>
+    <w:p>
+      <w:pPr>
+        <w:spacing w:after="40"/>
+        <w:ind w:left="432"/>
+      </w:pPr>
+      <w:r>
+        <w:rPr>
+          <w:i w:val="0"/>
+          <w:color w:val="111111"/>
+          <w:sz w:val="20"/>
+        </w:rPr>
+        <w:t>3. NEW-00004   Unknown device session</w:t>
+      </w:r>
+    </w:p>
+    <w:p>
+      <w:pPr>
+        <w:spacing w:after="40"/>
+        <w:ind w:left="864"/>
+      </w:pPr>
+      <w:r>
+        <w:rPr>
+          <w:i/>
+          <w:color w:val="555555"/>
+          <w:sz w:val="20"/>
+        </w:rPr>
+        <w:t>Potential security breach, even if low‑severity now, is lifted by policy to be handled within the top three.</w:t>
+      </w:r>
+    </w:p>
+    <w:p>
+      <w:pPr>
+        <w:spacing w:after="40"/>
+        <w:ind w:left="432"/>
+      </w:pPr>
+      <w:r>
+        <w:rPr>
+          <w:i w:val="0"/>
+          <w:color w:val="111111"/>
+          <w:sz w:val="20"/>
+        </w:rPr>
+        <w:t>4. NEW-00002   Customer data deletion request</w:t>
+      </w:r>
+    </w:p>
+    <w:p>
+      <w:pPr>
+        <w:spacing w:after="40"/>
+        <w:ind w:left="864"/>
+      </w:pPr>
+      <w:r>
+        <w:rPr>
+          <w:i/>
+          <w:color w:val="555555"/>
+          <w:sz w:val="20"/>
+        </w:rPr>
+        <w:t>Legal GDPR deletion request must be addressed promptly to avoid fines, placing it just below the top three.</w:t>
+      </w:r>
+    </w:p>
+    <w:p>
+      <w:pPr>
+        <w:spacing w:after="40"/>
+        <w:ind w:left="432"/>
+      </w:pPr>
+      <w:r>
+        <w:rPr>
+          <w:i w:val="0"/>
+          <w:color w:val="111111"/>
+          <w:sz w:val="20"/>
+        </w:rPr>
+        <w:t>5. NEW-00005   Dashboard showing outdated data</w:t>
+      </w:r>
+    </w:p>
+    <w:p>
+      <w:pPr>
+        <w:spacing w:after="40"/>
+        <w:ind w:left="864"/>
+      </w:pPr>
+      <w:r>
+        <w:rPr>
+          <w:i/>
+          <w:color w:val="555555"/>
+          <w:sz w:val="20"/>
+        </w:rPr>
+        <w:t>Dashboard showing stale data impacts a small set of users and is low priority after higher‑impact issues.</w:t>
+      </w:r>
+    </w:p>
+    <w:p>
+      <w:pPr>
+        <w:spacing w:after="40"/>
+        <w:ind w:left="0"/>
+      </w:pPr>
+      <w:r>
+        <w:rPr>
+          <w:i w:val="0"/>
+          <w:color w:val="111111"/>
+          <w:sz w:val="20"/>
+        </w:rPr>
+      </w:r>
+    </w:p>
+    <w:p>
+      <w:pPr>
+        <w:spacing w:after="40"/>
+        <w:ind w:left="432"/>
+      </w:pPr>
+      <w:r>
+        <w:rPr>
+          <w:i w:val="0"/>
+          <w:color w:val="111111"/>
+          <w:sz w:val="20"/>
+        </w:rPr>
+        <w:t>The trade-off it made:</w:t>
+      </w:r>
+    </w:p>
+    <w:p>
+      <w:pPr>
+        <w:spacing w:after="40"/>
+        <w:ind w:left="864"/>
+      </w:pPr>
+      <w:r>
+        <w:rPr>
+          <w:i/>
+          <w:color w:val="555555"/>
+          <w:sz w:val="20"/>
+        </w:rPr>
+        <w:t>We favored impact and legal risk over pure fairness and monetary considerations, meaning we may delay less urgent but still important fairness concerns, costing us a slower response to the disgruntled dashboard user.</w:t>
+      </w:r>
+    </w:p>
+    <w:p>
+      <w:pPr>
+        <w:spacing w:after="40"/>
+        <w:ind w:left="0"/>
+      </w:pPr>
+      <w:r>
+        <w:rPr>
+          <w:i w:val="0"/>
+          <w:color w:val="111111"/>
+          <w:sz w:val="20"/>
+        </w:rPr>
+      </w:r>
+    </w:p>
+    <w:p>
+      <w:pPr>
+        <w:spacing w:after="40"/>
+        <w:ind w:left="432"/>
+      </w:pPr>
+      <w:r>
+        <w:rPr>
+          <w:i w:val="0"/>
+          <w:color w:val="111111"/>
+          <w:sz w:val="20"/>
+        </w:rPr>
+        <w:t>The closest call:</w:t>
+      </w:r>
+    </w:p>
+    <w:p>
+      <w:pPr>
+        <w:spacing w:after="40"/>
+        <w:ind w:left="864"/>
+      </w:pPr>
+      <w:r>
+        <w:rPr>
+          <w:i/>
+          <w:color w:val="555555"/>
+          <w:sz w:val="20"/>
+        </w:rPr>
+        <w:t>Choosing whether the security incident (NEW-00004) or the GDPR request (NEW-00002) should be third was hardest, as both have strong arguments; we placed the security incident higher due to the policy lift, but the legal deadline could also justify a higher rank.</w:t>
+      </w:r>
+    </w:p>
+    <w:p>
+      <w:pPr>
+        <w:spacing w:after="40"/>
+        <w:ind w:left="0"/>
+      </w:pPr>
+      <w:r>
+        <w:rPr>
+          <w:i w:val="0"/>
+          <w:color w:val="111111"/>
+          <w:sz w:val="20"/>
+        </w:rPr>
+      </w:r>
+    </w:p>
+    <w:p>
+      <w:pPr>
+        <w:spacing w:after="40"/>
+        <w:ind w:left="432"/>
+      </w:pPr>
+      <w:r>
+        <w:rPr>
+          <w:i w:val="0"/>
+          <w:color w:val="111111"/>
+          <w:sz w:val="20"/>
+        </w:rPr>
+        <w:t>How it ranked the four ways of deciding:</w:t>
+      </w:r>
+    </w:p>
+    <w:p>
+      <w:pPr>
+        <w:spacing w:after="40"/>
+        <w:ind w:left="864"/>
+      </w:pPr>
+      <w:r>
+        <w:rPr>
+          <w:i w:val="0"/>
+          <w:color w:val="111111"/>
+          <w:sz w:val="20"/>
+        </w:rPr>
+        <w:t>1. damage</w:t>
+      </w:r>
+    </w:p>
+    <w:p>
+      <w:pPr>
+        <w:spacing w:after="40"/>
+        <w:ind w:left="1296"/>
+      </w:pPr>
+      <w:r>
+        <w:rPr>
+          <w:i/>
+          <w:color w:val="555555"/>
+          <w:sz w:val="20"/>
+        </w:rPr>
+        <w:t>why here: Impact on users and business continuity varied widely and directly reflects the urgency of the problem.</w:t>
+      </w:r>
+    </w:p>
+    <w:p>
+      <w:pPr>
+        <w:spacing w:after="40"/>
+        <w:ind w:left="1296"/>
+      </w:pPr>
+      <w:r>
+        <w:rPr>
+          <w:i/>
+          <w:color w:val="555555"/>
+          <w:sz w:val="20"/>
+        </w:rPr>
+        <w:t>gets wrong: It can undervalue legal deadlines or policy lifts that are not captured by raw damage numbers.</w:t>
+      </w:r>
+    </w:p>
+    <w:p>
+      <w:pPr>
+        <w:spacing w:after="40"/>
+        <w:ind w:left="864"/>
+      </w:pPr>
+      <w:r>
+        <w:rPr>
+          <w:i w:val="0"/>
+          <w:color w:val="111111"/>
+          <w:sz w:val="20"/>
+        </w:rPr>
+        <w:t>2. deadline</w:t>
+      </w:r>
+    </w:p>
+    <w:p>
+      <w:pPr>
+        <w:spacing w:after="40"/>
+        <w:ind w:left="1296"/>
+      </w:pPr>
+      <w:r>
+        <w:rPr>
+          <w:i/>
+          <w:color w:val="555555"/>
+          <w:sz w:val="20"/>
+        </w:rPr>
+        <w:t>why here: Remaining SLA time influences how quickly we must act, especially for near‑deadline tickets.</w:t>
+      </w:r>
+    </w:p>
+    <w:p>
+      <w:pPr>
+        <w:spacing w:after="40"/>
+        <w:ind w:left="1296"/>
+      </w:pPr>
+      <w:r>
+        <w:rPr>
+          <w:i/>
+          <w:color w:val="555555"/>
+          <w:sz w:val="20"/>
+        </w:rPr>
+        <w:t>gets wrong: Deadlines may be generous for low‑impact issues, causing them to outrank more critical technical failures.</w:t>
+      </w:r>
+    </w:p>
+    <w:p>
+      <w:pPr>
+        <w:spacing w:after="40"/>
+        <w:ind w:left="864"/>
+      </w:pPr>
+      <w:r>
+        <w:rPr>
+          <w:i w:val="0"/>
+          <w:color w:val="111111"/>
+          <w:sz w:val="20"/>
+        </w:rPr>
+        <w:t>3. fairness</w:t>
+      </w:r>
+    </w:p>
+    <w:p>
+      <w:pPr>
+        <w:spacing w:after="40"/>
+        <w:ind w:left="1296"/>
+      </w:pPr>
+      <w:r>
+        <w:rPr>
+          <w:i/>
+          <w:color w:val="555555"/>
+          <w:sz w:val="20"/>
+        </w:rPr>
+        <w:t>why here: Ensures equal treatment of all customers regardless of payment, but is less decisive when impact differs sharply.</w:t>
+      </w:r>
+    </w:p>
+    <w:p>
+      <w:pPr>
+        <w:spacing w:after="40"/>
+        <w:ind w:left="1296"/>
+      </w:pPr>
+      <w:r>
+        <w:rPr>
+          <w:i/>
+          <w:color w:val="555555"/>
+          <w:sz w:val="20"/>
+        </w:rPr>
+        <w:t>gets wrong: May promote lower‑impact tickets over higher‑impact ones.</w:t>
+      </w:r>
+    </w:p>
+    <w:p>
+      <w:pPr>
+        <w:spacing w:after="40"/>
+        <w:ind w:left="864"/>
+      </w:pPr>
+      <w:r>
+        <w:rPr>
+          <w:i w:val="0"/>
+          <w:color w:val="111111"/>
+          <w:sz w:val="20"/>
+        </w:rPr>
+        <w:t>4. money</w:t>
+      </w:r>
+    </w:p>
+    <w:p>
+      <w:pPr>
+        <w:spacing w:after="40"/>
+        <w:ind w:left="1296"/>
+      </w:pPr>
+      <w:r>
+        <w:rPr>
+          <w:i/>
+          <w:color w:val="555555"/>
+          <w:sz w:val="20"/>
+        </w:rPr>
+        <w:t>why here: All tickets are from free plans, so monetary weighting adds little useful signal.</w:t>
+      </w:r>
+    </w:p>
+    <w:p>
+      <w:pPr>
+        <w:spacing w:after="40"/>
+        <w:ind w:left="1296"/>
+      </w:pPr>
+      <w:r>
+        <w:rPr>
+          <w:i/>
+          <w:color w:val="555555"/>
+          <w:sz w:val="20"/>
+        </w:rPr>
+        <w:t>gets wrong: Ignores the fact that paying customers might deserve faster service, but here it would mislead.</w:t>
+      </w:r>
+    </w:p>
+    <w:p>
+      <w:pPr>
+        <w:spacing w:after="40"/>
+        <w:ind w:left="0"/>
+      </w:pPr>
+      <w:r>
+        <w:rPr>
+          <w:i w:val="0"/>
+          <w:color w:val="111111"/>
+          <w:sz w:val="20"/>
+        </w:rPr>
+      </w:r>
+    </w:p>
+    <w:p>
+      <w:pPr>
+        <w:spacing w:after="40"/>
+        <w:ind w:left="432"/>
+      </w:pPr>
+      <w:r>
+        <w:rPr>
+          <w:i w:val="0"/>
+          <w:color w:val="111111"/>
+          <w:sz w:val="20"/>
+        </w:rPr>
+        <w:t>Closest call between the four:</w:t>
+      </w:r>
+    </w:p>
+    <w:p>
+      <w:pPr>
+        <w:spacing w:after="40"/>
+        <w:ind w:left="864"/>
+      </w:pPr>
+      <w:r>
+        <w:rPr>
+          <w:i/>
+          <w:color w:val="555555"/>
+          <w:sz w:val="20"/>
+        </w:rPr>
+        <w:t>Damage ranking outranked deadline because the sheer number of affected users and blocked work outweighed the remaining SLA time for the next ticket.</w:t>
       </w:r>
     </w:p>
     <w:p>

</xml_diff>

<commit_message>
Add a walkthrough of one complete run, with screenshots
</commit_message>
<xml_diff>
--- a/data/how_the_agent_thinks.docx
+++ b/data/how_the_agent_thinks.docx
@@ -21414,6 +21414,1568 @@
           <w:sz w:val="18"/>
         </w:rPr>
         <w:t>NEW-00003 goes to a person next</w:t>
+      </w:r>
+    </w:p>
+    <w:p>
+      <w:pPr>
+        <w:spacing w:after="40"/>
+        <w:ind w:left="432"/>
+      </w:pPr>
+      <w:r>
+        <w:rPr>
+          <w:i w:val="0"/>
+          <w:color w:val="555555"/>
+          <w:sz w:val="18"/>
+        </w:rPr>
+        <w:t>NEW-00004 goes to a person next   (the numbers were not settled about this one)</w:t>
+      </w:r>
+    </w:p>
+    <w:p>
+      <w:pPr>
+        <w:spacing w:after="40"/>
+        <w:ind w:left="432"/>
+      </w:pPr>
+      <w:r>
+        <w:rPr>
+          <w:i w:val="0"/>
+          <w:color w:val="555555"/>
+          <w:sz w:val="18"/>
+        </w:rPr>
+        <w:t>NEW-00002 goes to a person queued</w:t>
+      </w:r>
+    </w:p>
+    <w:p>
+      <w:pPr>
+        <w:spacing w:after="40"/>
+        <w:ind w:left="432"/>
+      </w:pPr>
+      <w:r>
+        <w:rPr>
+          <w:i w:val="0"/>
+          <w:color w:val="555555"/>
+          <w:sz w:val="18"/>
+        </w:rPr>
+        <w:t>NEW-00005 goes to a person queued</w:t>
+      </w:r>
+    </w:p>
+    <w:p/>
+    <w:p>
+      <w:pPr>
+        <w:spacing w:after="200"/>
+      </w:pPr>
+      <w:r>
+        <w:rPr>
+          <w:color w:val="CCCCCC"/>
+        </w:rPr>
+        <w:t>______________________________________________________________________________</w:t>
+      </w:r>
+    </w:p>
+    <w:p>
+      <w:r>
+        <w:rPr>
+          <w:b/>
+          <w:color w:val="4C1D95"/>
+          <w:sz w:val="30"/>
+        </w:rPr>
+        <w:t>Run on 19 August 2026 at 20:15:43</w:t>
+      </w:r>
+    </w:p>
+    <w:p>
+      <w:pPr>
+        <w:spacing w:after="40"/>
+        <w:ind w:left="0"/>
+      </w:pPr>
+      <w:r>
+        <w:rPr>
+          <w:i/>
+          <w:color w:val="555555"/>
+          <w:sz w:val="18"/>
+        </w:rPr>
+        <w:t>Recorded as DEC-20260819-201543</w:t>
+      </w:r>
+    </w:p>
+    <w:p>
+      <w:pPr>
+        <w:spacing w:before="240" w:after="60"/>
+      </w:pPr>
+      <w:r>
+        <w:rPr>
+          <w:b/>
+          <w:color w:val="6D28D9"/>
+          <w:sz w:val="23"/>
+        </w:rPr>
+        <w:t>Step 1   Pick up the waiting complaints</w:t>
+      </w:r>
+    </w:p>
+    <w:p>
+      <w:pPr>
+        <w:spacing w:after="40"/>
+        <w:ind w:left="0"/>
+      </w:pPr>
+      <w:r>
+        <w:rPr>
+          <w:i w:val="0"/>
+          <w:color w:val="111111"/>
+          <w:sz w:val="20"/>
+        </w:rPr>
+        <w:t>5 complaints were waiting.</w:t>
+      </w:r>
+    </w:p>
+    <w:p>
+      <w:pPr>
+        <w:spacing w:after="40"/>
+        <w:ind w:left="432"/>
+      </w:pPr>
+      <w:r>
+        <w:rPr>
+          <w:i w:val="0"/>
+          <w:color w:val="555555"/>
+          <w:sz w:val="18"/>
+        </w:rPr>
+        <w:t>NEW-00001   Team locked out</w:t>
+      </w:r>
+    </w:p>
+    <w:p>
+      <w:pPr>
+        <w:spacing w:after="40"/>
+        <w:ind w:left="432"/>
+      </w:pPr>
+      <w:r>
+        <w:rPr>
+          <w:i w:val="0"/>
+          <w:color w:val="555555"/>
+          <w:sz w:val="18"/>
+        </w:rPr>
+        <w:t>NEW-00002   Customer data deletion request</w:t>
+      </w:r>
+    </w:p>
+    <w:p>
+      <w:pPr>
+        <w:spacing w:after="40"/>
+        <w:ind w:left="432"/>
+      </w:pPr>
+      <w:r>
+        <w:rPr>
+          <w:i w:val="0"/>
+          <w:color w:val="555555"/>
+          <w:sz w:val="18"/>
+        </w:rPr>
+        <w:t>NEW-00003   Payments failing at checkout</w:t>
+      </w:r>
+    </w:p>
+    <w:p>
+      <w:pPr>
+        <w:spacing w:after="40"/>
+        <w:ind w:left="432"/>
+      </w:pPr>
+      <w:r>
+        <w:rPr>
+          <w:i w:val="0"/>
+          <w:color w:val="555555"/>
+          <w:sz w:val="18"/>
+        </w:rPr>
+        <w:t>NEW-00004   Unrecognized device session</w:t>
+      </w:r>
+    </w:p>
+    <w:p>
+      <w:pPr>
+        <w:spacing w:after="40"/>
+        <w:ind w:left="432"/>
+      </w:pPr>
+      <w:r>
+        <w:rPr>
+          <w:i w:val="0"/>
+          <w:color w:val="555555"/>
+          <w:sz w:val="18"/>
+        </w:rPr>
+        <w:t>NEW-00005   Dashboard showing outdated data</w:t>
+      </w:r>
+    </w:p>
+    <w:p>
+      <w:pPr>
+        <w:spacing w:before="240" w:after="60"/>
+      </w:pPr>
+      <w:r>
+        <w:rPr>
+          <w:b/>
+          <w:color w:val="6D28D9"/>
+          <w:sz w:val="23"/>
+        </w:rPr>
+        <w:t>Step 2   Look up the three separate systems</w:t>
+      </w:r>
+    </w:p>
+    <w:p>
+      <w:pPr>
+        <w:spacing w:after="40"/>
+        <w:ind w:left="0"/>
+      </w:pPr>
+      <w:r>
+        <w:rPr>
+          <w:i w:val="0"/>
+          <w:color w:val="111111"/>
+          <w:sz w:val="20"/>
+        </w:rPr>
+        <w:t>Each system knows a different part of the story, and none of them can see what the others see.</w:t>
+      </w:r>
+    </w:p>
+    <w:p>
+      <w:pPr>
+        <w:spacing w:after="40"/>
+        <w:ind w:left="432"/>
+      </w:pPr>
+      <w:r>
+        <w:rPr>
+          <w:i w:val="0"/>
+          <w:color w:val="555555"/>
+          <w:sz w:val="18"/>
+        </w:rPr>
+        <w:t>NEW-00001</w:t>
+      </w:r>
+    </w:p>
+    <w:p>
+      <w:pPr>
+        <w:spacing w:after="40"/>
+        <w:ind w:left="864"/>
+      </w:pPr>
+      <w:r>
+        <w:rPr>
+          <w:i w:val="0"/>
+          <w:color w:val="555555"/>
+          <w:sz w:val="18"/>
+        </w:rPr>
+        <w:t>Customer records say: Enterprise plan, pays £27,928 a month, has asked 1 time</w:t>
+      </w:r>
+    </w:p>
+    <w:p>
+      <w:pPr>
+        <w:spacing w:after="40"/>
+        <w:ind w:left="864"/>
+      </w:pPr>
+      <w:r>
+        <w:rPr>
+          <w:i w:val="0"/>
+          <w:color w:val="555555"/>
+          <w:sz w:val="18"/>
+        </w:rPr>
+        <w:t>Monitoring says: Critical, 882 people affected, work blocked: yes</w:t>
+      </w:r>
+    </w:p>
+    <w:p>
+      <w:pPr>
+        <w:spacing w:after="40"/>
+        <w:ind w:left="864"/>
+      </w:pPr>
+      <w:r>
+        <w:rPr>
+          <w:i w:val="0"/>
+          <w:color w:val="555555"/>
+          <w:sz w:val="18"/>
+        </w:rPr>
+        <w:t>The promise clock says: 2.0 hours promised, 0.7 left</w:t>
+      </w:r>
+    </w:p>
+    <w:p>
+      <w:pPr>
+        <w:spacing w:after="40"/>
+        <w:ind w:left="864"/>
+      </w:pPr>
+      <w:r>
+        <w:rPr>
+          <w:i w:val="0"/>
+          <w:color w:val="555555"/>
+          <w:sz w:val="18"/>
+        </w:rPr>
+        <w:t>The customer themselves said: Critical</w:t>
+      </w:r>
+    </w:p>
+    <w:p>
+      <w:pPr>
+        <w:spacing w:after="40"/>
+        <w:ind w:left="432"/>
+      </w:pPr>
+      <w:r>
+        <w:rPr>
+          <w:i w:val="0"/>
+          <w:color w:val="555555"/>
+          <w:sz w:val="18"/>
+        </w:rPr>
+        <w:t>NEW-00002</w:t>
+      </w:r>
+    </w:p>
+    <w:p>
+      <w:pPr>
+        <w:spacing w:after="40"/>
+        <w:ind w:left="864"/>
+      </w:pPr>
+      <w:r>
+        <w:rPr>
+          <w:i w:val="0"/>
+          <w:color w:val="555555"/>
+          <w:sz w:val="18"/>
+        </w:rPr>
+        <w:t>Customer records say: Pro plan, pays £540 a month, has asked 1 time</w:t>
+      </w:r>
+    </w:p>
+    <w:p>
+      <w:pPr>
+        <w:spacing w:after="40"/>
+        <w:ind w:left="864"/>
+      </w:pPr>
+      <w:r>
+        <w:rPr>
+          <w:i w:val="0"/>
+          <w:color w:val="555555"/>
+          <w:sz w:val="18"/>
+        </w:rPr>
+        <w:t>Monitoring says: Low, 1 person affected, work blocked: no</w:t>
+      </w:r>
+    </w:p>
+    <w:p>
+      <w:pPr>
+        <w:spacing w:after="40"/>
+        <w:ind w:left="864"/>
+      </w:pPr>
+      <w:r>
+        <w:rPr>
+          <w:i w:val="0"/>
+          <w:color w:val="555555"/>
+          <w:sz w:val="18"/>
+        </w:rPr>
+        <w:t>The promise clock says: 8.0 hours promised, 4.1 left</w:t>
+      </w:r>
+    </w:p>
+    <w:p>
+      <w:pPr>
+        <w:spacing w:after="40"/>
+        <w:ind w:left="864"/>
+      </w:pPr>
+      <w:r>
+        <w:rPr>
+          <w:i w:val="0"/>
+          <w:color w:val="555555"/>
+          <w:sz w:val="18"/>
+        </w:rPr>
+        <w:t>The customer themselves said: High</w:t>
+      </w:r>
+    </w:p>
+    <w:p>
+      <w:pPr>
+        <w:spacing w:after="40"/>
+        <w:ind w:left="432"/>
+      </w:pPr>
+      <w:r>
+        <w:rPr>
+          <w:i w:val="0"/>
+          <w:color w:val="555555"/>
+          <w:sz w:val="18"/>
+        </w:rPr>
+        <w:t>NEW-00003</w:t>
+      </w:r>
+    </w:p>
+    <w:p>
+      <w:pPr>
+        <w:spacing w:after="40"/>
+        <w:ind w:left="864"/>
+      </w:pPr>
+      <w:r>
+        <w:rPr>
+          <w:i w:val="0"/>
+          <w:color w:val="555555"/>
+          <w:sz w:val="18"/>
+        </w:rPr>
+        <w:t>Customer records say: Free plan, pays £0 a month, has asked 1 time</w:t>
+      </w:r>
+    </w:p>
+    <w:p>
+      <w:pPr>
+        <w:spacing w:after="40"/>
+        <w:ind w:left="864"/>
+      </w:pPr>
+      <w:r>
+        <w:rPr>
+          <w:i w:val="0"/>
+          <w:color w:val="555555"/>
+          <w:sz w:val="18"/>
+        </w:rPr>
+        <w:t>Monitoring says: Critical, 2155 people affected, work blocked: yes</w:t>
+      </w:r>
+    </w:p>
+    <w:p>
+      <w:pPr>
+        <w:spacing w:after="40"/>
+        <w:ind w:left="864"/>
+      </w:pPr>
+      <w:r>
+        <w:rPr>
+          <w:i w:val="0"/>
+          <w:color w:val="555555"/>
+          <w:sz w:val="18"/>
+        </w:rPr>
+        <w:t>The promise clock says: 72.0 hours promised, 4.6 left</w:t>
+      </w:r>
+    </w:p>
+    <w:p>
+      <w:pPr>
+        <w:spacing w:after="40"/>
+        <w:ind w:left="864"/>
+      </w:pPr>
+      <w:r>
+        <w:rPr>
+          <w:i w:val="0"/>
+          <w:color w:val="555555"/>
+          <w:sz w:val="18"/>
+        </w:rPr>
+        <w:t>The customer themselves said: Critical</w:t>
+      </w:r>
+    </w:p>
+    <w:p>
+      <w:pPr>
+        <w:spacing w:after="40"/>
+        <w:ind w:left="432"/>
+      </w:pPr>
+      <w:r>
+        <w:rPr>
+          <w:i w:val="0"/>
+          <w:color w:val="555555"/>
+          <w:sz w:val="18"/>
+        </w:rPr>
+        <w:t>NEW-00004</w:t>
+      </w:r>
+    </w:p>
+    <w:p>
+      <w:pPr>
+        <w:spacing w:after="40"/>
+        <w:ind w:left="864"/>
+      </w:pPr>
+      <w:r>
+        <w:rPr>
+          <w:i w:val="0"/>
+          <w:color w:val="555555"/>
+          <w:sz w:val="18"/>
+        </w:rPr>
+        <w:t>Customer records say: Free plan, pays £0 a month, has asked 1 time</w:t>
+      </w:r>
+    </w:p>
+    <w:p>
+      <w:pPr>
+        <w:spacing w:after="40"/>
+        <w:ind w:left="864"/>
+      </w:pPr>
+      <w:r>
+        <w:rPr>
+          <w:i w:val="0"/>
+          <w:color w:val="555555"/>
+          <w:sz w:val="18"/>
+        </w:rPr>
+        <w:t>Monitoring says: Low, 3 people affected, work blocked: no</w:t>
+      </w:r>
+    </w:p>
+    <w:p>
+      <w:pPr>
+        <w:spacing w:after="40"/>
+        <w:ind w:left="864"/>
+      </w:pPr>
+      <w:r>
+        <w:rPr>
+          <w:i w:val="0"/>
+          <w:color w:val="555555"/>
+          <w:sz w:val="18"/>
+        </w:rPr>
+        <w:t>The promise clock says: 72.0 hours promised, -27.8 left, already late</w:t>
+      </w:r>
+    </w:p>
+    <w:p>
+      <w:pPr>
+        <w:spacing w:after="40"/>
+        <w:ind w:left="864"/>
+      </w:pPr>
+      <w:r>
+        <w:rPr>
+          <w:i w:val="0"/>
+          <w:color w:val="555555"/>
+          <w:sz w:val="18"/>
+        </w:rPr>
+        <w:t>The customer themselves said: Low</w:t>
+      </w:r>
+    </w:p>
+    <w:p>
+      <w:pPr>
+        <w:spacing w:after="40"/>
+        <w:ind w:left="432"/>
+      </w:pPr>
+      <w:r>
+        <w:rPr>
+          <w:i w:val="0"/>
+          <w:color w:val="555555"/>
+          <w:sz w:val="18"/>
+        </w:rPr>
+        <w:t>NEW-00005</w:t>
+      </w:r>
+    </w:p>
+    <w:p>
+      <w:pPr>
+        <w:spacing w:after="40"/>
+        <w:ind w:left="864"/>
+      </w:pPr>
+      <w:r>
+        <w:rPr>
+          <w:i w:val="0"/>
+          <w:color w:val="555555"/>
+          <w:sz w:val="18"/>
+        </w:rPr>
+        <w:t>Customer records say: Free plan, pays £0 a month, has asked 1 time</w:t>
+      </w:r>
+    </w:p>
+    <w:p>
+      <w:pPr>
+        <w:spacing w:after="40"/>
+        <w:ind w:left="864"/>
+      </w:pPr>
+      <w:r>
+        <w:rPr>
+          <w:i w:val="0"/>
+          <w:color w:val="555555"/>
+          <w:sz w:val="18"/>
+        </w:rPr>
+        <w:t>Monitoring says: Low, 10 people affected, work blocked: no</w:t>
+      </w:r>
+    </w:p>
+    <w:p>
+      <w:pPr>
+        <w:spacing w:after="40"/>
+        <w:ind w:left="864"/>
+      </w:pPr>
+      <w:r>
+        <w:rPr>
+          <w:i w:val="0"/>
+          <w:color w:val="555555"/>
+          <w:sz w:val="18"/>
+        </w:rPr>
+        <w:t>The promise clock says: 72.0 hours promised, -42.6 left, already late</w:t>
+      </w:r>
+    </w:p>
+    <w:p>
+      <w:pPr>
+        <w:spacing w:after="40"/>
+        <w:ind w:left="864"/>
+      </w:pPr>
+      <w:r>
+        <w:rPr>
+          <w:i w:val="0"/>
+          <w:color w:val="555555"/>
+          <w:sz w:val="18"/>
+        </w:rPr>
+        <w:t>The customer themselves said: Critical</w:t>
+      </w:r>
+    </w:p>
+    <w:p>
+      <w:pPr>
+        <w:spacing w:before="240" w:after="60"/>
+      </w:pPr>
+      <w:r>
+        <w:rPr>
+          <w:b/>
+          <w:color w:val="6D28D9"/>
+          <w:sz w:val="23"/>
+        </w:rPr>
+        <w:t>Step 3   Rank them four different ways</w:t>
+      </w:r>
+    </w:p>
+    <w:p>
+      <w:pPr>
+        <w:spacing w:after="40"/>
+        <w:ind w:left="0"/>
+      </w:pPr>
+      <w:r>
+        <w:rPr>
+          <w:i w:val="0"/>
+          <w:color w:val="111111"/>
+          <w:sz w:val="20"/>
+        </w:rPr>
+        <w:t>Each way is reasonable on its own, and each one is wrong on its own. They are evidence for the agent to weigh, not instructions to follow.</w:t>
+      </w:r>
+    </w:p>
+    <w:p>
+      <w:pPr>
+        <w:spacing w:after="40"/>
+        <w:ind w:left="432"/>
+      </w:pPr>
+      <w:r>
+        <w:rPr>
+          <w:i w:val="0"/>
+          <w:color w:val="555555"/>
+          <w:sz w:val="18"/>
+        </w:rPr>
+        <w:t>By money:  1. NEW-00001  2. NEW-00002  3. NEW-00003  4. NEW-00004  5. NEW-00005</w:t>
+      </w:r>
+    </w:p>
+    <w:p>
+      <w:pPr>
+        <w:spacing w:after="40"/>
+        <w:ind w:left="432"/>
+      </w:pPr>
+      <w:r>
+        <w:rPr>
+          <w:i w:val="0"/>
+          <w:color w:val="555555"/>
+          <w:sz w:val="18"/>
+        </w:rPr>
+        <w:t>By damage:  1. NEW-00003  2. NEW-00001  3. NEW-00005  4. NEW-00004  5. NEW-00002</w:t>
+      </w:r>
+    </w:p>
+    <w:p>
+      <w:pPr>
+        <w:spacing w:after="40"/>
+        <w:ind w:left="432"/>
+      </w:pPr>
+      <w:r>
+        <w:rPr>
+          <w:i w:val="0"/>
+          <w:color w:val="555555"/>
+          <w:sz w:val="18"/>
+        </w:rPr>
+        <w:t>By deadline:  1. NEW-00005  2. NEW-00004  3. NEW-00003  4. NEW-00001  5. NEW-00002</w:t>
+      </w:r>
+    </w:p>
+    <w:p>
+      <w:pPr>
+        <w:spacing w:after="40"/>
+        <w:ind w:left="432"/>
+      </w:pPr>
+      <w:r>
+        <w:rPr>
+          <w:i w:val="0"/>
+          <w:color w:val="555555"/>
+          <w:sz w:val="18"/>
+        </w:rPr>
+        <w:t>By fairness:  1. NEW-00005  2. NEW-00004  3. NEW-00003  4. NEW-00001  5. NEW-00002</w:t>
+      </w:r>
+    </w:p>
+    <w:p>
+      <w:pPr>
+        <w:spacing w:after="40"/>
+        <w:ind w:left="0"/>
+      </w:pPr>
+      <w:r>
+        <w:rPr>
+          <w:i w:val="0"/>
+          <w:color w:val="111111"/>
+          <w:sz w:val="20"/>
+        </w:rPr>
+      </w:r>
+    </w:p>
+    <w:p>
+      <w:pPr>
+        <w:spacing w:after="40"/>
+        <w:ind w:left="432"/>
+      </w:pPr>
+      <w:r>
+        <w:rPr>
+          <w:i w:val="0"/>
+          <w:color w:val="111111"/>
+          <w:sz w:val="20"/>
+        </w:rPr>
+        <w:t>Where the four disagreed most:</w:t>
+      </w:r>
+    </w:p>
+    <w:p>
+      <w:pPr>
+        <w:spacing w:after="40"/>
+        <w:ind w:left="864"/>
+      </w:pPr>
+      <w:r>
+        <w:rPr>
+          <w:i w:val="0"/>
+          <w:color w:val="555555"/>
+          <w:sz w:val="18"/>
+        </w:rPr>
+        <w:t>NEW-00001 was placed as high as 1 and as low as 4. This is where judgement was needed.</w:t>
+      </w:r>
+    </w:p>
+    <w:p>
+      <w:pPr>
+        <w:spacing w:after="40"/>
+        <w:ind w:left="864"/>
+      </w:pPr>
+      <w:r>
+        <w:rPr>
+          <w:i w:val="0"/>
+          <w:color w:val="555555"/>
+          <w:sz w:val="18"/>
+        </w:rPr>
+        <w:t>NEW-00002 was placed as high as 2 and as low as 5. This is where judgement was needed.</w:t>
+      </w:r>
+    </w:p>
+    <w:p>
+      <w:pPr>
+        <w:spacing w:after="40"/>
+        <w:ind w:left="864"/>
+      </w:pPr>
+      <w:r>
+        <w:rPr>
+          <w:i w:val="0"/>
+          <w:color w:val="555555"/>
+          <w:sz w:val="18"/>
+        </w:rPr>
+        <w:t>NEW-00005 was placed as high as 1 and as low as 5. This is where judgement was needed.</w:t>
+      </w:r>
+    </w:p>
+    <w:p>
+      <w:pPr>
+        <w:spacing w:before="240" w:after="60"/>
+      </w:pPr>
+      <w:r>
+        <w:rPr>
+          <w:b/>
+          <w:color w:val="6D28D9"/>
+          <w:sz w:val="23"/>
+        </w:rPr>
+        <w:t>Step 4   Read what the customer actually wrote</w:t>
+      </w:r>
+    </w:p>
+    <w:p>
+      <w:pPr>
+        <w:spacing w:after="40"/>
+        <w:ind w:left="0"/>
+      </w:pPr>
+      <w:r>
+        <w:rPr>
+          <w:i w:val="0"/>
+          <w:color w:val="111111"/>
+          <w:sz w:val="20"/>
+        </w:rPr>
+        <w:t>The four ways above only look at numbers, so they cannot tell a password reset apart from a break-in. Both look like one person with nothing failing. The words are the difference.</w:t>
+      </w:r>
+    </w:p>
+    <w:p>
+      <w:pPr>
+        <w:spacing w:after="40"/>
+        <w:ind w:left="432"/>
+      </w:pPr>
+      <w:r>
+        <w:rPr>
+          <w:i w:val="0"/>
+          <w:color w:val="555555"/>
+          <w:sz w:val="18"/>
+        </w:rPr>
+        <w:t>NEW-00001: “our whole team is locked out. nobody can get in since about 6am. we have a client demo at 10 and I don't know what to tell them”</w:t>
+      </w:r>
+    </w:p>
+    <w:p>
+      <w:pPr>
+        <w:spacing w:after="40"/>
+        <w:ind w:left="432"/>
+      </w:pPr>
+      <w:r>
+        <w:rPr>
+          <w:i w:val="0"/>
+          <w:color w:val="555555"/>
+          <w:sz w:val="18"/>
+        </w:rPr>
+        <w:t>NEW-00002: “I need to flag something. one of our customers has asked us to delete everything we hold on them. I believe there's a legal time limit on this and we're already a few days in”</w:t>
+      </w:r>
+    </w:p>
+    <w:p>
+      <w:pPr>
+        <w:spacing w:after="40"/>
+        <w:ind w:left="432"/>
+      </w:pPr>
+      <w:r>
+        <w:rPr>
+          <w:i w:val="0"/>
+          <w:color w:val="555555"/>
+          <w:sz w:val="18"/>
+        </w:rPr>
+        <w:t>NEW-00003: “payments are failing at checkout. we've had maybe forty customers email us this morning saying their card was declined. our own test card fails too”</w:t>
+      </w:r>
+    </w:p>
+    <w:p>
+      <w:pPr>
+        <w:spacing w:after="40"/>
+        <w:ind w:left="432"/>
+      </w:pPr>
+      <w:r>
+        <w:rPr>
+          <w:i w:val="0"/>
+          <w:color w:val="555555"/>
+          <w:sz w:val="18"/>
+        </w:rPr>
+        <w:t>NEW-00004: “there is a session logged in from a device we don't recognise and I can't work out how to end it. probably nothing but thought I should mention it”</w:t>
+      </w:r>
+    </w:p>
+    <w:p>
+      <w:pPr>
+        <w:spacing w:after="40"/>
+        <w:ind w:left="432"/>
+      </w:pPr>
+      <w:r>
+        <w:rPr>
+          <w:i w:val="0"/>
+          <w:color w:val="555555"/>
+          <w:sz w:val="18"/>
+        </w:rPr>
+        <w:t>NEW-00005: “ABSOLUTELY UNACCEPTABLE. our dashboard chart is showing last month's figures. we pay you thousands every month and I expect better than this. I want someone to call me today”</w:t>
+      </w:r>
+    </w:p>
+    <w:p>
+      <w:pPr>
+        <w:spacing w:before="240" w:after="60"/>
+      </w:pPr>
+      <w:r>
+        <w:rPr>
+          <w:b/>
+          <w:color w:val="6D28D9"/>
+          <w:sz w:val="23"/>
+        </w:rPr>
+        <w:t>Step 5   The AI decides, and says why</w:t>
+      </w:r>
+    </w:p>
+    <w:p>
+      <w:pPr>
+        <w:spacing w:after="40"/>
+        <w:ind w:left="432"/>
+      </w:pPr>
+      <w:r>
+        <w:rPr>
+          <w:i w:val="0"/>
+          <w:color w:val="111111"/>
+          <w:sz w:val="20"/>
+        </w:rPr>
+        <w:t>1. NEW-00003   Payments failing at checkout</w:t>
+      </w:r>
+    </w:p>
+    <w:p>
+      <w:pPr>
+        <w:spacing w:after="40"/>
+        <w:ind w:left="864"/>
+      </w:pPr>
+      <w:r>
+        <w:rPr>
+          <w:i/>
+          <w:color w:val="555555"/>
+          <w:sz w:val="20"/>
+        </w:rPr>
+        <w:t>Critical payment failures affecting thousands and blocking checkout force it to the top.</w:t>
+      </w:r>
+    </w:p>
+    <w:p>
+      <w:pPr>
+        <w:spacing w:after="40"/>
+        <w:ind w:left="432"/>
+      </w:pPr>
+      <w:r>
+        <w:rPr>
+          <w:i w:val="0"/>
+          <w:color w:val="111111"/>
+          <w:sz w:val="20"/>
+        </w:rPr>
+        <w:t>2. NEW-00001   Team locked out</w:t>
+      </w:r>
+    </w:p>
+    <w:p>
+      <w:pPr>
+        <w:spacing w:after="40"/>
+        <w:ind w:left="864"/>
+      </w:pPr>
+      <w:r>
+        <w:rPr>
+          <w:i/>
+          <w:color w:val="555555"/>
+          <w:sz w:val="20"/>
+        </w:rPr>
+        <w:t>Team lockout blocks a client demo and affects hundreds, making it the second most urgent.</w:t>
+      </w:r>
+    </w:p>
+    <w:p>
+      <w:pPr>
+        <w:spacing w:after="40"/>
+        <w:ind w:left="432"/>
+      </w:pPr>
+      <w:r>
+        <w:rPr>
+          <w:i w:val="0"/>
+          <w:color w:val="111111"/>
+          <w:sz w:val="20"/>
+        </w:rPr>
+        <w:t>3. NEW-00004   Unrecognized device session</w:t>
+      </w:r>
+    </w:p>
+    <w:p>
+      <w:pPr>
+        <w:spacing w:after="40"/>
+        <w:ind w:left="864"/>
+      </w:pPr>
+      <w:r>
+        <w:rPr>
+          <w:i/>
+          <w:color w:val="555555"/>
+          <w:sz w:val="20"/>
+        </w:rPr>
+        <w:t>Possible security breach triggers policy requiring at least top‑3 placement.</w:t>
+      </w:r>
+    </w:p>
+    <w:p>
+      <w:pPr>
+        <w:spacing w:after="40"/>
+        <w:ind w:left="432"/>
+      </w:pPr>
+      <w:r>
+        <w:rPr>
+          <w:i w:val="0"/>
+          <w:color w:val="111111"/>
+          <w:sz w:val="20"/>
+        </w:rPr>
+        <w:t>4. NEW-00002   Customer data deletion request</w:t>
+      </w:r>
+    </w:p>
+    <w:p>
+      <w:pPr>
+        <w:spacing w:after="40"/>
+        <w:ind w:left="864"/>
+      </w:pPr>
+      <w:r>
+        <w:rPr>
+          <w:i/>
+          <w:color w:val="555555"/>
+          <w:sz w:val="20"/>
+        </w:rPr>
+        <w:t>Legal GDPR deletion request must not fall below fourth per policy.</w:t>
+      </w:r>
+    </w:p>
+    <w:p>
+      <w:pPr>
+        <w:spacing w:after="40"/>
+        <w:ind w:left="432"/>
+      </w:pPr>
+      <w:r>
+        <w:rPr>
+          <w:i w:val="0"/>
+          <w:color w:val="111111"/>
+          <w:sz w:val="20"/>
+        </w:rPr>
+        <w:t>5. NEW-00005   Dashboard showing outdated data</w:t>
+      </w:r>
+    </w:p>
+    <w:p>
+      <w:pPr>
+        <w:spacing w:after="40"/>
+        <w:ind w:left="864"/>
+      </w:pPr>
+      <w:r>
+        <w:rPr>
+          <w:i/>
+          <w:color w:val="555555"/>
+          <w:sz w:val="20"/>
+        </w:rPr>
+        <w:t>Low‑impact dashboard bug with overdue SLA but the least business damage.</w:t>
+      </w:r>
+    </w:p>
+    <w:p>
+      <w:pPr>
+        <w:spacing w:after="40"/>
+        <w:ind w:left="0"/>
+      </w:pPr>
+      <w:r>
+        <w:rPr>
+          <w:i w:val="0"/>
+          <w:color w:val="111111"/>
+          <w:sz w:val="20"/>
+        </w:rPr>
+      </w:r>
+    </w:p>
+    <w:p>
+      <w:pPr>
+        <w:spacing w:after="40"/>
+        <w:ind w:left="432"/>
+      </w:pPr>
+      <w:r>
+        <w:rPr>
+          <w:i w:val="0"/>
+          <w:color w:val="111111"/>
+          <w:sz w:val="20"/>
+        </w:rPr>
+        <w:t>The trade-off it made:</w:t>
+      </w:r>
+    </w:p>
+    <w:p>
+      <w:pPr>
+        <w:spacing w:after="40"/>
+        <w:ind w:left="864"/>
+      </w:pPr>
+      <w:r>
+        <w:rPr>
+          <w:i/>
+          <w:color w:val="555555"/>
+          <w:sz w:val="20"/>
+        </w:rPr>
+        <w:t>We favoured immediate business impact and legal risk over pure revenue and fairness scores. This pushes a high‑paying Enterprise customer (NEW-00001) behind the payment failure, and a free‑plan security alert ahead of the legal request. The cost is a slight delay for the Enterprise demo and a perception of unfairness for the paying customer.</w:t>
+      </w:r>
+    </w:p>
+    <w:p>
+      <w:pPr>
+        <w:spacing w:after="40"/>
+        <w:ind w:left="0"/>
+      </w:pPr>
+      <w:r>
+        <w:rPr>
+          <w:i w:val="0"/>
+          <w:color w:val="111111"/>
+          <w:sz w:val="20"/>
+        </w:rPr>
+      </w:r>
+    </w:p>
+    <w:p>
+      <w:pPr>
+        <w:spacing w:after="40"/>
+        <w:ind w:left="432"/>
+      </w:pPr>
+      <w:r>
+        <w:rPr>
+          <w:i w:val="0"/>
+          <w:color w:val="111111"/>
+          <w:sz w:val="20"/>
+        </w:rPr>
+        <w:t>The closest call:</w:t>
+      </w:r>
+    </w:p>
+    <w:p>
+      <w:pPr>
+        <w:spacing w:after="40"/>
+        <w:ind w:left="864"/>
+      </w:pPr>
+      <w:r>
+        <w:rPr>
+          <w:i/>
+          <w:color w:val="555555"/>
+          <w:sz w:val="20"/>
+        </w:rPr>
+        <w:t>Placing the security incident (NEW-00004) ahead of the legal GDPR request (NEW-00002) was hardest, because both have policy lifts and overdue status, and one could argue legal compliance should outrank a suspected breach.</w:t>
+      </w:r>
+    </w:p>
+    <w:p>
+      <w:pPr>
+        <w:spacing w:after="40"/>
+        <w:ind w:left="0"/>
+      </w:pPr>
+      <w:r>
+        <w:rPr>
+          <w:i w:val="0"/>
+          <w:color w:val="111111"/>
+          <w:sz w:val="20"/>
+        </w:rPr>
+      </w:r>
+    </w:p>
+    <w:p>
+      <w:pPr>
+        <w:spacing w:after="40"/>
+        <w:ind w:left="432"/>
+      </w:pPr>
+      <w:r>
+        <w:rPr>
+          <w:i w:val="0"/>
+          <w:color w:val="111111"/>
+          <w:sz w:val="20"/>
+        </w:rPr>
+        <w:t>How it ranked the four ways of deciding:</w:t>
+      </w:r>
+    </w:p>
+    <w:p>
+      <w:pPr>
+        <w:spacing w:after="40"/>
+        <w:ind w:left="864"/>
+      </w:pPr>
+      <w:r>
+        <w:rPr>
+          <w:i w:val="0"/>
+          <w:color w:val="111111"/>
+          <w:sz w:val="20"/>
+        </w:rPr>
+        <w:t>1. damage</w:t>
+      </w:r>
+    </w:p>
+    <w:p>
+      <w:pPr>
+        <w:spacing w:after="40"/>
+        <w:ind w:left="1296"/>
+      </w:pPr>
+      <w:r>
+        <w:rPr>
+          <w:i/>
+          <w:color w:val="555555"/>
+          <w:sz w:val="20"/>
+        </w:rPr>
+        <w:t>why here: Business impact (users affected, work blocked) directly determines revenue loss and customer trust, which we prioritized.</w:t>
+      </w:r>
+    </w:p>
+    <w:p>
+      <w:pPr>
+        <w:spacing w:after="40"/>
+        <w:ind w:left="1296"/>
+      </w:pPr>
+      <w:r>
+        <w:rPr>
+          <w:i/>
+          <w:color w:val="555555"/>
+          <w:sz w:val="20"/>
+        </w:rPr>
+        <w:t>gets wrong: It can undervalue high‑paying customers whose issues have lower immediate impact.</w:t>
+      </w:r>
+    </w:p>
+    <w:p>
+      <w:pPr>
+        <w:spacing w:after="40"/>
+        <w:ind w:left="864"/>
+      </w:pPr>
+      <w:r>
+        <w:rPr>
+          <w:i w:val="0"/>
+          <w:color w:val="111111"/>
+          <w:sz w:val="20"/>
+        </w:rPr>
+        <w:t>2. deadline</w:t>
+      </w:r>
+    </w:p>
+    <w:p>
+      <w:pPr>
+        <w:spacing w:after="40"/>
+        <w:ind w:left="1296"/>
+      </w:pPr>
+      <w:r>
+        <w:rPr>
+          <w:i/>
+          <w:color w:val="555555"/>
+          <w:sz w:val="20"/>
+        </w:rPr>
+        <w:t>why here: Legal and overdue tickets carry penalties and SLA breaches, so timing is the next priority.</w:t>
+      </w:r>
+    </w:p>
+    <w:p>
+      <w:pPr>
+        <w:spacing w:after="40"/>
+        <w:ind w:left="1296"/>
+      </w:pPr>
+      <w:r>
+        <w:rPr>
+          <w:i/>
+          <w:color w:val="555555"/>
+          <w:sz w:val="20"/>
+        </w:rPr>
+        <w:t>gets wrong: Deadlines may push less damaging but time‑sensitive tickets ahead of higher‑impact problems.</w:t>
+      </w:r>
+    </w:p>
+    <w:p>
+      <w:pPr>
+        <w:spacing w:after="40"/>
+        <w:ind w:left="864"/>
+      </w:pPr>
+      <w:r>
+        <w:rPr>
+          <w:i w:val="0"/>
+          <w:color w:val="111111"/>
+          <w:sz w:val="20"/>
+        </w:rPr>
+        <w:t>3. money</w:t>
+      </w:r>
+    </w:p>
+    <w:p>
+      <w:pPr>
+        <w:spacing w:after="40"/>
+        <w:ind w:left="1296"/>
+      </w:pPr>
+      <w:r>
+        <w:rPr>
+          <w:i/>
+          <w:color w:val="555555"/>
+          <w:sz w:val="20"/>
+        </w:rPr>
+        <w:t>why here: Revenue is important but secondary to preventing large‑scale outages or legal breaches.</w:t>
+      </w:r>
+    </w:p>
+    <w:p>
+      <w:pPr>
+        <w:spacing w:after="40"/>
+        <w:ind w:left="1296"/>
+      </w:pPr>
+      <w:r>
+        <w:rPr>
+          <w:i/>
+          <w:color w:val="555555"/>
+          <w:sz w:val="20"/>
+        </w:rPr>
+        <w:t>gets wrong: It can unfairly deprioritise free‑plan users with serious issues.</w:t>
+      </w:r>
+    </w:p>
+    <w:p>
+      <w:pPr>
+        <w:spacing w:after="40"/>
+        <w:ind w:left="864"/>
+      </w:pPr>
+      <w:r>
+        <w:rPr>
+          <w:i w:val="0"/>
+          <w:color w:val="111111"/>
+          <w:sz w:val="20"/>
+        </w:rPr>
+        <w:t>4. fairness</w:t>
+      </w:r>
+    </w:p>
+    <w:p>
+      <w:pPr>
+        <w:spacing w:after="40"/>
+        <w:ind w:left="1296"/>
+      </w:pPr>
+      <w:r>
+        <w:rPr>
+          <w:i/>
+          <w:color w:val="555555"/>
+          <w:sz w:val="20"/>
+        </w:rPr>
+        <w:t>why here: Ensuring equal treatment is valuable but was outweighed by impact, legal risk, and revenue considerations.</w:t>
+      </w:r>
+    </w:p>
+    <w:p>
+      <w:pPr>
+        <w:spacing w:after="40"/>
+        <w:ind w:left="1296"/>
+      </w:pPr>
+      <w:r>
+        <w:rPr>
+          <w:i/>
+          <w:color w:val="555555"/>
+          <w:sz w:val="20"/>
+        </w:rPr>
+        <w:t>gets wrong: Relying on fairness alone could ignore critical business or compliance risks.</w:t>
+      </w:r>
+    </w:p>
+    <w:p>
+      <w:pPr>
+        <w:spacing w:after="40"/>
+        <w:ind w:left="0"/>
+      </w:pPr>
+      <w:r>
+        <w:rPr>
+          <w:i w:val="0"/>
+          <w:color w:val="111111"/>
+          <w:sz w:val="20"/>
+        </w:rPr>
+      </w:r>
+    </w:p>
+    <w:p>
+      <w:pPr>
+        <w:spacing w:after="40"/>
+        <w:ind w:left="432"/>
+      </w:pPr>
+      <w:r>
+        <w:rPr>
+          <w:i w:val="0"/>
+          <w:color w:val="111111"/>
+          <w:sz w:val="20"/>
+        </w:rPr>
+        <w:t>Closest call between the four:</w:t>
+      </w:r>
+    </w:p>
+    <w:p>
+      <w:pPr>
+        <w:spacing w:after="40"/>
+        <w:ind w:left="864"/>
+      </w:pPr>
+      <w:r>
+        <w:rPr>
+          <w:i/>
+          <w:color w:val="555555"/>
+          <w:sz w:val="20"/>
+        </w:rPr>
+        <w:t>Damage outranked deadline because the payment failure halted revenue for thousands, whereas the legal request, while important, affected only one user and had more time before the SLA expires.</w:t>
+      </w:r>
+    </w:p>
+    <w:p>
+      <w:pPr>
+        <w:spacing w:before="240" w:after="60"/>
+      </w:pPr>
+      <w:r>
+        <w:rPr>
+          <w:b/>
+          <w:color w:val="6D28D9"/>
+          <w:sz w:val="23"/>
+        </w:rPr>
+        <w:t>Step 6   Check the answer before anything happens</w:t>
+      </w:r>
+    </w:p>
+    <w:p>
+      <w:pPr>
+        <w:spacing w:after="40"/>
+        <w:ind w:left="432"/>
+      </w:pPr>
+      <w:r>
+        <w:rPr>
+          <w:i w:val="0"/>
+          <w:color w:val="111111"/>
+          <w:sz w:val="20"/>
+        </w:rPr>
+        <w:t>Did every complaint come back, and were the written rules followed?</w:t>
+      </w:r>
+    </w:p>
+    <w:p>
+      <w:pPr>
+        <w:spacing w:after="40"/>
+        <w:ind w:left="864"/>
+      </w:pPr>
+      <w:r>
+        <w:rPr>
+          <w:i/>
+          <w:color w:val="555555"/>
+          <w:sz w:val="20"/>
+        </w:rPr>
+        <w:t>Yes. Nothing was dropped and no rule was broken.</w:t>
+      </w:r>
+    </w:p>
+    <w:p>
+      <w:pPr>
+        <w:spacing w:after="40"/>
+        <w:ind w:left="0"/>
+      </w:pPr>
+      <w:r>
+        <w:rPr>
+          <w:i w:val="0"/>
+          <w:color w:val="111111"/>
+          <w:sz w:val="20"/>
+        </w:rPr>
+      </w:r>
+    </w:p>
+    <w:p>
+      <w:pPr>
+        <w:spacing w:after="40"/>
+        <w:ind w:left="432"/>
+      </w:pPr>
+      <w:r>
+        <w:rPr>
+          <w:i w:val="0"/>
+          <w:color w:val="111111"/>
+          <w:sz w:val="20"/>
+        </w:rPr>
+        <w:t>Were the reasons it gave actually true?</w:t>
+      </w:r>
+    </w:p>
+    <w:p>
+      <w:pPr>
+        <w:spacing w:after="40"/>
+        <w:ind w:left="864"/>
+      </w:pPr>
+      <w:r>
+        <w:rPr>
+          <w:i/>
+          <w:color w:val="555555"/>
+          <w:sz w:val="20"/>
+        </w:rPr>
+        <w:t>Yes. Every reason matched the numbers we hold.</w:t>
+      </w:r>
+    </w:p>
+    <w:p>
+      <w:pPr>
+        <w:spacing w:after="40"/>
+        <w:ind w:left="0"/>
+      </w:pPr>
+      <w:r>
+        <w:rPr>
+          <w:i w:val="0"/>
+          <w:color w:val="111111"/>
+          <w:sz w:val="20"/>
+        </w:rPr>
+      </w:r>
+    </w:p>
+    <w:p>
+      <w:pPr>
+        <w:spacing w:after="40"/>
+        <w:ind w:left="432"/>
+      </w:pPr>
+      <w:r>
+        <w:rPr>
+          <w:i w:val="0"/>
+          <w:color w:val="111111"/>
+          <w:sz w:val="20"/>
+        </w:rPr>
+        <w:t>How solid was the answer? One number was changed at a time and everything ranked again, to see which places were close calls.</w:t>
+      </w:r>
+    </w:p>
+    <w:p>
+      <w:pPr>
+        <w:spacing w:after="40"/>
+        <w:ind w:left="864"/>
+      </w:pPr>
+      <w:r>
+        <w:rPr>
+          <w:i w:val="0"/>
+          <w:color w:val="555555"/>
+          <w:sz w:val="18"/>
+        </w:rPr>
+        <w:t>NEW-00001  solid  (0 of 7 small changes move it)</w:t>
+      </w:r>
+    </w:p>
+    <w:p>
+      <w:pPr>
+        <w:spacing w:after="40"/>
+        <w:ind w:left="864"/>
+      </w:pPr>
+      <w:r>
+        <w:rPr>
+          <w:i w:val="0"/>
+          <w:color w:val="555555"/>
+          <w:sz w:val="18"/>
+        </w:rPr>
+        <w:t>NEW-00002  solid  (0 of 6 small changes move it)</w:t>
+      </w:r>
+    </w:p>
+    <w:p>
+      <w:pPr>
+        <w:spacing w:after="40"/>
+        <w:ind w:left="864"/>
+      </w:pPr>
+      <w:r>
+        <w:rPr>
+          <w:i w:val="0"/>
+          <w:color w:val="555555"/>
+          <w:sz w:val="18"/>
+        </w:rPr>
+        <w:t>NEW-00003  fairly solid  (1 of 6 small changes move it)</w:t>
+      </w:r>
+    </w:p>
+    <w:p>
+      <w:pPr>
+        <w:spacing w:after="40"/>
+        <w:ind w:left="1296"/>
+      </w:pPr>
+      <w:r>
+        <w:rPr>
+          <w:i/>
+          <w:color w:val="555555"/>
+          <w:sz w:val="18"/>
+        </w:rPr>
+        <w:t>if work was not actually blocked, it moves from 1 to 3</w:t>
+      </w:r>
+    </w:p>
+    <w:p>
+      <w:pPr>
+        <w:spacing w:after="40"/>
+        <w:ind w:left="864"/>
+      </w:pPr>
+      <w:r>
+        <w:rPr>
+          <w:i w:val="0"/>
+          <w:color w:val="555555"/>
+          <w:sz w:val="18"/>
+        </w:rPr>
+        <w:t>NEW-00004  shaky  (3 of 6 small changes move it)</w:t>
+      </w:r>
+    </w:p>
+    <w:p>
+      <w:pPr>
+        <w:spacing w:after="40"/>
+        <w:ind w:left="1296"/>
+      </w:pPr>
+      <w:r>
+        <w:rPr>
+          <w:i/>
+          <w:color w:val="555555"/>
+          <w:sz w:val="18"/>
+        </w:rPr>
+        <w:t>if 11 people were affected, not 3, it moves from 4 to 3</w:t>
+      </w:r>
+    </w:p>
+    <w:p>
+      <w:pPr>
+        <w:spacing w:after="40"/>
+        <w:ind w:left="1296"/>
+      </w:pPr>
+      <w:r>
+        <w:rPr>
+          <w:i/>
+          <w:color w:val="555555"/>
+          <w:sz w:val="18"/>
+        </w:rPr>
+        <w:t>if work was blocked after all, it moves from 4 to 3</w:t>
+      </w:r>
+    </w:p>
+    <w:p>
+      <w:pPr>
+        <w:spacing w:after="40"/>
+        <w:ind w:left="864"/>
+      </w:pPr>
+      <w:r>
+        <w:rPr>
+          <w:i w:val="0"/>
+          <w:color w:val="555555"/>
+          <w:sz w:val="18"/>
+        </w:rPr>
+        <w:t>NEW-00005  fairly solid  (2 of 6 small changes move it)</w:t>
+      </w:r>
+    </w:p>
+    <w:p>
+      <w:pPr>
+        <w:spacing w:after="40"/>
+        <w:ind w:left="1296"/>
+      </w:pPr>
+      <w:r>
+        <w:rPr>
+          <w:i/>
+          <w:color w:val="555555"/>
+          <w:sz w:val="18"/>
+        </w:rPr>
+        <w:t>if we had a quarter more time left than we thought, it moves from 2 to 4</w:t>
+      </w:r>
+    </w:p>
+    <w:p>
+      <w:pPr>
+        <w:spacing w:after="40"/>
+        <w:ind w:left="1296"/>
+      </w:pPr>
+      <w:r>
+        <w:rPr>
+          <w:i/>
+          <w:color w:val="555555"/>
+          <w:sz w:val="18"/>
+        </w:rPr>
+        <w:t>if this customer pays us £20,000 a month more than recorded, it moves from 2 to 1</w:t>
+      </w:r>
+    </w:p>
+    <w:p>
+      <w:pPr>
+        <w:spacing w:before="240" w:after="60"/>
+      </w:pPr>
+      <w:r>
+        <w:rPr>
+          <w:b/>
+          <w:color w:val="6D28D9"/>
+          <w:sz w:val="23"/>
+        </w:rPr>
+        <w:t>Step 7   Hand them to a person</w:t>
+      </w:r>
+    </w:p>
+    <w:p>
+      <w:pPr>
+        <w:spacing w:after="40"/>
+        <w:ind w:left="432"/>
+      </w:pPr>
+      <w:r>
+        <w:rPr>
+          <w:i w:val="0"/>
+          <w:color w:val="555555"/>
+          <w:sz w:val="18"/>
+        </w:rPr>
+        <w:t>NEW-00003 goes to a person now</w:t>
+      </w:r>
+    </w:p>
+    <w:p>
+      <w:pPr>
+        <w:spacing w:after="40"/>
+        <w:ind w:left="432"/>
+      </w:pPr>
+      <w:r>
+        <w:rPr>
+          <w:i w:val="0"/>
+          <w:color w:val="555555"/>
+          <w:sz w:val="18"/>
+        </w:rPr>
+        <w:t>NEW-00001 goes to a person next</w:t>
       </w:r>
     </w:p>
     <w:p>

</xml_diff>